<commit_message>
Livre : intègre les récits de William, Rachelle et du pasteur Koffi François
Nouveau chapitre « Des circonstances si ordinaires », dédicace et
avant-propos réécrits, chapitres renumérotés.

Co-Authored-By: Claude Opus 5.5 <noreply@anthropic.com>
Claude-Session: https://claude.ai/code/session_019iFqSFQpVw8JECnBZv2Kux
</commit_message>
<xml_diff>
--- a/livre/avant-que-l-horloge-ne-s-arrete.docx
+++ b/livre/avant-que-l-horloge-ne-s-arrete.docx
@@ -138,73 +138,73 @@
           <w:iCs/>
           <w:i/>
         </w:rPr>
-        <w:t xml:space="preserve">De William, mon camarade de CE2, parti trop tôt,</w:t>
-      </w:r>
-      <w:r>
-        <w:rPr>
-          <w:iCs/>
-          <w:i/>
-        </w:rPr>
-        <w:t xml:space="preserve"> </w:t>
-      </w:r>
-      <w:r>
-        <w:rPr>
-          <w:iCs/>
-          <w:i/>
-        </w:rPr>
-        <w:t xml:space="preserve">qui m’a appris, enfant, qu’un banc d’école peut rester vide.</w:t>
-      </w:r>
-    </w:p>
-    <w:p>
-      <w:pPr>
-        <w:pStyle w:val="BodyText"/>
-      </w:pPr>
-      <w:r>
-        <w:rPr>
-          <w:iCs/>
-          <w:i/>
-        </w:rPr>
-        <w:t xml:space="preserve">De ma tante Rachelle, partie quand j’étais en 6e-5e,</w:t>
-      </w:r>
-      <w:r>
-        <w:rPr>
-          <w:iCs/>
-          <w:i/>
-        </w:rPr>
-        <w:t xml:space="preserve"> </w:t>
-      </w:r>
-      <w:r>
-        <w:rPr>
-          <w:iCs/>
-          <w:i/>
-        </w:rPr>
-        <w:t xml:space="preserve">qui m’a appris que la mort entre aussi dans les maisons qu’on croyait solides.</w:t>
-      </w:r>
-    </w:p>
-    <w:p>
-      <w:pPr>
-        <w:pStyle w:val="BodyText"/>
-      </w:pPr>
-      <w:r>
-        <w:rPr>
-          <w:iCs/>
-          <w:i/>
-        </w:rPr>
-        <w:t xml:space="preserve">De mon beau-père, Koffi François, parti cette année,</w:t>
-      </w:r>
-      <w:r>
-        <w:rPr>
-          <w:iCs/>
-          <w:i/>
-        </w:rPr>
-        <w:t xml:space="preserve"> </w:t>
-      </w:r>
-      <w:r>
-        <w:rPr>
-          <w:iCs/>
-          <w:i/>
-        </w:rPr>
-        <w:t xml:space="preserve">qui m’a rappelé, une fois encore, que nul n’est trop aimé pour partir.</w:t>
+        <w:t xml:space="preserve">De William, mon camarade de CE2,</w:t>
+      </w:r>
+      <w:r>
+        <w:rPr>
+          <w:iCs/>
+          <w:i/>
+        </w:rPr>
+        <w:t xml:space="preserve"> </w:t>
+      </w:r>
+      <w:r>
+        <w:rPr>
+          <w:iCs/>
+          <w:i/>
+        </w:rPr>
+        <w:t xml:space="preserve">parti un samedi soir pour une simple course au marché.</w:t>
+      </w:r>
+    </w:p>
+    <w:p>
+      <w:pPr>
+        <w:pStyle w:val="BodyText"/>
+      </w:pPr>
+      <w:r>
+        <w:rPr>
+          <w:iCs/>
+          <w:i/>
+        </w:rPr>
+        <w:t xml:space="preserve">De ma tante Rachelle,</w:t>
+      </w:r>
+      <w:r>
+        <w:rPr>
+          <w:iCs/>
+          <w:i/>
+        </w:rPr>
+        <w:t xml:space="preserve"> </w:t>
+      </w:r>
+      <w:r>
+        <w:rPr>
+          <w:iCs/>
+          <w:i/>
+        </w:rPr>
+        <w:t xml:space="preserve">partie un dimanche matin pour donner la vie, et qui n’est jamais revenue.</w:t>
+      </w:r>
+    </w:p>
+    <w:p>
+      <w:pPr>
+        <w:pStyle w:val="BodyText"/>
+      </w:pPr>
+      <w:r>
+        <w:rPr>
+          <w:iCs/>
+          <w:i/>
+        </w:rPr>
+        <w:t xml:space="preserve">Du pasteur Koffi François, mon beau-père,</w:t>
+      </w:r>
+      <w:r>
+        <w:rPr>
+          <w:iCs/>
+          <w:i/>
+        </w:rPr>
+        <w:t xml:space="preserve"> </w:t>
+      </w:r>
+      <w:r>
+        <w:rPr>
+          <w:iCs/>
+          <w:i/>
+        </w:rPr>
+        <w:t xml:space="preserve">parti le 10 août 2026 sur la route de la pastorale.</w:t>
       </w:r>
     </w:p>
     <w:p>
@@ -300,28 +300,31 @@
         <w:pStyle w:val="BodyText"/>
       </w:pPr>
       <w:r>
-        <w:t xml:space="preserve">J’étais encore un petit garçon, en classe de CE2, quand mon ami William est mort. Je ne comprenais pas. La veille, nous étions ensemble ; le lendemain, sa place était vide. On nous a dit qu’il était parti, et je me demandais</w:t>
-      </w:r>
-      <w:r>
-        <w:t xml:space="preserve"> </w:t>
-      </w:r>
-      <w:r>
-        <w:rPr>
-          <w:iCs/>
-          <w:i/>
-        </w:rPr>
-        <w:t xml:space="preserve">où</w:t>
-      </w:r>
-      <w:r>
-        <w:t xml:space="preserve">. Plus tard, en 6e-5e, ce fut ma tante Rachelle. Là, j’ai commencé à comprendre que la mort n’avait pas d’âge préféré. Et cette année, mon beau-père, Koffi François, nous a quittés. J’étais adulte, cette fois. Je croyais être prêt. On n’est jamais prêt.</w:t>
-      </w:r>
-    </w:p>
-    <w:p>
-      <w:pPr>
-        <w:pStyle w:val="BodyText"/>
-      </w:pPr>
-      <w:r>
-        <w:t xml:space="preserve">Trois deuils, à trois âges de ma vie. Et à chaque fois, la même question est revenue frapper à la porte de mon cœur :</w:t>
+        <w:t xml:space="preserve">Comme tout homme, j’ai connu plusieurs deuils. Mais il y en a trois qui m’ont marqué pour la vie. Le premier, j’étais un petit garçon en classe de CE2 : mon ami William. Le deuxième, j’étais en 6e-5e : ma tante Rachelle. Le troisième, c’est cette année : mon beau-père, le pasteur Koffi François. Trois départs, à trois âges de ma vie. Et chaque fois, des circonstances si ordinaires… mais hélas.</w:t>
+      </w:r>
+    </w:p>
+    <w:p>
+      <w:pPr>
+        <w:pStyle w:val="BodyText"/>
+      </w:pPr>
+      <w:r>
+        <w:t xml:space="preserve">Je te raconterai leur histoire dans les pages qui suivent. Depuis, je vis avec la prière du psalmiste sur les lèvres :</w:t>
+      </w:r>
+      <w:r>
+        <w:t xml:space="preserve"> </w:t>
+      </w:r>
+      <w:r>
+        <w:rPr>
+          <w:iCs/>
+          <w:i/>
+        </w:rPr>
+        <w:t xml:space="preserve">« Enseigne-nous à bien compter nos jours. »</w:t>
+      </w:r>
+      <w:r>
+        <w:t xml:space="preserve"> </w:t>
+      </w:r>
+      <w:r>
+        <w:t xml:space="preserve">Et chaque fois, la même question est revenue frapper à la porte de mon cœur :</w:t>
       </w:r>
       <w:r>
         <w:t xml:space="preserve"> </w:t>
@@ -463,7 +466,7 @@
         <w:pStyle w:val="BodyText"/>
       </w:pPr>
       <w:r>
-        <w:t xml:space="preserve">William avait à peine huit ou neuf ans sur son compteur. Personne ne le savait, sauf Dieu. Ma tante Rachelle n’avait pas fini de vivre tout ce qu’elle espérait. Mon beau-père avait encore des projets. Leur horloge, pourtant, s’est arrêtée.</w:t>
+        <w:t xml:space="preserve">William avait à peine huit ou neuf ans sur son compteur. Personne ne le savait, sauf Dieu. Ma tante Rachelle s’apprêtait à devenir mère. Mon beau-père avait encore un ministère à accomplir et une pastorale où on l’attendait. Leur horloge, pourtant, s’est arrêtée.</w:t>
       </w:r>
     </w:p>
     <w:p>
@@ -504,13 +507,13 @@
       </w:r>
     </w:p>
     <w:bookmarkEnd w:id="22"/>
-    <w:bookmarkStart w:id="23" w:name="lamour-qui-ne-peut-pas-retenir"/>
+    <w:bookmarkStart w:id="27" w:name="des-circonstances-si-ordinaires"/>
     <w:p>
       <w:pPr>
         <w:pStyle w:val="Heading2"/>
       </w:pPr>
       <w:r>
-        <w:t xml:space="preserve">2. L’amour qui ne peut pas retenir</w:t>
+        <w:t xml:space="preserve">2. Des circonstances si ordinaires</w:t>
       </w:r>
     </w:p>
     <w:p>
@@ -518,23 +521,72 @@
         <w:pStyle w:val="FirstParagraph"/>
       </w:pPr>
       <w:r>
-        <w:t xml:space="preserve">Mon enfant, je t’aime. Tu le sais, n’est-ce pas ?</w:t>
-      </w:r>
-    </w:p>
-    <w:p>
-      <w:pPr>
-        <w:pStyle w:val="BodyText"/>
-      </w:pPr>
-      <w:r>
-        <w:t xml:space="preserve">Je me suis levé tôt pour toi. J’ai travaillé, je me suis inquiété, j’ai prié pour toi, j’ai fait des projets pour ton avenir. Comme moi, des millions de pères et de mères donnent tout pour leurs enfants. Des maris et des épouses se promettent de ne jamais se quitter. Des frères et des sœurs jurent de toujours se soutenir.</w:t>
-      </w:r>
-    </w:p>
-    <w:p>
-      <w:pPr>
-        <w:pStyle w:val="BodyText"/>
-      </w:pPr>
-      <w:r>
-        <w:t xml:space="preserve">Et pourtant, voici la vérité la plus dure que je doive te dire :</w:t>
+        <w:t xml:space="preserve">Mon enfant, je vais maintenant te raconter ce qui s’est passé. Écoute bien, parce que le plus troublant dans ces histoires, ce n’est pas qu’elles soient extraordinaires. C’est qu’elles sont terriblement ordinaires.</w:t>
+      </w:r>
+    </w:p>
+    <w:bookmarkStart w:id="23" w:name="un-samedi-17-heures"/>
+    <w:p>
+      <w:pPr>
+        <w:pStyle w:val="Heading3"/>
+      </w:pPr>
+      <w:r>
+        <w:t xml:space="preserve">Un samedi, 17 heures</w:t>
+      </w:r>
+    </w:p>
+    <w:p>
+      <w:pPr>
+        <w:pStyle w:val="FirstParagraph"/>
+      </w:pPr>
+      <w:r>
+        <w:t xml:space="preserve">C’était un samedi. William et moi rentrions ensemble des cours de renforcement, chez notre maître de maison. Deux enfants sur le chemin du retour, comme tant d’autres samedis. Arrivés chez lui, sa maman l’a envoyé aussitôt au marché acheter des cubes Maggi pour la cuisine du soir. Il était 17 heures. Le ciel était lourd, nuageux, la pluie menaçait. Alors je ne l’ai pas accompagné : j’ai continué mon chemin jusque chez moi.</w:t>
+      </w:r>
+    </w:p>
+    <w:p>
+      <w:pPr>
+        <w:pStyle w:val="BodyText"/>
+      </w:pPr>
+      <w:r>
+        <w:t xml:space="preserve">Je ne savais pas que c’était la dernière fois que je le voyais.</w:t>
+      </w:r>
+    </w:p>
+    <w:p>
+      <w:pPr>
+        <w:pStyle w:val="BodyText"/>
+      </w:pPr>
+      <w:r>
+        <w:t xml:space="preserve">Le lendemain, dimanche, vers 13 heures, nous étions chez notre maître de maison. C’est là qu’on nous a annoncé la nouvelle : William avait été renversé par une moto en allant au marché. Il n’avait pas survécu sur le chemin de l’hôpital.</w:t>
+      </w:r>
+    </w:p>
+    <w:p>
+      <w:pPr>
+        <w:pStyle w:val="BodyText"/>
+      </w:pPr>
+      <w:r>
+        <w:t xml:space="preserve">Une course de rien du tout. Quelques cubes pour la sauce. Le genre de commission que des millions d’enfants font chaque jour. Et pourtant, ce soir-là, l’horloge de William est arrivée à zéro.</w:t>
+      </w:r>
+    </w:p>
+    <w:p>
+      <w:pPr>
+        <w:pStyle w:val="BodyText"/>
+      </w:pPr>
+      <w:r>
+        <w:t xml:space="preserve">Moi, j’ai pris le chemin de la maison. Lui, le chemin du marché. Je me suis souvent demandé :</w:t>
+      </w:r>
+      <w:r>
+        <w:t xml:space="preserve"> </w:t>
+      </w:r>
+      <w:r>
+        <w:rPr>
+          <w:iCs/>
+          <w:i/>
+        </w:rPr>
+        <w:t xml:space="preserve">pourquoi lui, et pas moi ?</w:t>
+      </w:r>
+      <w:r>
+        <w:t xml:space="preserve"> </w:t>
+      </w:r>
+      <w:r>
+        <w:t xml:space="preserve">Je n’ai pas de réponse. Je sais seulement que ce jour-là, sans le savoir, j’ai appris que</w:t>
       </w:r>
       <w:r>
         <w:t xml:space="preserve"> </w:t>
@@ -544,23 +596,49 @@
           <w:bCs/>
           <w:b/>
         </w:rPr>
-        <w:t xml:space="preserve">le jour où la mort viendra me chercher, tout mon amour ne pourra pas me retenir près de toi.</w:t>
-      </w:r>
-    </w:p>
-    <w:p>
-      <w:pPr>
-        <w:pStyle w:val="BodyText"/>
-      </w:pPr>
-      <w:r>
-        <w:t xml:space="preserve">Je partirai. Et tu resteras. Ou c’est toi qui partiras, et moi qui resterai. Malgré toutes nos bonnes intentions, malgré tous nos « je serai toujours là pour toi », la mort viendra défaire nos promesses humaines. Elle ne demande pas la permission. Elle ne regarde pas combien on est aimé. Elle n’attend pas que les enfants soient grands, que la maison soit finie, que les dettes soient payées.</w:t>
-      </w:r>
-    </w:p>
-    <w:p>
-      <w:pPr>
-        <w:pStyle w:val="BodyText"/>
-      </w:pPr>
-      <w:r>
-        <w:t xml:space="preserve">C’est un paradoxe cruel :</w:t>
+        <w:t xml:space="preserve">personne ne sait quelle sortie sera sa dernière sortie.</w:t>
+      </w:r>
+    </w:p>
+    <w:bookmarkEnd w:id="23"/>
+    <w:bookmarkStart w:id="24" w:name="un-dimanche-matin-à-gagnoa"/>
+    <w:p>
+      <w:pPr>
+        <w:pStyle w:val="Heading3"/>
+      </w:pPr>
+      <w:r>
+        <w:t xml:space="preserve">Un dimanche matin, à Gagnoa</w:t>
+      </w:r>
+    </w:p>
+    <w:p>
+      <w:pPr>
+        <w:pStyle w:val="FirstParagraph"/>
+      </w:pPr>
+      <w:r>
+        <w:t xml:space="preserve">Quelques années plus tard, j’étais en 6e-5e. Ma tante Rachelle, l’épouse de mon oncle, était venue chez nous, à Gagnoa, pour accoucher. C’était une joie dans la maison : un enfant allait naître.</w:t>
+      </w:r>
+    </w:p>
+    <w:p>
+      <w:pPr>
+        <w:pStyle w:val="BodyText"/>
+      </w:pPr>
+      <w:r>
+        <w:t xml:space="preserve">Un dimanche matin, elle est partie pour la maternité. Elle est sortie de la maison comme on sort pour revenir. Elle allait donner la vie.</w:t>
+      </w:r>
+    </w:p>
+    <w:p>
+      <w:pPr>
+        <w:pStyle w:val="BodyText"/>
+      </w:pPr>
+      <w:r>
+        <w:t xml:space="preserve">Elle n’est jamais rentrée. Elle est décédée après l’accouchement.</w:t>
+      </w:r>
+    </w:p>
+    <w:p>
+      <w:pPr>
+        <w:pStyle w:val="BodyText"/>
+      </w:pPr>
+      <w:r>
+        <w:t xml:space="preserve">Mon enfant, comprends-tu ce paradoxe-là ?</w:t>
       </w:r>
       <w:r>
         <w:t xml:space="preserve"> </w:t>
@@ -570,37 +648,23 @@
           <w:bCs/>
           <w:b/>
         </w:rPr>
-        <w:t xml:space="preserve">nous aimons de toutes nos forces, et pourtant notre amour n’a pas la force de vaincre la mort.</w:t>
-      </w:r>
-    </w:p>
-    <w:p>
-      <w:pPr>
-        <w:pStyle w:val="BodyText"/>
-      </w:pPr>
-      <w:r>
-        <w:t xml:space="preserve">Mon beau-père aimait sa famille. Il voulait la voir grandir, la protéger encore. Mais un jour, il a dû la laisser. Non parce qu’il l’aimait moins, mais parce que l’homme n’a aucun pouvoir sur le jour de son départ.</w:t>
-      </w:r>
-    </w:p>
-    <w:p>
-      <w:pPr>
-        <w:pStyle w:val="BlockText"/>
-      </w:pPr>
-      <w:r>
-        <w:t xml:space="preserve">« Il est réservé aux hommes de mourir une seule fois,</w:t>
-      </w:r>
-      <w:r>
-        <w:t xml:space="preserve"> </w:t>
-      </w:r>
-      <w:r>
-        <w:t xml:space="preserve">après quoi vient le jugement. »</w:t>
-      </w:r>
-    </w:p>
-    <w:p>
-      <w:pPr>
-        <w:pStyle w:val="BlockText"/>
-      </w:pPr>
-      <w:r>
-        <w:t xml:space="preserve">— Hébreux 9.27</w:t>
+        <w:t xml:space="preserve">Elle est partie pour donner la vie, et c’est la sienne qu’elle a perdue.</w:t>
+      </w:r>
+      <w:r>
+        <w:t xml:space="preserve"> </w:t>
+      </w:r>
+      <w:r>
+        <w:t xml:space="preserve">Le jour qui devait être le plus beau de sa vie est devenu le dernier. Le même jour, une maison a accueilli un berceau et pleuré un cercueil.</w:t>
+      </w:r>
+    </w:p>
+    <w:bookmarkEnd w:id="24"/>
+    <w:bookmarkStart w:id="25" w:name="le-10-août-2026-sur-la-route"/>
+    <w:p>
+      <w:pPr>
+        <w:pStyle w:val="Heading3"/>
+      </w:pPr>
+      <w:r>
+        <w:t xml:space="preserve">Le 10 août 2026, sur la route</w:t>
       </w:r>
     </w:p>
     <w:p>
@@ -608,7 +672,135 @@
         <w:pStyle w:val="FirstParagraph"/>
       </w:pPr>
       <w:r>
-        <w:t xml:space="preserve">Alors, mon enfant, si mon amour ne peut pas te garder éternellement, il me reste une chose à faire : te conduire vers un amour qui, lui, le peut. Un amour plus fort que la mort. Je t’en parlerai plus loin. Mais retiens déjà ceci : il existe Quelqu’un qui a dit « Je ne te délaisserai point, et je ne t’abandonnerai point » (Hébreux 13.5), et qui a le pouvoir de tenir parole, même au-delà de la tombe.</w:t>
+        <w:t xml:space="preserve">Et cette année, le 10 août 2026, mon beau-père, le pasteur Koffi François, a pris la route pour se rendre à la pastorale. Il allait retrouver ses frères dans le ministère, prier, servir, se préparer pour l’œuvre de Dieu. Un voyage comme il en avait fait tant d’autres.</w:t>
+      </w:r>
+    </w:p>
+    <w:p>
+      <w:pPr>
+        <w:pStyle w:val="BodyText"/>
+      </w:pPr>
+      <w:r>
+        <w:t xml:space="preserve">Il est décédé dans un accident de circulation.</w:t>
+      </w:r>
+    </w:p>
+    <w:p>
+      <w:pPr>
+        <w:pStyle w:val="BodyText"/>
+      </w:pPr>
+      <w:r>
+        <w:t xml:space="preserve">Un serviteur de Dieu, sur le chemin du service de Dieu. Si quelqu’un pensait que la foi protège de la mort, ce jour-là lui a répondu.</w:t>
+      </w:r>
+      <w:r>
+        <w:t xml:space="preserve"> </w:t>
+      </w:r>
+      <w:r>
+        <w:rPr>
+          <w:bCs/>
+          <w:b/>
+        </w:rPr>
+        <w:t xml:space="preserve">Même les hommes de Dieu meurent.</w:t>
+      </w:r>
+      <w:r>
+        <w:t xml:space="preserve"> </w:t>
+      </w:r>
+      <w:r>
+        <w:t xml:space="preserve">La différence n’est pas dans la manière de mourir. Elle est dans le lieu où l’on se réveille.</w:t>
+      </w:r>
+    </w:p>
+    <w:p>
+      <w:pPr>
+        <w:pStyle w:val="BodyText"/>
+      </w:pPr>
+      <w:r>
+        <w:t xml:space="preserve">Car celui qui a servi le Seigneur toute sa vie peut dire avec l’apôtre Paul :</w:t>
+      </w:r>
+    </w:p>
+    <w:p>
+      <w:pPr>
+        <w:pStyle w:val="BlockText"/>
+      </w:pPr>
+      <w:r>
+        <w:t xml:space="preserve">« Car Christ est ma vie, et la mort m’est un gain. »</w:t>
+      </w:r>
+    </w:p>
+    <w:p>
+      <w:pPr>
+        <w:pStyle w:val="BlockText"/>
+      </w:pPr>
+      <w:r>
+        <w:t xml:space="preserve">— Philippiens 1.21</w:t>
+      </w:r>
+    </w:p>
+    <w:bookmarkEnd w:id="25"/>
+    <w:bookmarkStart w:id="26" w:name="ce-que-ces-trois-départs-mont-appris"/>
+    <w:p>
+      <w:pPr>
+        <w:pStyle w:val="Heading3"/>
+      </w:pPr>
+      <w:r>
+        <w:t xml:space="preserve">Ce que ces trois départs m’ont appris</w:t>
+      </w:r>
+    </w:p>
+    <w:p>
+      <w:pPr>
+        <w:pStyle w:val="FirstParagraph"/>
+      </w:pPr>
+      <w:r>
+        <w:t xml:space="preserve">Un enfant qui va acheter des cubes. Une femme qui va accoucher. Un pasteur qui va à une réunion. Il n’y avait rien d’exceptionnel dans ces journées-là. Pas de guerre, pas d’épidémie, pas de grande catastrophe. Juste la vie de tous les jours… et soudain, plus rien.</w:t>
+      </w:r>
+    </w:p>
+    <w:p>
+      <w:pPr>
+        <w:pStyle w:val="BodyText"/>
+      </w:pPr>
+      <w:r>
+        <w:t xml:space="preserve">Voilà pourquoi je ne crois plus que la mort prévienne. Elle ne vient pas toujours après une longue maladie, dans un lit d’hôpital, au bout d’une longue vieillesse. Elle peut venir un samedi à 17 heures, un dimanche matin, un 10 août, au milieu d’une course, d’une joie ou d’un service.</w:t>
+      </w:r>
+    </w:p>
+    <w:p>
+      <w:pPr>
+        <w:pStyle w:val="BlockText"/>
+      </w:pPr>
+      <w:r>
+        <w:t xml:space="preserve">« Ne te vante pas du lendemain,</w:t>
+      </w:r>
+      <w:r>
+        <w:t xml:space="preserve"> </w:t>
+      </w:r>
+      <w:r>
+        <w:t xml:space="preserve">car tu ne sais pas ce qu’un jour peut enfanter. »</w:t>
+      </w:r>
+    </w:p>
+    <w:p>
+      <w:pPr>
+        <w:pStyle w:val="BlockText"/>
+      </w:pPr>
+      <w:r>
+        <w:t xml:space="preserve">— Proverbes 27.1</w:t>
+      </w:r>
+    </w:p>
+    <w:p>
+      <w:pPr>
+        <w:pStyle w:val="FirstParagraph"/>
+      </w:pPr>
+      <w:r>
+        <w:t xml:space="preserve">Depuis, mon enfant, je vis avec cette prière du psalmiste dans le cœur :</w:t>
+      </w:r>
+      <w:r>
+        <w:t xml:space="preserve"> </w:t>
+      </w:r>
+      <w:r>
+        <w:rPr>
+          <w:iCs/>
+          <w:i/>
+        </w:rPr>
+        <w:t xml:space="preserve">« Enseigne-nous à bien compter nos jours, afin que nous appliquions notre cœur à la sagesse. »</w:t>
+      </w:r>
+      <w:r>
+        <w:t xml:space="preserve"> </w:t>
+      </w:r>
+      <w:r>
+        <w:t xml:space="preserve">Et c’est cette prière que je voudrais déposer dans le tien.</w:t>
       </w:r>
     </w:p>
     <w:p>
@@ -618,14 +810,15 @@
         </w:pict>
       </w:r>
     </w:p>
-    <w:bookmarkEnd w:id="23"/>
-    <w:bookmarkStart w:id="24" w:name="la-nuit-de-la-veillée"/>
+    <w:bookmarkEnd w:id="26"/>
+    <w:bookmarkEnd w:id="27"/>
+    <w:bookmarkStart w:id="28" w:name="lamour-qui-ne-peut-pas-retenir"/>
     <w:p>
       <w:pPr>
         <w:pStyle w:val="Heading2"/>
       </w:pPr>
       <w:r>
-        <w:t xml:space="preserve">3. La nuit de la veillée</w:t>
+        <w:t xml:space="preserve">3. L’amour qui ne peut pas retenir</w:t>
       </w:r>
     </w:p>
     <w:p>
@@ -633,65 +826,23 @@
         <w:pStyle w:val="FirstParagraph"/>
       </w:pPr>
       <w:r>
-        <w:t xml:space="preserve">Te souviens-tu d’une veillée funèbre, mon enfant ? Si ce n’est pas encore le cas, tu en connaîtras. Laisse-moi te raconter ce que mes yeux ont vu.</w:t>
-      </w:r>
-    </w:p>
-    <w:p>
-      <w:pPr>
-        <w:pStyle w:val="BodyText"/>
-      </w:pPr>
-      <w:r>
-        <w:t xml:space="preserve">Le jour de la levée du corps, beaucoup de gens se déplacent. On vient de loin. On loue des cars, on prend la route. Le soir de la veillée, la cour est pleine. On installe les chaises sous les bâches. On sert à manger et à boire. Chacun a choisi sa tenue : certains ont acheté le pagne de deuil, d’autres sont venus comme ils ont pu. On se salue, on se raconte des souvenirs, parfois on rit même un peu, entre deux larmes. On chante. On prie. On a mal, oui, vraiment mal. Mais on a faim, et on mange. On a chaud, et on cherche l’ombre ou le vent. On est fatigué, et on cherche un coin pour dormir. Le matin, on se douche, on se change.</w:t>
-      </w:r>
-    </w:p>
-    <w:p>
-      <w:pPr>
-        <w:pStyle w:val="BodyText"/>
-      </w:pPr>
-      <w:r>
-        <w:t xml:space="preserve">Et lui ?</w:t>
-      </w:r>
-    </w:p>
-    <w:p>
-      <w:pPr>
-        <w:pStyle w:val="BodyText"/>
-      </w:pPr>
-      <w:r>
-        <w:t xml:space="preserve">Lui est couché, seul, dans une boîte de bois qu’on appelle cercueil. Il porte l’habit qu’on lui a mis à la morgue. Il ne l’a pas choisi. Il ne peut pas le changer. S’il fait chaud, il ne peut pas demander qu’on l’évente. S’il a soif, il ne peut pas demander à boire. Il est placé à part, sous un chapiteau, isolé de la foule, éclairé par quelques lampes. Tout le monde est venu</w:t>
-      </w:r>
-      <w:r>
-        <w:t xml:space="preserve"> </w:t>
-      </w:r>
-      <w:r>
-        <w:rPr>
-          <w:iCs/>
-          <w:i/>
-        </w:rPr>
-        <w:t xml:space="preserve">pour lui</w:t>
-      </w:r>
-      <w:r>
-        <w:t xml:space="preserve">, et pourtant personne n’est</w:t>
-      </w:r>
-      <w:r>
-        <w:t xml:space="preserve"> </w:t>
-      </w:r>
-      <w:r>
-        <w:rPr>
-          <w:iCs/>
-          <w:i/>
-        </w:rPr>
-        <w:t xml:space="preserve">avec lui</w:t>
-      </w:r>
-      <w:r>
-        <w:t xml:space="preserve">. Chacun a son siège, à côté de quelqu’un. Lui n’a plus de voisin.</w:t>
-      </w:r>
-    </w:p>
-    <w:p>
-      <w:pPr>
-        <w:pStyle w:val="BodyText"/>
-      </w:pPr>
-      <w:r>
-        <w:t xml:space="preserve">Et ce n’est pas par manque d’amour, mon enfant. Ceux qui l’entourent l’aiment de tout leur cœur. Mais il n’y a pas d’autre manière de faire.</w:t>
+        <w:t xml:space="preserve">Mon enfant, je t’aime. Tu le sais, n’est-ce pas ?</w:t>
+      </w:r>
+    </w:p>
+    <w:p>
+      <w:pPr>
+        <w:pStyle w:val="BodyText"/>
+      </w:pPr>
+      <w:r>
+        <w:t xml:space="preserve">Je me suis levé tôt pour toi. J’ai travaillé, je me suis inquiété, j’ai prié pour toi, j’ai fait des projets pour ton avenir. Comme moi, des millions de pères et de mères donnent tout pour leurs enfants. Des maris et des épouses se promettent de ne jamais se quitter. Des frères et des sœurs jurent de toujours se soutenir.</w:t>
+      </w:r>
+    </w:p>
+    <w:p>
+      <w:pPr>
+        <w:pStyle w:val="BodyText"/>
+      </w:pPr>
+      <w:r>
+        <w:t xml:space="preserve">Et pourtant, voici la vérité la plus dure que je doive te dire :</w:t>
       </w:r>
       <w:r>
         <w:t xml:space="preserve"> </w:t>
@@ -701,15 +852,23 @@
           <w:bCs/>
           <w:b/>
         </w:rPr>
-        <w:t xml:space="preserve">Même ceux qui l’aiment le plus sont obligés de le laisser seul.</w:t>
-      </w:r>
-    </w:p>
-    <w:p>
-      <w:pPr>
-        <w:pStyle w:val="BodyText"/>
-      </w:pPr>
-      <w:r>
-        <w:t xml:space="preserve">Voilà le troisième paradoxe :</w:t>
+        <w:t xml:space="preserve">le jour où la mort viendra me chercher, tout mon amour ne pourra pas me retenir près de toi.</w:t>
+      </w:r>
+    </w:p>
+    <w:p>
+      <w:pPr>
+        <w:pStyle w:val="BodyText"/>
+      </w:pPr>
+      <w:r>
+        <w:t xml:space="preserve">Je partirai. Et tu resteras. Ou c’est toi qui partiras, et moi qui resterai. Malgré toutes nos bonnes intentions, malgré tous nos « je serai toujours là pour toi », la mort viendra défaire nos promesses humaines. Elle ne demande pas la permission. Elle ne regarde pas combien on est aimé. Elle n’attend pas que les enfants soient grands, que la maison soit finie, que les dettes soient payées.</w:t>
+      </w:r>
+    </w:p>
+    <w:p>
+      <w:pPr>
+        <w:pStyle w:val="BodyText"/>
+      </w:pPr>
+      <w:r>
+        <w:t xml:space="preserve">C’est un paradoxe cruel :</w:t>
       </w:r>
       <w:r>
         <w:t xml:space="preserve"> </w:t>
@@ -719,61 +878,45 @@
           <w:bCs/>
           <w:b/>
         </w:rPr>
-        <w:t xml:space="preserve">toute la foule est là pour lui, et il est le seul à ne rien voir de la foule.</w:t>
-      </w:r>
-    </w:p>
-    <w:p>
-      <w:pPr>
-        <w:pStyle w:val="BodyText"/>
-      </w:pPr>
-      <w:r>
-        <w:t xml:space="preserve">Les beaux discours, les chants, les hommages, les pagnes assortis, les tentes, les photos géantes, il ne les voit pas. On dit enfin de lui toutes les belles choses qu’on n’a pas toujours eu le temps de lui dire de son vivant. Combien de « je t’aime » sont prononcés devant un cercueil qui auraient dû être dits devant un visage vivant ?</w:t>
-      </w:r>
-    </w:p>
-    <w:p>
-      <w:pPr>
-        <w:pStyle w:val="BodyText"/>
-      </w:pPr>
-      <w:r>
-        <w:t xml:space="preserve">Écoute bien, mon enfant :</w:t>
-      </w:r>
-      <w:r>
-        <w:t xml:space="preserve"> </w:t>
-      </w:r>
-      <w:r>
-        <w:rPr>
-          <w:bCs/>
-          <w:b/>
-        </w:rPr>
-        <w:t xml:space="preserve">le corps qui est dans le cercueil n’est que la maison. L’habitant, lui, est déjà parti.</w:t>
-      </w:r>
-      <w:r>
-        <w:t xml:space="preserve"> </w:t>
-      </w:r>
-      <w:r>
-        <w:t xml:space="preserve">La vraie question n’est pas : « Comment sera ma veillée ? » La vraie question est : « Où sera mon âme pendant qu’on veillera mon corps ? »</w:t>
-      </w:r>
-    </w:p>
-    <w:p>
-      <w:pPr>
-        <w:pStyle w:val="BlockText"/>
-      </w:pPr>
-      <w:r>
-        <w:t xml:space="preserve">« Mieux vaut aller dans une maison de deuil que d’aller dans une maison de festin ;</w:t>
-      </w:r>
-      <w:r>
-        <w:t xml:space="preserve"> </w:t>
-      </w:r>
-      <w:r>
-        <w:t xml:space="preserve">car c’est là la fin de tout homme, et celui qui vit prend la chose à cœur. »</w:t>
-      </w:r>
-    </w:p>
-    <w:p>
-      <w:pPr>
-        <w:pStyle w:val="BlockText"/>
-      </w:pPr>
-      <w:r>
-        <w:t xml:space="preserve">— Ecclésiaste 7.2</w:t>
+        <w:t xml:space="preserve">nous aimons de toutes nos forces, et pourtant notre amour n’a pas la force de vaincre la mort.</w:t>
+      </w:r>
+    </w:p>
+    <w:p>
+      <w:pPr>
+        <w:pStyle w:val="BodyText"/>
+      </w:pPr>
+      <w:r>
+        <w:t xml:space="preserve">Mon beau-père, le pasteur, aimait sa famille. Il voulait la voir grandir, la protéger encore. Mais un jour, il a dû la laisser. Non parce qu’il l’aimait moins, mais parce que l’homme n’a aucun pouvoir sur le jour de son départ.</w:t>
+      </w:r>
+    </w:p>
+    <w:p>
+      <w:pPr>
+        <w:pStyle w:val="BlockText"/>
+      </w:pPr>
+      <w:r>
+        <w:t xml:space="preserve">« Il est réservé aux hommes de mourir une seule fois,</w:t>
+      </w:r>
+      <w:r>
+        <w:t xml:space="preserve"> </w:t>
+      </w:r>
+      <w:r>
+        <w:t xml:space="preserve">après quoi vient le jugement. »</w:t>
+      </w:r>
+    </w:p>
+    <w:p>
+      <w:pPr>
+        <w:pStyle w:val="BlockText"/>
+      </w:pPr>
+      <w:r>
+        <w:t xml:space="preserve">— Hébreux 9.27</w:t>
+      </w:r>
+    </w:p>
+    <w:p>
+      <w:pPr>
+        <w:pStyle w:val="FirstParagraph"/>
+      </w:pPr>
+      <w:r>
+        <w:t xml:space="preserve">Alors, mon enfant, si mon amour ne peut pas te garder éternellement, il me reste une chose à faire : te conduire vers un amour qui, lui, le peut. Un amour plus fort que la mort. Je t’en parlerai plus loin. Mais retiens déjà ceci : il existe Quelqu’un qui a dit « Je ne te délaisserai point, et je ne t’abandonnerai point » (Hébreux 13.5), et qui a le pouvoir de tenir parole, même au-delà de la tombe.</w:t>
       </w:r>
     </w:p>
     <w:p>
@@ -783,14 +926,14 @@
         </w:pict>
       </w:r>
     </w:p>
-    <w:bookmarkEnd w:id="24"/>
-    <w:bookmarkStart w:id="25" w:name="la-dernière-séparation"/>
+    <w:bookmarkEnd w:id="28"/>
+    <w:bookmarkStart w:id="29" w:name="la-nuit-de-la-veillée"/>
     <w:p>
       <w:pPr>
         <w:pStyle w:val="Heading2"/>
       </w:pPr>
       <w:r>
-        <w:t xml:space="preserve">4. La dernière séparation</w:t>
+        <w:t xml:space="preserve">4. La nuit de la veillée</w:t>
       </w:r>
     </w:p>
     <w:p>
@@ -798,55 +941,65 @@
         <w:pStyle w:val="FirstParagraph"/>
       </w:pPr>
       <w:r>
-        <w:t xml:space="preserve">Puis vient le moment le plus dur. Celui où l’on ferme le cercueil.</w:t>
-      </w:r>
-    </w:p>
-    <w:p>
-      <w:pPr>
-        <w:pStyle w:val="BodyText"/>
-      </w:pPr>
-      <w:r>
-        <w:t xml:space="preserve">On s’approche une dernière fois. On regarde ce visage qu’on a connu toute une vie. On voudrait le toucher encore, le retenir encore un peu. Des cris éclatent. Des mains se tendent. Certains s’effondrent. Et puis le couvercle se referme. On porte le cercueil. On descend dans la tombe. La terre tombe, pelletée après pelletée. Ce bruit-là, mon enfant, celui qui l’a entendu ne l’oublie jamais.</w:t>
-      </w:r>
-    </w:p>
-    <w:p>
-      <w:pPr>
-        <w:pStyle w:val="BodyText"/>
-      </w:pPr>
-      <w:r>
-        <w:t xml:space="preserve">Et ensuite ?</w:t>
-      </w:r>
-    </w:p>
-    <w:p>
-      <w:pPr>
-        <w:pStyle w:val="BodyText"/>
-      </w:pPr>
-      <w:r>
-        <w:t xml:space="preserve">Ensuite, chacun rentre chez soi.</w:t>
-      </w:r>
-    </w:p>
-    <w:p>
-      <w:pPr>
-        <w:pStyle w:val="BodyText"/>
-      </w:pPr>
-      <w:r>
-        <w:t xml:space="preserve">Les cars repartent. Les chaises sont rangées. Les bâches sont démontées. Le lendemain ou le surlendemain, on reprend le travail, l’école, le marché, les affaires. Le téléphone sonne à nouveau pour d’autres sujets. La vie continue. Pas par méchanceté, ni par oubli : c’est ainsi que la vie est faite. Les vivants doivent vivre.</w:t>
-      </w:r>
-    </w:p>
-    <w:p>
-      <w:pPr>
-        <w:pStyle w:val="BodyText"/>
-      </w:pPr>
-      <w:r>
-        <w:t xml:space="preserve">Et lui reste là. Seul, sous la terre, dans le silence.</w:t>
-      </w:r>
-    </w:p>
-    <w:p>
-      <w:pPr>
-        <w:pStyle w:val="BodyText"/>
-      </w:pPr>
-      <w:r>
-        <w:t xml:space="preserve">Voici encore un paradoxe :</w:t>
+        <w:t xml:space="preserve">Te souviens-tu d’une veillée funèbre, mon enfant ? Si ce n’est pas encore le cas, tu en connaîtras. Laisse-moi te raconter ce que mes yeux ont vu.</w:t>
+      </w:r>
+    </w:p>
+    <w:p>
+      <w:pPr>
+        <w:pStyle w:val="BodyText"/>
+      </w:pPr>
+      <w:r>
+        <w:t xml:space="preserve">Le jour de la levée du corps, beaucoup de gens se déplacent. On vient de loin. On loue des cars, on prend la route. Le soir de la veillée, la cour est pleine. On installe les chaises sous les bâches. On sert à manger et à boire. Chacun a choisi sa tenue : certains ont acheté le pagne de deuil, d’autres sont venus comme ils ont pu. On se salue, on se raconte des souvenirs, parfois on rit même un peu, entre deux larmes. On chante. On prie. On a mal, oui, vraiment mal. Mais on a faim, et on mange. On a chaud, et on cherche l’ombre ou le vent. On est fatigué, et on cherche un coin pour dormir. Le matin, on se douche, on se change.</w:t>
+      </w:r>
+    </w:p>
+    <w:p>
+      <w:pPr>
+        <w:pStyle w:val="BodyText"/>
+      </w:pPr>
+      <w:r>
+        <w:t xml:space="preserve">Et lui ?</w:t>
+      </w:r>
+    </w:p>
+    <w:p>
+      <w:pPr>
+        <w:pStyle w:val="BodyText"/>
+      </w:pPr>
+      <w:r>
+        <w:t xml:space="preserve">Lui est couché, seul, dans une boîte de bois qu’on appelle cercueil. Il porte l’habit qu’on lui a mis à la morgue. Il ne l’a pas choisi. Il ne peut pas le changer. S’il fait chaud, il ne peut pas demander qu’on l’évente. S’il a soif, il ne peut pas demander à boire. Il est placé à part, sous un chapiteau, isolé de la foule, éclairé par quelques lampes. Tout le monde est venu</w:t>
+      </w:r>
+      <w:r>
+        <w:t xml:space="preserve"> </w:t>
+      </w:r>
+      <w:r>
+        <w:rPr>
+          <w:iCs/>
+          <w:i/>
+        </w:rPr>
+        <w:t xml:space="preserve">pour lui</w:t>
+      </w:r>
+      <w:r>
+        <w:t xml:space="preserve">, et pourtant personne n’est</w:t>
+      </w:r>
+      <w:r>
+        <w:t xml:space="preserve"> </w:t>
+      </w:r>
+      <w:r>
+        <w:rPr>
+          <w:iCs/>
+          <w:i/>
+        </w:rPr>
+        <w:t xml:space="preserve">avec lui</w:t>
+      </w:r>
+      <w:r>
+        <w:t xml:space="preserve">. Chacun a son siège, à côté de quelqu’un. Lui n’a plus de voisin.</w:t>
+      </w:r>
+    </w:p>
+    <w:p>
+      <w:pPr>
+        <w:pStyle w:val="BodyText"/>
+      </w:pPr>
+      <w:r>
+        <w:t xml:space="preserve">Et ce n’est pas par manque d’amour, mon enfant. Ceux qui l’entourent l’aiment de tout leur cœur. Mais il n’y a pas d’autre manière de faire.</w:t>
       </w:r>
       <w:r>
         <w:t xml:space="preserve"> </w:t>
@@ -856,21 +1009,15 @@
           <w:bCs/>
           <w:b/>
         </w:rPr>
-        <w:t xml:space="preserve">il a fallu des années pour construire une vie, et il suffit de quelques heures pour la mettre en terre.</w:t>
-      </w:r>
-      <w:r>
-        <w:t xml:space="preserve"> </w:t>
-      </w:r>
-      <w:r>
-        <w:t xml:space="preserve">Toute une existence, ses combats, ses rêves, ses sacrifices, et au bout du compte, un petit carré de terre et une plaque avec deux dates.</w:t>
-      </w:r>
-    </w:p>
-    <w:p>
-      <w:pPr>
-        <w:pStyle w:val="BodyText"/>
-      </w:pPr>
-      <w:r>
-        <w:t xml:space="preserve">As-tu déjà regardé une tombe, mon enfant ? Il y a une date de naissance, une date de décès, et entre les deux, un petit trait. Un simple tiret.</w:t>
+        <w:t xml:space="preserve">Même ceux qui l’aiment le plus sont obligés de le laisser seul.</w:t>
+      </w:r>
+    </w:p>
+    <w:p>
+      <w:pPr>
+        <w:pStyle w:val="BodyText"/>
+      </w:pPr>
+      <w:r>
+        <w:t xml:space="preserve">Voilà le troisième paradoxe :</w:t>
       </w:r>
       <w:r>
         <w:t xml:space="preserve"> </w:t>
@@ -880,13 +1027,61 @@
           <w:bCs/>
           <w:b/>
         </w:rPr>
-        <w:t xml:space="preserve">Toute la vie d’un homme tient dans ce petit trait.</w:t>
-      </w:r>
-      <w:r>
-        <w:t xml:space="preserve"> </w:t>
-      </w:r>
-      <w:r>
-        <w:t xml:space="preserve">Ce n’est pas la date de naissance qui compte, ni même la date de la mort. C’est ce que tu fais du tiret. Et surtout, c’est ce que tu décides, dans ce tiret, au sujet de Dieu.</w:t>
+        <w:t xml:space="preserve">toute la foule est là pour lui, et il est le seul à ne rien voir de la foule.</w:t>
+      </w:r>
+    </w:p>
+    <w:p>
+      <w:pPr>
+        <w:pStyle w:val="BodyText"/>
+      </w:pPr>
+      <w:r>
+        <w:t xml:space="preserve">Les beaux discours, les chants, les hommages, les pagnes assortis, les tentes, les photos géantes, il ne les voit pas. On dit enfin de lui toutes les belles choses qu’on n’a pas toujours eu le temps de lui dire de son vivant. Combien de « je t’aime » sont prononcés devant un cercueil qui auraient dû être dits devant un visage vivant ?</w:t>
+      </w:r>
+    </w:p>
+    <w:p>
+      <w:pPr>
+        <w:pStyle w:val="BodyText"/>
+      </w:pPr>
+      <w:r>
+        <w:t xml:space="preserve">Écoute bien, mon enfant :</w:t>
+      </w:r>
+      <w:r>
+        <w:t xml:space="preserve"> </w:t>
+      </w:r>
+      <w:r>
+        <w:rPr>
+          <w:bCs/>
+          <w:b/>
+        </w:rPr>
+        <w:t xml:space="preserve">le corps qui est dans le cercueil n’est que la maison. L’habitant, lui, est déjà parti.</w:t>
+      </w:r>
+      <w:r>
+        <w:t xml:space="preserve"> </w:t>
+      </w:r>
+      <w:r>
+        <w:t xml:space="preserve">La vraie question n’est pas : « Comment sera ma veillée ? » La vraie question est : « Où sera mon âme pendant qu’on veillera mon corps ? »</w:t>
+      </w:r>
+    </w:p>
+    <w:p>
+      <w:pPr>
+        <w:pStyle w:val="BlockText"/>
+      </w:pPr>
+      <w:r>
+        <w:t xml:space="preserve">« Mieux vaut aller dans une maison de deuil que d’aller dans une maison de festin ;</w:t>
+      </w:r>
+      <w:r>
+        <w:t xml:space="preserve"> </w:t>
+      </w:r>
+      <w:r>
+        <w:t xml:space="preserve">car c’est là la fin de tout homme, et celui qui vit prend la chose à cœur. »</w:t>
+      </w:r>
+    </w:p>
+    <w:p>
+      <w:pPr>
+        <w:pStyle w:val="BlockText"/>
+      </w:pPr>
+      <w:r>
+        <w:t xml:space="preserve">— Ecclésiaste 7.2</w:t>
       </w:r>
     </w:p>
     <w:p>
@@ -896,14 +1091,14 @@
         </w:pict>
       </w:r>
     </w:p>
-    <w:bookmarkEnd w:id="25"/>
-    <w:bookmarkStart w:id="26" w:name="absent-aux-obsèques-de-son-propre-père"/>
+    <w:bookmarkEnd w:id="29"/>
+    <w:bookmarkStart w:id="30" w:name="la-dernière-séparation"/>
     <w:p>
       <w:pPr>
         <w:pStyle w:val="Heading2"/>
       </w:pPr>
       <w:r>
-        <w:t xml:space="preserve">5. Absent aux obsèques de son propre père</w:t>
+        <w:t xml:space="preserve">5. La dernière séparation</w:t>
       </w:r>
     </w:p>
     <w:p>
@@ -911,31 +1106,55 @@
         <w:pStyle w:val="FirstParagraph"/>
       </w:pPr>
       <w:r>
-        <w:t xml:space="preserve">Il y a une douleur dont on parle peu.</w:t>
-      </w:r>
-    </w:p>
-    <w:p>
-      <w:pPr>
-        <w:pStyle w:val="BodyText"/>
-      </w:pPr>
-      <w:r>
-        <w:t xml:space="preserve">Parfois, à cause de certaines contraintes, la distance, le travail, la maladie, les papiers, l’argent, les frontières, on ne peut même pas être présent aux obsèques de quelqu’un qu’on aime. Même quand c’est notre propre père. Même quand c’est notre mère.</w:t>
-      </w:r>
-    </w:p>
-    <w:p>
-      <w:pPr>
-        <w:pStyle w:val="BodyText"/>
-      </w:pPr>
-      <w:r>
-        <w:t xml:space="preserve">On apprend la nouvelle au téléphone, loin, très loin. On pleure seul dans une chambre. On suit la cérémonie en vidéo, ou on se la fait raconter. Et une petite voix accuse : « Tu n’étais pas là. Tu aurais dû être là. »</w:t>
-      </w:r>
-    </w:p>
-    <w:p>
-      <w:pPr>
-        <w:pStyle w:val="BodyText"/>
-      </w:pPr>
-      <w:r>
-        <w:t xml:space="preserve">Mon enfant, si un jour cela t’arrive, écoute ton père :</w:t>
+        <w:t xml:space="preserve">Puis vient le moment le plus dur. Celui où l’on ferme le cercueil.</w:t>
+      </w:r>
+    </w:p>
+    <w:p>
+      <w:pPr>
+        <w:pStyle w:val="BodyText"/>
+      </w:pPr>
+      <w:r>
+        <w:t xml:space="preserve">On s’approche une dernière fois. On regarde ce visage qu’on a connu toute une vie. On voudrait le toucher encore, le retenir encore un peu. Des cris éclatent. Des mains se tendent. Certains s’effondrent. Et puis le couvercle se referme. On porte le cercueil. On descend dans la tombe. La terre tombe, pelletée après pelletée. Ce bruit-là, mon enfant, celui qui l’a entendu ne l’oublie jamais.</w:t>
+      </w:r>
+    </w:p>
+    <w:p>
+      <w:pPr>
+        <w:pStyle w:val="BodyText"/>
+      </w:pPr>
+      <w:r>
+        <w:t xml:space="preserve">Et ensuite ?</w:t>
+      </w:r>
+    </w:p>
+    <w:p>
+      <w:pPr>
+        <w:pStyle w:val="BodyText"/>
+      </w:pPr>
+      <w:r>
+        <w:t xml:space="preserve">Ensuite, chacun rentre chez soi.</w:t>
+      </w:r>
+    </w:p>
+    <w:p>
+      <w:pPr>
+        <w:pStyle w:val="BodyText"/>
+      </w:pPr>
+      <w:r>
+        <w:t xml:space="preserve">Les cars repartent. Les chaises sont rangées. Les bâches sont démontées. Le lendemain ou le surlendemain, on reprend le travail, l’école, le marché, les affaires. Le téléphone sonne à nouveau pour d’autres sujets. La vie continue. Pas par méchanceté, ni par oubli : c’est ainsi que la vie est faite. Les vivants doivent vivre.</w:t>
+      </w:r>
+    </w:p>
+    <w:p>
+      <w:pPr>
+        <w:pStyle w:val="BodyText"/>
+      </w:pPr>
+      <w:r>
+        <w:t xml:space="preserve">Et lui reste là. Seul, sous la terre, dans le silence.</w:t>
+      </w:r>
+    </w:p>
+    <w:p>
+      <w:pPr>
+        <w:pStyle w:val="BodyText"/>
+      </w:pPr>
+      <w:r>
+        <w:t xml:space="preserve">Voici encore un paradoxe :</w:t>
       </w:r>
       <w:r>
         <w:t xml:space="preserve"> </w:t>
@@ -945,91 +1164,37 @@
           <w:bCs/>
           <w:b/>
         </w:rPr>
-        <w:t xml:space="preserve">ce n’est pas de l’indifférence. C’est la réalité de notre condition humaine.</w:t>
-      </w:r>
-    </w:p>
-    <w:p>
-      <w:pPr>
-        <w:pStyle w:val="BodyText"/>
-      </w:pPr>
-      <w:r>
-        <w:t xml:space="preserve">Job, cet homme qui avait tout perdu en un seul jour, ses biens, ses serviteurs, ses dix enfants, s’est prosterné et a dit :</w:t>
-      </w:r>
-    </w:p>
-    <w:p>
-      <w:pPr>
-        <w:pStyle w:val="BlockText"/>
-      </w:pPr>
-      <w:r>
-        <w:t xml:space="preserve">« Je suis sorti nu du sein de ma mère, et nu je retournerai dans le sein de la terre.</w:t>
-      </w:r>
-      <w:r>
-        <w:t xml:space="preserve"> </w:t>
-      </w:r>
-      <w:r>
-        <w:t xml:space="preserve">L’Éternel a donné, et l’Éternel a ôté ; que le nom de l’Éternel soit béni ! »</w:t>
-      </w:r>
-    </w:p>
-    <w:p>
-      <w:pPr>
-        <w:pStyle w:val="BlockText"/>
-      </w:pPr>
-      <w:r>
-        <w:t xml:space="preserve">— Job 1.21</w:t>
-      </w:r>
-    </w:p>
-    <w:p>
-      <w:pPr>
-        <w:pStyle w:val="FirstParagraph"/>
-      </w:pPr>
-      <w:r>
-        <w:t xml:space="preserve">Nous n’avons rien apporté en venant au monde. Nous n’emporterons rien en le quittant. Nous arrivons seuls, et nous repartons seuls. Ni nos enfants, ni nos amis, ni nos diplômes, ni nos comptes en banque ne nous accompagneront dans la tombe. Même ceux qui se tiennent au bord de la fosse ne descendent pas avec nous.</w:t>
-      </w:r>
-    </w:p>
-    <w:p>
-      <w:pPr>
-        <w:pStyle w:val="BlockText"/>
-      </w:pPr>
-      <w:r>
-        <w:t xml:space="preserve">« Nous n’avons rien apporté dans le monde,</w:t>
-      </w:r>
-      <w:r>
-        <w:t xml:space="preserve"> </w:t>
-      </w:r>
-      <w:r>
-        <w:t xml:space="preserve">et il est évident que nous n’en pouvons rien emporter. »</w:t>
-      </w:r>
-    </w:p>
-    <w:p>
-      <w:pPr>
-        <w:pStyle w:val="BlockText"/>
-      </w:pPr>
-      <w:r>
-        <w:t xml:space="preserve">— 1 Timothée 6.7</w:t>
-      </w:r>
-    </w:p>
-    <w:p>
-      <w:pPr>
-        <w:pStyle w:val="FirstParagraph"/>
-      </w:pPr>
-      <w:r>
-        <w:t xml:space="preserve">Alors ne te condamne pas pour une absence que tu n’as pas choisie. Celui qui est parti n’a plus besoin de ta présence au cimetière. Ce dont il avait besoin, c’était de ton amour pendant sa vie. Et ce dont</w:t>
-      </w:r>
-      <w:r>
-        <w:t xml:space="preserve"> </w:t>
-      </w:r>
-      <w:r>
-        <w:rPr>
-          <w:iCs/>
-          <w:i/>
-        </w:rPr>
-        <w:t xml:space="preserve">toi</w:t>
-      </w:r>
-      <w:r>
-        <w:t xml:space="preserve"> </w:t>
-      </w:r>
-      <w:r>
-        <w:t xml:space="preserve">tu as besoin maintenant, c’est de préparer ton propre départ.</w:t>
+        <w:t xml:space="preserve">il a fallu des années pour construire une vie, et il suffit de quelques heures pour la mettre en terre.</w:t>
+      </w:r>
+      <w:r>
+        <w:t xml:space="preserve"> </w:t>
+      </w:r>
+      <w:r>
+        <w:t xml:space="preserve">Toute une existence, ses combats, ses rêves, ses sacrifices, et au bout du compte, un petit carré de terre et une plaque avec deux dates.</w:t>
+      </w:r>
+    </w:p>
+    <w:p>
+      <w:pPr>
+        <w:pStyle w:val="BodyText"/>
+      </w:pPr>
+      <w:r>
+        <w:t xml:space="preserve">As-tu déjà regardé une tombe, mon enfant ? Il y a une date de naissance, une date de décès, et entre les deux, un petit trait. Un simple tiret.</w:t>
+      </w:r>
+      <w:r>
+        <w:t xml:space="preserve"> </w:t>
+      </w:r>
+      <w:r>
+        <w:rPr>
+          <w:bCs/>
+          <w:b/>
+        </w:rPr>
+        <w:t xml:space="preserve">Toute la vie d’un homme tient dans ce petit trait.</w:t>
+      </w:r>
+      <w:r>
+        <w:t xml:space="preserve"> </w:t>
+      </w:r>
+      <w:r>
+        <w:t xml:space="preserve">Ce n’est pas la date de naissance qui compte, ni même la date de la mort. C’est ce que tu fais du tiret. Et surtout, c’est ce que tu décides, dans ce tiret, au sujet de Dieu.</w:t>
       </w:r>
     </w:p>
     <w:p>
@@ -1039,14 +1204,14 @@
         </w:pict>
       </w:r>
     </w:p>
-    <w:bookmarkEnd w:id="26"/>
-    <w:bookmarkStart w:id="27" w:name="les-paradoxes-de-notre-vie"/>
+    <w:bookmarkEnd w:id="30"/>
+    <w:bookmarkStart w:id="31" w:name="absent-aux-obsèques-de-son-propre-père"/>
     <w:p>
       <w:pPr>
         <w:pStyle w:val="Heading2"/>
       </w:pPr>
       <w:r>
-        <w:t xml:space="preserve">6. Les paradoxes de notre vie</w:t>
+        <w:t xml:space="preserve">6. Absent aux obsèques de son propre père</w:t>
       </w:r>
     </w:p>
     <w:p>
@@ -1054,137 +1219,71 @@
         <w:pStyle w:val="FirstParagraph"/>
       </w:pPr>
       <w:r>
-        <w:t xml:space="preserve">Mon enfant, plus j’ai vieilli, plus j’ai remarqué combien notre façon de vivre est étrange quand on la regarde à la lumière de la mort. Laisse-moi t’en citer quelques-uns. Lis-les lentement.</w:t>
-      </w:r>
-    </w:p>
-    <w:p>
-      <w:pPr>
-        <w:pStyle w:val="BodyText"/>
-      </w:pPr>
+        <w:t xml:space="preserve">Il y a une douleur dont on parle peu.</w:t>
+      </w:r>
+    </w:p>
+    <w:p>
+      <w:pPr>
+        <w:pStyle w:val="BodyText"/>
+      </w:pPr>
+      <w:r>
+        <w:t xml:space="preserve">Parfois, à cause de certaines contraintes, la distance, le travail, la maladie, les papiers, l’argent, les frontières, on ne peut même pas être présent aux obsèques de quelqu’un qu’on aime. Même quand c’est notre propre père. Même quand c’est notre mère.</w:t>
+      </w:r>
+    </w:p>
+    <w:p>
+      <w:pPr>
+        <w:pStyle w:val="BodyText"/>
+      </w:pPr>
+      <w:r>
+        <w:t xml:space="preserve">On apprend la nouvelle au téléphone, loin, très loin. On pleure seul dans une chambre. On suit la cérémonie en vidéo, ou on se la fait raconter. Et une petite voix accuse : « Tu n’étais pas là. Tu aurais dû être là. »</w:t>
+      </w:r>
+    </w:p>
+    <w:p>
+      <w:pPr>
+        <w:pStyle w:val="BodyText"/>
+      </w:pPr>
+      <w:r>
+        <w:t xml:space="preserve">Mon enfant, si un jour cela t’arrive, écoute ton père :</w:t>
+      </w:r>
+      <w:r>
+        <w:t xml:space="preserve"> </w:t>
+      </w:r>
       <w:r>
         <w:rPr>
           <w:bCs/>
           <w:b/>
         </w:rPr>
-        <w:t xml:space="preserve">Nous préparons tout, sauf l’essentiel.</w:t>
-      </w:r>
-      <w:r>
-        <w:t xml:space="preserve"> </w:t>
-      </w:r>
-      <w:r>
-        <w:t xml:space="preserve">Nous préparons nos examens, nos mariages, nos voyages, notre retraite. Certains cotisent même pour leurs propres funérailles. Mais combien préparent leur éternité ?</w:t>
-      </w:r>
-    </w:p>
-    <w:p>
-      <w:pPr>
-        <w:pStyle w:val="BodyText"/>
-      </w:pPr>
-      <w:r>
-        <w:rPr>
-          <w:bCs/>
-          <w:b/>
-        </w:rPr>
-        <w:t xml:space="preserve">Nous construisons des maisons que nous quitterons.</w:t>
-      </w:r>
-      <w:r>
-        <w:t xml:space="preserve"> </w:t>
-      </w:r>
-      <w:r>
-        <w:t xml:space="preserve">Un homme peut passer trente ans à bâtir une maison à étages, et finir dans une boîte de deux mètres. La maison reste. Lui s’en va.</w:t>
-      </w:r>
-    </w:p>
-    <w:p>
-      <w:pPr>
-        <w:pStyle w:val="BodyText"/>
-      </w:pPr>
-      <w:r>
-        <w:rPr>
-          <w:bCs/>
-          <w:b/>
-        </w:rPr>
-        <w:t xml:space="preserve">Nous donnons au mort ce que nous refusions au vivant.</w:t>
-      </w:r>
-      <w:r>
-        <w:t xml:space="preserve"> </w:t>
-      </w:r>
-      <w:r>
-        <w:t xml:space="preserve">Le plus beau costume, le cercueil le plus cher, les fleurs, les discours, les grandes affiches avec sa photo. Et parfois, de son vivant, on ne lui rendait même pas visite, on ne l’appelait pas, on ne lui disait pas merci.</w:t>
-      </w:r>
-    </w:p>
-    <w:p>
-      <w:pPr>
-        <w:pStyle w:val="BodyText"/>
-      </w:pPr>
-      <w:r>
-        <w:rPr>
-          <w:bCs/>
-          <w:b/>
-        </w:rPr>
-        <w:t xml:space="preserve">Nous courons après le nom, et le nom s’efface.</w:t>
-      </w:r>
-      <w:r>
-        <w:t xml:space="preserve"> </w:t>
-      </w:r>
-      <w:r>
-        <w:t xml:space="preserve">Les titres, les grades, la renommée : dans deux ou trois générations, qui se souviendra de nous ? Même nos arrière-petits-enfants connaîtront à peine notre prénom.</w:t>
-      </w:r>
-    </w:p>
-    <w:p>
-      <w:pPr>
-        <w:pStyle w:val="BodyText"/>
-      </w:pPr>
-      <w:r>
-        <w:rPr>
-          <w:bCs/>
-          <w:b/>
-        </w:rPr>
-        <w:t xml:space="preserve">Nous avons peur de parler de la mort, mais elle n’a pas peur de venir.</w:t>
-      </w:r>
-      <w:r>
-        <w:t xml:space="preserve"> </w:t>
-      </w:r>
-      <w:r>
-        <w:t xml:space="preserve">On change de sujet, on dit « Dieu nous en garde », on évite le mot. Mais elle vient quand même, à l’heure qu’elle n’annonce pas.</w:t>
-      </w:r>
-    </w:p>
-    <w:p>
-      <w:pPr>
-        <w:pStyle w:val="BodyText"/>
-      </w:pPr>
-      <w:r>
-        <w:rPr>
-          <w:bCs/>
-          <w:b/>
-        </w:rPr>
-        <w:t xml:space="preserve">Nous disons « demain » à Dieu, comme si demain nous appartenait.</w:t>
-      </w:r>
-      <w:r>
-        <w:t xml:space="preserve"> </w:t>
-      </w:r>
-      <w:r>
-        <w:t xml:space="preserve">« Je m’occuperai de ma vie spirituelle plus tard, quand j’aurai réglé mes affaires, quand je serai plus âgé. » Mais William n’a jamais eu de « plus tard ».</w:t>
-      </w:r>
-    </w:p>
-    <w:p>
-      <w:pPr>
-        <w:pStyle w:val="BlockText"/>
-      </w:pPr>
-      <w:r>
-        <w:t xml:space="preserve">« Ne te vante pas du lendemain,</w:t>
-      </w:r>
-      <w:r>
-        <w:t xml:space="preserve"> </w:t>
-      </w:r>
-      <w:r>
-        <w:t xml:space="preserve">car tu ne sais pas ce qu’un jour peut enfanter. »</w:t>
-      </w:r>
-    </w:p>
-    <w:p>
-      <w:pPr>
-        <w:pStyle w:val="BlockText"/>
-      </w:pPr>
-      <w:r>
-        <w:t xml:space="preserve">— Proverbes 27.1</w:t>
+        <w:t xml:space="preserve">ce n’est pas de l’indifférence. C’est la réalité de notre condition humaine.</w:t>
+      </w:r>
+    </w:p>
+    <w:p>
+      <w:pPr>
+        <w:pStyle w:val="BodyText"/>
+      </w:pPr>
+      <w:r>
+        <w:t xml:space="preserve">Job, cet homme qui avait tout perdu en un seul jour, ses biens, ses serviteurs, ses dix enfants, s’est prosterné et a dit :</w:t>
+      </w:r>
+    </w:p>
+    <w:p>
+      <w:pPr>
+        <w:pStyle w:val="BlockText"/>
+      </w:pPr>
+      <w:r>
+        <w:t xml:space="preserve">« Je suis sorti nu du sein de ma mère, et nu je retournerai dans le sein de la terre.</w:t>
+      </w:r>
+      <w:r>
+        <w:t xml:space="preserve"> </w:t>
+      </w:r>
+      <w:r>
+        <w:t xml:space="preserve">L’Éternel a donné, et l’Éternel a ôté ; que le nom de l’Éternel soit béni ! »</w:t>
+      </w:r>
+    </w:p>
+    <w:p>
+      <w:pPr>
+        <w:pStyle w:val="BlockText"/>
+      </w:pPr>
+      <w:r>
+        <w:t xml:space="preserve">— Job 1.21</w:t>
       </w:r>
     </w:p>
     <w:p>
@@ -1192,57 +1291,29 @@
         <w:pStyle w:val="FirstParagraph"/>
       </w:pPr>
       <w:r>
-        <w:rPr>
-          <w:bCs/>
-          <w:b/>
-        </w:rPr>
-        <w:t xml:space="preserve">Nous soignons le corps qui mourra et négligeons l’âme qui vivra toujours.</w:t>
-      </w:r>
-      <w:r>
-        <w:t xml:space="preserve"> </w:t>
-      </w:r>
-      <w:r>
-        <w:t xml:space="preserve">On fait du sport, on surveille son alimentation, on achète des crèmes et des parfums. C’est bien. Mais ce corps retournera à la poussière. Ton âme, elle, ne mourra jamais. Elle passera l’éternité quelque part.</w:t>
-      </w:r>
-    </w:p>
-    <w:p>
-      <w:pPr>
-        <w:pStyle w:val="BodyText"/>
-      </w:pPr>
-      <w:r>
-        <w:rPr>
-          <w:bCs/>
-          <w:b/>
-        </w:rPr>
-        <w:t xml:space="preserve">Nous gagnons de l’argent toute notre vie, et ce sont d’autres qui le dépensent.</w:t>
-      </w:r>
-      <w:r>
-        <w:t xml:space="preserve"> </w:t>
-      </w:r>
-      <w:r>
-        <w:t xml:space="preserve">Jésus a raconté l’histoire d’un homme riche qui disait : « Mon âme, tu as beaucoup de biens en réserve, repose-toi, mange, bois et réjouis-toi. » Mais Dieu lui répondit :</w:t>
-      </w:r>
-    </w:p>
-    <w:p>
-      <w:pPr>
-        <w:pStyle w:val="BlockText"/>
-      </w:pPr>
-      <w:r>
-        <w:t xml:space="preserve">« Insensé ! cette nuit même ton âme te sera redemandée ;</w:t>
-      </w:r>
-      <w:r>
-        <w:t xml:space="preserve"> </w:t>
-      </w:r>
-      <w:r>
-        <w:t xml:space="preserve">et ce que tu as préparé, pour qui cela sera-t-il ? »</w:t>
-      </w:r>
-    </w:p>
-    <w:p>
-      <w:pPr>
-        <w:pStyle w:val="BlockText"/>
-      </w:pPr>
-      <w:r>
-        <w:t xml:space="preserve">— Luc 12.20</w:t>
+        <w:t xml:space="preserve">Nous n’avons rien apporté en venant au monde. Nous n’emporterons rien en le quittant. Nous arrivons seuls, et nous repartons seuls. Ni nos enfants, ni nos amis, ni nos diplômes, ni nos comptes en banque ne nous accompagneront dans la tombe. Même ceux qui se tiennent au bord de la fosse ne descendent pas avec nous.</w:t>
+      </w:r>
+    </w:p>
+    <w:p>
+      <w:pPr>
+        <w:pStyle w:val="BlockText"/>
+      </w:pPr>
+      <w:r>
+        <w:t xml:space="preserve">« Nous n’avons rien apporté dans le monde,</w:t>
+      </w:r>
+      <w:r>
+        <w:t xml:space="preserve"> </w:t>
+      </w:r>
+      <w:r>
+        <w:t xml:space="preserve">et il est évident que nous n’en pouvons rien emporter. »</w:t>
+      </w:r>
+    </w:p>
+    <w:p>
+      <w:pPr>
+        <w:pStyle w:val="BlockText"/>
+      </w:pPr>
+      <w:r>
+        <w:t xml:space="preserve">— 1 Timothée 6.7</w:t>
       </w:r>
     </w:p>
     <w:p>
@@ -1250,33 +1321,23 @@
         <w:pStyle w:val="FirstParagraph"/>
       </w:pPr>
       <w:r>
-        <w:rPr>
-          <w:bCs/>
-          <w:b/>
-        </w:rPr>
-        <w:t xml:space="preserve">Nous pleurons les morts, mais ce sont les vivants que la mort avertit.</w:t>
-      </w:r>
-      <w:r>
-        <w:t xml:space="preserve"> </w:t>
-      </w:r>
-      <w:r>
-        <w:t xml:space="preserve">Celui qui est dans le cercueil a déjà fait son choix ; il ne peut plus rien changer. Mais toi, qui es debout à côté, tu peux encore choisir. Chaque enterrement est un message de Dieu adressé à ceux qui restent.</w:t>
-      </w:r>
-    </w:p>
-    <w:p>
-      <w:pPr>
-        <w:pStyle w:val="BlockText"/>
-      </w:pPr>
-      <w:r>
-        <w:t xml:space="preserve">« Que sert-il à un homme de gagner tout le monde, s’il perd son âme ? »</w:t>
-      </w:r>
-    </w:p>
-    <w:p>
-      <w:pPr>
-        <w:pStyle w:val="BlockText"/>
-      </w:pPr>
-      <w:r>
-        <w:t xml:space="preserve">— Marc 8.36</w:t>
+        <w:t xml:space="preserve">Alors ne te condamne pas pour une absence que tu n’as pas choisie. Celui qui est parti n’a plus besoin de ta présence au cimetière. Ce dont il avait besoin, c’était de ton amour pendant sa vie. Et ce dont</w:t>
+      </w:r>
+      <w:r>
+        <w:t xml:space="preserve"> </w:t>
+      </w:r>
+      <w:r>
+        <w:rPr>
+          <w:iCs/>
+          <w:i/>
+        </w:rPr>
+        <w:t xml:space="preserve">toi</w:t>
+      </w:r>
+      <w:r>
+        <w:t xml:space="preserve"> </w:t>
+      </w:r>
+      <w:r>
+        <w:t xml:space="preserve">tu as besoin maintenant, c’est de préparer ton propre départ.</w:t>
       </w:r>
     </w:p>
     <w:p>
@@ -1286,14 +1347,14 @@
         </w:pict>
       </w:r>
     </w:p>
-    <w:bookmarkEnd w:id="27"/>
-    <w:bookmarkStart w:id="28" w:name="ce-que-les-larmes-ont-le-droit-de-dire"/>
+    <w:bookmarkEnd w:id="31"/>
+    <w:bookmarkStart w:id="32" w:name="les-paradoxes-de-notre-vie"/>
     <w:p>
       <w:pPr>
         <w:pStyle w:val="Heading2"/>
       </w:pPr>
       <w:r>
-        <w:t xml:space="preserve">7. Ce que les larmes ont le droit de dire</w:t>
+        <w:t xml:space="preserve">7. Les paradoxes de notre vie</w:t>
       </w:r>
     </w:p>
     <w:p>
@@ -1301,138 +1362,207 @@
         <w:pStyle w:val="FirstParagraph"/>
       </w:pPr>
       <w:r>
-        <w:t xml:space="preserve">Mon enfant, je ne veux pas que tu croies qu’il ne faut pas pleurer.</w:t>
-      </w:r>
-    </w:p>
-    <w:p>
-      <w:pPr>
-        <w:pStyle w:val="BodyText"/>
-      </w:pPr>
-      <w:r>
-        <w:t xml:space="preserve">Il y a des gens qui disent aux endeuillés : « Ne pleure pas, il faut être fort. » Moi, je te dis : pleure. Pleure autant que ton cœur en a besoin. Les larmes ne sont pas un manque de foi. Elles sont le prix de l’amour.</w:t>
-      </w:r>
-    </w:p>
-    <w:p>
-      <w:pPr>
-        <w:pStyle w:val="BodyText"/>
-      </w:pPr>
-      <w:r>
-        <w:t xml:space="preserve">Quand Jésus est arrivé devant le tombeau de son ami Lazare, il savait qu’il allait le ressusciter quelques minutes plus tard. Et pourtant, la Bible dit, en deux mots seulement :</w:t>
-      </w:r>
-    </w:p>
-    <w:p>
-      <w:pPr>
-        <w:pStyle w:val="BlockText"/>
-      </w:pPr>
-      <w:r>
-        <w:t xml:space="preserve">« Jésus pleura. »</w:t>
-      </w:r>
-    </w:p>
-    <w:p>
-      <w:pPr>
-        <w:pStyle w:val="BlockText"/>
-      </w:pPr>
-      <w:r>
-        <w:t xml:space="preserve">— Jean 11.35</w:t>
-      </w:r>
-    </w:p>
-    <w:p>
-      <w:pPr>
-        <w:pStyle w:val="FirstParagraph"/>
-      </w:pPr>
-      <w:r>
-        <w:t xml:space="preserve">Le Fils de Dieu a pleuré devant la tombe d’un ami. Alors tu as le droit de pleurer devant celle de ton père, de ta mère, de ton enfant, de ton ami. Dieu ne méprise pas tes larmes. Il les recueille.</w:t>
-      </w:r>
-    </w:p>
-    <w:p>
-      <w:pPr>
-        <w:pStyle w:val="BlockText"/>
-      </w:pPr>
-      <w:r>
-        <w:t xml:space="preserve">« L’Éternel est près de ceux qui ont le cœur brisé,</w:t>
-      </w:r>
-      <w:r>
-        <w:t xml:space="preserve"> </w:t>
-      </w:r>
-      <w:r>
-        <w:t xml:space="preserve">et il sauve ceux qui ont l’esprit dans l’abattement. »</w:t>
-      </w:r>
-    </w:p>
-    <w:p>
-      <w:pPr>
-        <w:pStyle w:val="BlockText"/>
-      </w:pPr>
-      <w:r>
-        <w:t xml:space="preserve">— Psaume 34.19</w:t>
-      </w:r>
-    </w:p>
-    <w:p>
-      <w:pPr>
-        <w:pStyle w:val="FirstParagraph"/>
-      </w:pPr>
-      <w:r>
-        <w:t xml:space="preserve">Mais écoute bien la suite, car c’est ici que tout change. L’apôtre Paul écrit aux chrétiens qui avaient perdu des proches :</w:t>
-      </w:r>
-    </w:p>
-    <w:p>
-      <w:pPr>
-        <w:pStyle w:val="BlockText"/>
-      </w:pPr>
-      <w:r>
-        <w:t xml:space="preserve">« Nous ne voulons pas, frères, que vous soyez dans l’ignorance au sujet de ceux qui dorment,</w:t>
-      </w:r>
-      <w:r>
-        <w:t xml:space="preserve"> </w:t>
-      </w:r>
-      <w:r>
-        <w:t xml:space="preserve">afin que vous ne vous affligiez pas comme les autres qui n’ont point d’espérance. »</w:t>
-      </w:r>
-    </w:p>
-    <w:p>
-      <w:pPr>
-        <w:pStyle w:val="BlockText"/>
-      </w:pPr>
-      <w:r>
-        <w:t xml:space="preserve">— 1 Thessaloniciens 4.13</w:t>
-      </w:r>
-    </w:p>
-    <w:p>
-      <w:pPr>
-        <w:pStyle w:val="FirstParagraph"/>
-      </w:pPr>
-      <w:r>
-        <w:t xml:space="preserve">Remarque bien, mon enfant : Paul ne dit pas « ne vous affligez pas ». Il dit « ne vous affligez pas</w:t>
-      </w:r>
-      <w:r>
-        <w:t xml:space="preserve"> </w:t>
-      </w:r>
-      <w:r>
-        <w:rPr>
-          <w:iCs/>
-          <w:i/>
-        </w:rPr>
-        <w:t xml:space="preserve">comme ceux qui n’ont point d’espérance</w:t>
-      </w:r>
-      <w:r>
-        <w:t xml:space="preserve"> ». Il y a deux sortes de larmes au bord d’une tombe : les larmes sans espoir, et les larmes avec espoir. Les unes disent « adieu ». Les autres disent « au revoir ».</w:t>
-      </w:r>
-    </w:p>
-    <w:p>
-      <w:pPr>
-        <w:pStyle w:val="BodyText"/>
-      </w:pPr>
-      <w:r>
-        <w:t xml:space="preserve">Toute la différence entre les deux porte un nom :</w:t>
-      </w:r>
-      <w:r>
-        <w:t xml:space="preserve"> </w:t>
-      </w:r>
+        <w:t xml:space="preserve">Mon enfant, plus j’ai vieilli, plus j’ai remarqué combien notre façon de vivre est étrange quand on la regarde à la lumière de la mort. Laisse-moi t’en citer quelques-uns. Lis-les lentement.</w:t>
+      </w:r>
+    </w:p>
+    <w:p>
+      <w:pPr>
+        <w:pStyle w:val="BodyText"/>
+      </w:pPr>
       <w:r>
         <w:rPr>
           <w:bCs/>
           <w:b/>
         </w:rPr>
-        <w:t xml:space="preserve">Jésus-Christ.</w:t>
+        <w:t xml:space="preserve">Nous préparons tout, sauf l’essentiel.</w:t>
+      </w:r>
+      <w:r>
+        <w:t xml:space="preserve"> </w:t>
+      </w:r>
+      <w:r>
+        <w:t xml:space="preserve">Nous préparons nos examens, nos mariages, nos voyages, notre retraite. Certains cotisent même pour leurs propres funérailles. Mais combien préparent leur éternité ?</w:t>
+      </w:r>
+    </w:p>
+    <w:p>
+      <w:pPr>
+        <w:pStyle w:val="BodyText"/>
+      </w:pPr>
+      <w:r>
+        <w:rPr>
+          <w:bCs/>
+          <w:b/>
+        </w:rPr>
+        <w:t xml:space="preserve">Nous construisons des maisons que nous quitterons.</w:t>
+      </w:r>
+      <w:r>
+        <w:t xml:space="preserve"> </w:t>
+      </w:r>
+      <w:r>
+        <w:t xml:space="preserve">Un homme peut passer trente ans à bâtir une maison à étages, et finir dans une boîte de deux mètres. La maison reste. Lui s’en va.</w:t>
+      </w:r>
+    </w:p>
+    <w:p>
+      <w:pPr>
+        <w:pStyle w:val="BodyText"/>
+      </w:pPr>
+      <w:r>
+        <w:rPr>
+          <w:bCs/>
+          <w:b/>
+        </w:rPr>
+        <w:t xml:space="preserve">Nous donnons au mort ce que nous refusions au vivant.</w:t>
+      </w:r>
+      <w:r>
+        <w:t xml:space="preserve"> </w:t>
+      </w:r>
+      <w:r>
+        <w:t xml:space="preserve">Le plus beau costume, le cercueil le plus cher, les fleurs, les discours, les grandes affiches avec sa photo. Et parfois, de son vivant, on ne lui rendait même pas visite, on ne l’appelait pas, on ne lui disait pas merci.</w:t>
+      </w:r>
+    </w:p>
+    <w:p>
+      <w:pPr>
+        <w:pStyle w:val="BodyText"/>
+      </w:pPr>
+      <w:r>
+        <w:rPr>
+          <w:bCs/>
+          <w:b/>
+        </w:rPr>
+        <w:t xml:space="preserve">Nous courons après le nom, et le nom s’efface.</w:t>
+      </w:r>
+      <w:r>
+        <w:t xml:space="preserve"> </w:t>
+      </w:r>
+      <w:r>
+        <w:t xml:space="preserve">Les titres, les grades, la renommée : dans deux ou trois générations, qui se souviendra de nous ? Même nos arrière-petits-enfants connaîtront à peine notre prénom.</w:t>
+      </w:r>
+    </w:p>
+    <w:p>
+      <w:pPr>
+        <w:pStyle w:val="BodyText"/>
+      </w:pPr>
+      <w:r>
+        <w:rPr>
+          <w:bCs/>
+          <w:b/>
+        </w:rPr>
+        <w:t xml:space="preserve">Nous avons peur de parler de la mort, mais elle n’a pas peur de venir.</w:t>
+      </w:r>
+      <w:r>
+        <w:t xml:space="preserve"> </w:t>
+      </w:r>
+      <w:r>
+        <w:t xml:space="preserve">On change de sujet, on dit « Dieu nous en garde », on évite le mot. Mais elle vient quand même, à l’heure qu’elle n’annonce pas.</w:t>
+      </w:r>
+    </w:p>
+    <w:p>
+      <w:pPr>
+        <w:pStyle w:val="BodyText"/>
+      </w:pPr>
+      <w:r>
+        <w:rPr>
+          <w:bCs/>
+          <w:b/>
+        </w:rPr>
+        <w:t xml:space="preserve">Nous disons « demain » à Dieu, comme si demain nous appartenait.</w:t>
+      </w:r>
+      <w:r>
+        <w:t xml:space="preserve"> </w:t>
+      </w:r>
+      <w:r>
+        <w:t xml:space="preserve">« Je m’occuperai de ma vie spirituelle plus tard, quand j’aurai réglé mes affaires, quand je serai plus âgé. » Mais William n’a jamais eu de « plus tard ». Ce samedi-là, il n’a même pas eu de dimanche.</w:t>
+      </w:r>
+    </w:p>
+    <w:p>
+      <w:pPr>
+        <w:pStyle w:val="BodyText"/>
+      </w:pPr>
+      <w:r>
+        <w:rPr>
+          <w:bCs/>
+          <w:b/>
+        </w:rPr>
+        <w:t xml:space="preserve">Nous soignons le corps qui mourra et négligeons l’âme qui vivra toujours.</w:t>
+      </w:r>
+      <w:r>
+        <w:t xml:space="preserve"> </w:t>
+      </w:r>
+      <w:r>
+        <w:t xml:space="preserve">On fait du sport, on surveille son alimentation, on achète des crèmes et des parfums. C’est bien. Mais ce corps retournera à la poussière. Ton âme, elle, ne mourra jamais. Elle passera l’éternité quelque part.</w:t>
+      </w:r>
+    </w:p>
+    <w:p>
+      <w:pPr>
+        <w:pStyle w:val="BodyText"/>
+      </w:pPr>
+      <w:r>
+        <w:rPr>
+          <w:bCs/>
+          <w:b/>
+        </w:rPr>
+        <w:t xml:space="preserve">Nous gagnons de l’argent toute notre vie, et ce sont d’autres qui le dépensent.</w:t>
+      </w:r>
+      <w:r>
+        <w:t xml:space="preserve"> </w:t>
+      </w:r>
+      <w:r>
+        <w:t xml:space="preserve">Jésus a raconté l’histoire d’un homme riche qui disait : « Mon âme, tu as beaucoup de biens en réserve, repose-toi, mange, bois et réjouis-toi. » Mais Dieu lui répondit :</w:t>
+      </w:r>
+    </w:p>
+    <w:p>
+      <w:pPr>
+        <w:pStyle w:val="BlockText"/>
+      </w:pPr>
+      <w:r>
+        <w:t xml:space="preserve">« Insensé ! cette nuit même ton âme te sera redemandée ;</w:t>
+      </w:r>
+      <w:r>
+        <w:t xml:space="preserve"> </w:t>
+      </w:r>
+      <w:r>
+        <w:t xml:space="preserve">et ce que tu as préparé, pour qui cela sera-t-il ? »</w:t>
+      </w:r>
+    </w:p>
+    <w:p>
+      <w:pPr>
+        <w:pStyle w:val="BlockText"/>
+      </w:pPr>
+      <w:r>
+        <w:t xml:space="preserve">— Luc 12.20</w:t>
+      </w:r>
+    </w:p>
+    <w:p>
+      <w:pPr>
+        <w:pStyle w:val="FirstParagraph"/>
+      </w:pPr>
+      <w:r>
+        <w:rPr>
+          <w:bCs/>
+          <w:b/>
+        </w:rPr>
+        <w:t xml:space="preserve">Nous pleurons les morts, mais ce sont les vivants que la mort avertit.</w:t>
+      </w:r>
+      <w:r>
+        <w:t xml:space="preserve"> </w:t>
+      </w:r>
+      <w:r>
+        <w:t xml:space="preserve">Celui qui est dans le cercueil a déjà fait son choix ; il ne peut plus rien changer. Mais toi, qui es debout à côté, tu peux encore choisir. Chaque enterrement est un message de Dieu adressé à ceux qui restent.</w:t>
+      </w:r>
+    </w:p>
+    <w:p>
+      <w:pPr>
+        <w:pStyle w:val="BlockText"/>
+      </w:pPr>
+      <w:r>
+        <w:t xml:space="preserve">« Que sert-il à un homme de gagner tout le monde, s’il perd son âme ? »</w:t>
+      </w:r>
+    </w:p>
+    <w:p>
+      <w:pPr>
+        <w:pStyle w:val="BlockText"/>
+      </w:pPr>
+      <w:r>
+        <w:t xml:space="preserve">— Marc 8.36</w:t>
       </w:r>
     </w:p>
     <w:p>
@@ -1442,14 +1572,14 @@
         </w:pict>
       </w:r>
     </w:p>
-    <w:bookmarkEnd w:id="28"/>
-    <w:bookmarkStart w:id="29" w:name="celui-qui-a-vaincu-la-mort"/>
+    <w:bookmarkEnd w:id="32"/>
+    <w:bookmarkStart w:id="33" w:name="ce-que-les-larmes-ont-le-droit-de-dire"/>
     <w:p>
       <w:pPr>
         <w:pStyle w:val="Heading2"/>
       </w:pPr>
       <w:r>
-        <w:t xml:space="preserve">8. Celui qui a vaincu la mort</w:t>
+        <w:t xml:space="preserve">8. Ce que les larmes ont le droit de dire</w:t>
       </w:r>
     </w:p>
     <w:p>
@@ -1457,65 +1587,39 @@
         <w:pStyle w:val="FirstParagraph"/>
       </w:pPr>
       <w:r>
-        <w:t xml:space="preserve">Depuis le commencement du monde, tous les hommes sont morts. Les rois et les mendiants, les savants et les ignorants, les saints et les méchants. Les plus grands fondateurs de religions, les plus grands philosophes, les plus grands chefs : tous sont dans leur tombe, et leur tombe est encore occupée.</w:t>
-      </w:r>
-    </w:p>
-    <w:p>
-      <w:pPr>
-        <w:pStyle w:val="BodyText"/>
-      </w:pPr>
-      <w:r>
-        <w:t xml:space="preserve">Sauf une.</w:t>
-      </w:r>
-    </w:p>
-    <w:p>
-      <w:pPr>
-        <w:pStyle w:val="BodyText"/>
-      </w:pPr>
-      <w:r>
-        <w:t xml:space="preserve">Il y a, à Jérusalem, un tombeau vide. Celui d’un homme qui avait annoncé : « Je mourrai, et le troisième jour je ressusciterai. » On l’a cloué sur une croix. On l’a mis au tombeau. On a roulé une grosse pierre devant l’entrée. On a placé des soldats pour la garder. Et le troisième jour, le tombeau était vide.</w:t>
-      </w:r>
-    </w:p>
-    <w:p>
-      <w:pPr>
-        <w:pStyle w:val="BodyText"/>
-      </w:pPr>
-      <w:r>
-        <w:t xml:space="preserve">Jésus n’est pas seulement un homme bon qui a enseigné de belles choses. Il est le seul qui soit allé dans la mort et en soit ressorti vivant, par sa propre puissance. C’est pour cela qu’il peut dire ce qu’aucun homme n’a jamais pu dire :</w:t>
-      </w:r>
-    </w:p>
-    <w:p>
-      <w:pPr>
-        <w:pStyle w:val="BlockText"/>
-      </w:pPr>
-      <w:r>
-        <w:t xml:space="preserve">« Je suis la résurrection et la vie.</w:t>
-      </w:r>
-      <w:r>
-        <w:t xml:space="preserve"> </w:t>
-      </w:r>
-      <w:r>
-        <w:t xml:space="preserve">Celui qui croit en moi vivra, quand même il serait mort ;</w:t>
-      </w:r>
-      <w:r>
-        <w:t xml:space="preserve"> </w:t>
-      </w:r>
-      <w:r>
-        <w:t xml:space="preserve">et quiconque vit et croit en moi ne mourra jamais.</w:t>
-      </w:r>
-      <w:r>
-        <w:t xml:space="preserve"> </w:t>
-      </w:r>
-      <w:r>
-        <w:t xml:space="preserve">Crois-tu cela ? »</w:t>
-      </w:r>
-    </w:p>
-    <w:p>
-      <w:pPr>
-        <w:pStyle w:val="BlockText"/>
-      </w:pPr>
-      <w:r>
-        <w:t xml:space="preserve">— Jean 11.25-26</w:t>
+        <w:t xml:space="preserve">Mon enfant, je ne veux pas que tu croies qu’il ne faut pas pleurer.</w:t>
+      </w:r>
+    </w:p>
+    <w:p>
+      <w:pPr>
+        <w:pStyle w:val="BodyText"/>
+      </w:pPr>
+      <w:r>
+        <w:t xml:space="preserve">Il y a des gens qui disent aux endeuillés : « Ne pleure pas, il faut être fort. » Moi, je te dis : pleure. Pleure autant que ton cœur en a besoin. Les larmes ne sont pas un manque de foi. Elles sont le prix de l’amour.</w:t>
+      </w:r>
+    </w:p>
+    <w:p>
+      <w:pPr>
+        <w:pStyle w:val="BodyText"/>
+      </w:pPr>
+      <w:r>
+        <w:t xml:space="preserve">Quand Jésus est arrivé devant le tombeau de son ami Lazare, il savait qu’il allait le ressusciter quelques minutes plus tard. Et pourtant, la Bible dit, en deux mots seulement :</w:t>
+      </w:r>
+    </w:p>
+    <w:p>
+      <w:pPr>
+        <w:pStyle w:val="BlockText"/>
+      </w:pPr>
+      <w:r>
+        <w:t xml:space="preserve">« Jésus pleura. »</w:t>
+      </w:r>
+    </w:p>
+    <w:p>
+      <w:pPr>
+        <w:pStyle w:val="BlockText"/>
+      </w:pPr>
+      <w:r>
+        <w:t xml:space="preserve">— Jean 11.35</w:t>
       </w:r>
     </w:p>
     <w:p>
@@ -1523,15 +1627,88 @@
         <w:pStyle w:val="FirstParagraph"/>
       </w:pPr>
       <w:r>
-        <w:t xml:space="preserve">« Crois-tu cela ? » Cette question, mon enfant, Jésus l’a posée à Marthe, une femme en deuil, devant le tombeau de son frère. Aujourd’hui, il te la pose à toi, devant la tombe de ton bien-aimé.</w:t>
-      </w:r>
-    </w:p>
-    <w:p>
-      <w:pPr>
-        <w:pStyle w:val="BodyText"/>
-      </w:pPr>
-      <w:r>
-        <w:t xml:space="preserve">Voici le plus grand des paradoxes, celui qui renverse tous les autres :</w:t>
+        <w:t xml:space="preserve">Le Fils de Dieu a pleuré devant la tombe d’un ami. Alors tu as le droit de pleurer devant celle de ton père, de ta mère, de ton enfant, de ton ami. Dieu ne méprise pas tes larmes. Il les recueille.</w:t>
+      </w:r>
+    </w:p>
+    <w:p>
+      <w:pPr>
+        <w:pStyle w:val="BlockText"/>
+      </w:pPr>
+      <w:r>
+        <w:t xml:space="preserve">« L’Éternel est près de ceux qui ont le cœur brisé,</w:t>
+      </w:r>
+      <w:r>
+        <w:t xml:space="preserve"> </w:t>
+      </w:r>
+      <w:r>
+        <w:t xml:space="preserve">et il sauve ceux qui ont l’esprit dans l’abattement. »</w:t>
+      </w:r>
+    </w:p>
+    <w:p>
+      <w:pPr>
+        <w:pStyle w:val="BlockText"/>
+      </w:pPr>
+      <w:r>
+        <w:t xml:space="preserve">— Psaume 34.19</w:t>
+      </w:r>
+    </w:p>
+    <w:p>
+      <w:pPr>
+        <w:pStyle w:val="FirstParagraph"/>
+      </w:pPr>
+      <w:r>
+        <w:t xml:space="preserve">Mais écoute bien la suite, car c’est ici que tout change. L’apôtre Paul écrit aux chrétiens qui avaient perdu des proches :</w:t>
+      </w:r>
+    </w:p>
+    <w:p>
+      <w:pPr>
+        <w:pStyle w:val="BlockText"/>
+      </w:pPr>
+      <w:r>
+        <w:t xml:space="preserve">« Nous ne voulons pas, frères, que vous soyez dans l’ignorance au sujet de ceux qui dorment,</w:t>
+      </w:r>
+      <w:r>
+        <w:t xml:space="preserve"> </w:t>
+      </w:r>
+      <w:r>
+        <w:t xml:space="preserve">afin que vous ne vous affligiez pas comme les autres qui n’ont point d’espérance. »</w:t>
+      </w:r>
+    </w:p>
+    <w:p>
+      <w:pPr>
+        <w:pStyle w:val="BlockText"/>
+      </w:pPr>
+      <w:r>
+        <w:t xml:space="preserve">— 1 Thessaloniciens 4.13</w:t>
+      </w:r>
+    </w:p>
+    <w:p>
+      <w:pPr>
+        <w:pStyle w:val="FirstParagraph"/>
+      </w:pPr>
+      <w:r>
+        <w:t xml:space="preserve">Remarque bien, mon enfant : Paul ne dit pas « ne vous affligez pas ». Il dit « ne vous affligez pas</w:t>
+      </w:r>
+      <w:r>
+        <w:t xml:space="preserve"> </w:t>
+      </w:r>
+      <w:r>
+        <w:rPr>
+          <w:iCs/>
+          <w:i/>
+        </w:rPr>
+        <w:t xml:space="preserve">comme ceux qui n’ont point d’espérance</w:t>
+      </w:r>
+      <w:r>
+        <w:t xml:space="preserve"> ». Il y a deux sortes de larmes au bord d’une tombe : les larmes sans espoir, et les larmes avec espoir. Les unes disent « adieu ». Les autres disent « au revoir ».</w:t>
+      </w:r>
+    </w:p>
+    <w:p>
+      <w:pPr>
+        <w:pStyle w:val="BodyText"/>
+      </w:pPr>
+      <w:r>
+        <w:t xml:space="preserve">Toute la différence entre les deux porte un nom :</w:t>
       </w:r>
       <w:r>
         <w:t xml:space="preserve"> </w:t>
@@ -1541,73 +1718,7 @@
           <w:bCs/>
           <w:b/>
         </w:rPr>
-        <w:t xml:space="preserve">par sa mort, Jésus a tué la mort.</w:t>
-      </w:r>
-      <w:r>
-        <w:t xml:space="preserve"> </w:t>
-      </w:r>
-      <w:r>
-        <w:t xml:space="preserve">Il est entré dans la solitude de la tombe pour qu’aucun de ceux qui croient en lui n’y reste seul. Il a été dépouillé de tout sur la croix, plus nu que Job, pour nous revêtir de sa justice. Il a été abandonné, pour que nous ne soyons jamais abandonnés.</w:t>
-      </w:r>
-    </w:p>
-    <w:p>
-      <w:pPr>
-        <w:pStyle w:val="BodyText"/>
-      </w:pPr>
-      <w:r>
-        <w:t xml:space="preserve">C’est pourquoi l’apôtre Paul, qui savait qu’il allait mourir, pouvait se moquer de la mort :</w:t>
-      </w:r>
-    </w:p>
-    <w:p>
-      <w:pPr>
-        <w:pStyle w:val="BlockText"/>
-      </w:pPr>
-      <w:r>
-        <w:t xml:space="preserve">« Ô mort, où est ta victoire ? Ô mort, où est ton aiguillon ? »</w:t>
-      </w:r>
-    </w:p>
-    <w:p>
-      <w:pPr>
-        <w:pStyle w:val="BlockText"/>
-      </w:pPr>
-      <w:r>
-        <w:t xml:space="preserve">— 1 Corinthiens 15.55</w:t>
-      </w:r>
-    </w:p>
-    <w:p>
-      <w:pPr>
-        <w:pStyle w:val="FirstParagraph"/>
-      </w:pPr>
-      <w:r>
-        <w:t xml:space="preserve">Le cercueil n’est pas le dernier mot. La tombe n’est pas le dernier mot. Pour celui qui appartient à Jésus, la mort n’est plus un mur : elle est une porte.</w:t>
-      </w:r>
-    </w:p>
-    <w:p>
-      <w:pPr>
-        <w:pStyle w:val="BlockText"/>
-      </w:pPr>
-      <w:r>
-        <w:t xml:space="preserve">« Il essuiera toute larme de leurs yeux, et la mort ne sera plus,</w:t>
-      </w:r>
-      <w:r>
-        <w:t xml:space="preserve"> </w:t>
-      </w:r>
-      <w:r>
-        <w:t xml:space="preserve">et il n’y aura plus ni deuil, ni cri, ni douleur,</w:t>
-      </w:r>
-      <w:r>
-        <w:t xml:space="preserve"> </w:t>
-      </w:r>
-      <w:r>
-        <w:t xml:space="preserve">car les premières choses ont disparu. »</w:t>
-      </w:r>
-    </w:p>
-    <w:p>
-      <w:pPr>
-        <w:pStyle w:val="BlockText"/>
-      </w:pPr>
-      <w:r>
-        <w:t xml:space="preserve">— Apocalypse 21.4</w:t>
+        <w:t xml:space="preserve">Jésus-Christ.</w:t>
       </w:r>
     </w:p>
     <w:p>
@@ -1617,14 +1728,14 @@
         </w:pict>
       </w:r>
     </w:p>
-    <w:bookmarkEnd w:id="29"/>
-    <w:bookmarkStart w:id="30" w:name="un-seul-chemin"/>
+    <w:bookmarkEnd w:id="33"/>
+    <w:bookmarkStart w:id="34" w:name="celui-qui-a-vaincu-la-mort"/>
     <w:p>
       <w:pPr>
         <w:pStyle w:val="Heading2"/>
       </w:pPr>
       <w:r>
-        <w:t xml:space="preserve">9. Un seul chemin</w:t>
+        <w:t xml:space="preserve">9. Celui qui a vaincu la mort</w:t>
       </w:r>
     </w:p>
     <w:p>
@@ -1632,39 +1743,65 @@
         <w:pStyle w:val="FirstParagraph"/>
       </w:pPr>
       <w:r>
-        <w:t xml:space="preserve">Mon enfant, je dois maintenant te parler avec franchise, comme un père qui aime trop son enfant pour lui mentir.</w:t>
-      </w:r>
-    </w:p>
-    <w:p>
-      <w:pPr>
-        <w:pStyle w:val="BodyText"/>
-      </w:pPr>
-      <w:r>
-        <w:t xml:space="preserve">Beaucoup de gens pensent que tous les chemins mènent à Dieu. Qu’il suffit d’être une bonne personne, d’aller de temps en temps à l’église, de donner aux pauvres, de ne pas faire trop de mal. Qu’à la fin, Dieu pèsera nos bonnes et nos mauvaises actions sur une balance.</w:t>
-      </w:r>
-    </w:p>
-    <w:p>
-      <w:pPr>
-        <w:pStyle w:val="BodyText"/>
-      </w:pPr>
-      <w:r>
-        <w:t xml:space="preserve">Mais la Bible dit autre chose. Elle dit que nous avons tous péché.</w:t>
-      </w:r>
-    </w:p>
-    <w:p>
-      <w:pPr>
-        <w:pStyle w:val="BlockText"/>
-      </w:pPr>
-      <w:r>
-        <w:t xml:space="preserve">« Car tous ont péché et sont privés de la gloire de Dieu. »</w:t>
-      </w:r>
-    </w:p>
-    <w:p>
-      <w:pPr>
-        <w:pStyle w:val="BlockText"/>
-      </w:pPr>
-      <w:r>
-        <w:t xml:space="preserve">— Romains 3.23</w:t>
+        <w:t xml:space="preserve">Depuis le commencement du monde, tous les hommes sont morts. Les rois et les mendiants, les savants et les ignorants, les saints et les méchants. Les plus grands fondateurs de religions, les plus grands philosophes, les plus grands chefs : tous sont dans leur tombe, et leur tombe est encore occupée.</w:t>
+      </w:r>
+    </w:p>
+    <w:p>
+      <w:pPr>
+        <w:pStyle w:val="BodyText"/>
+      </w:pPr>
+      <w:r>
+        <w:t xml:space="preserve">Sauf une.</w:t>
+      </w:r>
+    </w:p>
+    <w:p>
+      <w:pPr>
+        <w:pStyle w:val="BodyText"/>
+      </w:pPr>
+      <w:r>
+        <w:t xml:space="preserve">Il y a, à Jérusalem, un tombeau vide. Celui d’un homme qui avait annoncé : « Je mourrai, et le troisième jour je ressusciterai. » On l’a cloué sur une croix. On l’a mis au tombeau. On a roulé une grosse pierre devant l’entrée. On a placé des soldats pour la garder. Et le troisième jour, le tombeau était vide.</w:t>
+      </w:r>
+    </w:p>
+    <w:p>
+      <w:pPr>
+        <w:pStyle w:val="BodyText"/>
+      </w:pPr>
+      <w:r>
+        <w:t xml:space="preserve">Jésus n’est pas seulement un homme bon qui a enseigné de belles choses. Il est le seul qui soit allé dans la mort et en soit ressorti vivant, par sa propre puissance. C’est pour cela qu’il peut dire ce qu’aucun homme n’a jamais pu dire :</w:t>
+      </w:r>
+    </w:p>
+    <w:p>
+      <w:pPr>
+        <w:pStyle w:val="BlockText"/>
+      </w:pPr>
+      <w:r>
+        <w:t xml:space="preserve">« Je suis la résurrection et la vie.</w:t>
+      </w:r>
+      <w:r>
+        <w:t xml:space="preserve"> </w:t>
+      </w:r>
+      <w:r>
+        <w:t xml:space="preserve">Celui qui croit en moi vivra, quand même il serait mort ;</w:t>
+      </w:r>
+      <w:r>
+        <w:t xml:space="preserve"> </w:t>
+      </w:r>
+      <w:r>
+        <w:t xml:space="preserve">et quiconque vit et croit en moi ne mourra jamais.</w:t>
+      </w:r>
+      <w:r>
+        <w:t xml:space="preserve"> </w:t>
+      </w:r>
+      <w:r>
+        <w:t xml:space="preserve">Crois-tu cela ? »</w:t>
+      </w:r>
+    </w:p>
+    <w:p>
+      <w:pPr>
+        <w:pStyle w:val="BlockText"/>
+      </w:pPr>
+      <w:r>
+        <w:t xml:space="preserve">— Jean 11.25-26</w:t>
       </w:r>
     </w:p>
     <w:p>
@@ -1672,168 +1809,15 @@
         <w:pStyle w:val="FirstParagraph"/>
       </w:pPr>
       <w:r>
-        <w:t xml:space="preserve">Et que le salaire de ce péché, c’est la mort, la séparation d’avec Dieu, pour toujours. Aucune bonne œuvre ne peut effacer cette dette, de même qu’un prisonnier ne peut effacer son crime en balayant sa cellule. Il fallait que quelqu’un paie à notre place. Quelqu’un de parfait. Et ce quelqu’un, c’est Jésus.</w:t>
-      </w:r>
-    </w:p>
-    <w:p>
-      <w:pPr>
-        <w:pStyle w:val="BlockText"/>
-      </w:pPr>
-      <w:r>
-        <w:t xml:space="preserve">« Car le salaire du péché, c’est la mort ;</w:t>
-      </w:r>
-      <w:r>
-        <w:t xml:space="preserve"> </w:t>
-      </w:r>
-      <w:r>
-        <w:t xml:space="preserve">mais le don gratuit de Dieu, c’est la vie éternelle en Jésus-Christ notre Seigneur. »</w:t>
-      </w:r>
-    </w:p>
-    <w:p>
-      <w:pPr>
-        <w:pStyle w:val="BlockText"/>
-      </w:pPr>
-      <w:r>
-        <w:t xml:space="preserve">— Romains 6.23</w:t>
-      </w:r>
-    </w:p>
-    <w:p>
-      <w:pPr>
-        <w:pStyle w:val="FirstParagraph"/>
-      </w:pPr>
-      <w:r>
-        <w:t xml:space="preserve">C’est un</w:t>
-      </w:r>
-      <w:r>
-        <w:t xml:space="preserve"> </w:t>
-      </w:r>
-      <w:r>
-        <w:rPr>
-          <w:iCs/>
-          <w:i/>
-        </w:rPr>
-        <w:t xml:space="preserve">don</w:t>
-      </w:r>
-      <w:r>
-        <w:t xml:space="preserve">, mon enfant. Gratuit. On ne l’achète pas, on ne le mérite pas, on ne le gagne pas. On le reçoit.</w:t>
-      </w:r>
-    </w:p>
-    <w:p>
-      <w:pPr>
-        <w:pStyle w:val="BlockText"/>
-      </w:pPr>
-      <w:r>
-        <w:t xml:space="preserve">« Car c’est par la grâce que vous êtes sauvés, par le moyen de la foi.</w:t>
-      </w:r>
-      <w:r>
-        <w:t xml:space="preserve"> </w:t>
-      </w:r>
-      <w:r>
-        <w:t xml:space="preserve">Et cela ne vient pas de vous, c’est le don de Dieu.</w:t>
-      </w:r>
-      <w:r>
-        <w:t xml:space="preserve"> </w:t>
-      </w:r>
-      <w:r>
-        <w:t xml:space="preserve">Ce n’est point par les œuvres, afin que personne ne se glorifie. »</w:t>
-      </w:r>
-    </w:p>
-    <w:p>
-      <w:pPr>
-        <w:pStyle w:val="BlockText"/>
-      </w:pPr>
-      <w:r>
-        <w:t xml:space="preserve">— Éphésiens 2.8-9</w:t>
-      </w:r>
-    </w:p>
-    <w:p>
-      <w:pPr>
-        <w:pStyle w:val="FirstParagraph"/>
-      </w:pPr>
-      <w:r>
-        <w:t xml:space="preserve">Et ce don n’a qu’une seule porte. Jésus ne s’est pas présenté comme</w:t>
-      </w:r>
-      <w:r>
-        <w:t xml:space="preserve"> </w:t>
-      </w:r>
-      <w:r>
-        <w:rPr>
-          <w:iCs/>
-          <w:i/>
-        </w:rPr>
-        <w:t xml:space="preserve">un</w:t>
-      </w:r>
-      <w:r>
-        <w:t xml:space="preserve"> </w:t>
-      </w:r>
-      <w:r>
-        <w:t xml:space="preserve">chemin parmi d’autres. Il a dit :</w:t>
-      </w:r>
-    </w:p>
-    <w:p>
-      <w:pPr>
-        <w:pStyle w:val="BlockText"/>
-      </w:pPr>
-      <w:r>
-        <w:t xml:space="preserve">« Je suis le chemin, la vérité, et la vie.</w:t>
-      </w:r>
-      <w:r>
-        <w:t xml:space="preserve"> </w:t>
-      </w:r>
-      <w:r>
-        <w:t xml:space="preserve">Nul ne vient au Père que par moi. »</w:t>
-      </w:r>
-    </w:p>
-    <w:p>
-      <w:pPr>
-        <w:pStyle w:val="BlockText"/>
-      </w:pPr>
-      <w:r>
-        <w:t xml:space="preserve">— Jean 14.6</w:t>
-      </w:r>
-    </w:p>
-    <w:p>
-      <w:pPr>
-        <w:pStyle w:val="FirstParagraph"/>
-      </w:pPr>
-      <w:r>
-        <w:t xml:space="preserve">Et ses apôtres ont proclamé :</w:t>
-      </w:r>
-    </w:p>
-    <w:p>
-      <w:pPr>
-        <w:pStyle w:val="BlockText"/>
-      </w:pPr>
-      <w:r>
-        <w:t xml:space="preserve">« Il n’y a de salut en aucun autre ;</w:t>
-      </w:r>
-      <w:r>
-        <w:t xml:space="preserve"> </w:t>
-      </w:r>
-      <w:r>
-        <w:t xml:space="preserve">car il n’y a sous le ciel aucun autre nom qui ait été donné parmi les hommes,</w:t>
-      </w:r>
-      <w:r>
-        <w:t xml:space="preserve"> </w:t>
-      </w:r>
-      <w:r>
-        <w:t xml:space="preserve">par lequel nous devions être sauvés. »</w:t>
-      </w:r>
-    </w:p>
-    <w:p>
-      <w:pPr>
-        <w:pStyle w:val="BlockText"/>
-      </w:pPr>
-      <w:r>
-        <w:t xml:space="preserve">— Actes 4.12</w:t>
-      </w:r>
-    </w:p>
-    <w:p>
-      <w:pPr>
-        <w:pStyle w:val="FirstParagraph"/>
-      </w:pPr>
-      <w:r>
-        <w:t xml:space="preserve">Ni la tradition, ni la religion de nos parents, ni les sacrifices, ni les bonnes œuvres, ni les protections que l’on achète ne peuvent sauver une âme.</w:t>
+        <w:t xml:space="preserve">« Crois-tu cela ? » Cette question, mon enfant, Jésus l’a posée à Marthe, une femme en deuil, devant le tombeau de son frère. Aujourd’hui, il te la pose à toi, devant la tombe de ton bien-aimé.</w:t>
+      </w:r>
+    </w:p>
+    <w:p>
+      <w:pPr>
+        <w:pStyle w:val="BodyText"/>
+      </w:pPr>
+      <w:r>
+        <w:t xml:space="preserve">Voici le plus grand des paradoxes, celui qui renverse tous les autres :</w:t>
       </w:r>
       <w:r>
         <w:t xml:space="preserve"> </w:t>
@@ -1843,43 +1827,73 @@
           <w:bCs/>
           <w:b/>
         </w:rPr>
-        <w:t xml:space="preserve">Jésus-Christ seul.</w:t>
-      </w:r>
-    </w:p>
-    <w:p>
-      <w:pPr>
-        <w:pStyle w:val="BodyText"/>
-      </w:pPr>
-      <w:r>
-        <w:t xml:space="preserve">Ce n’est pas une parole dure, mon enfant. C’est une parole d’amour. Si ta maison brûlait et qu’il n’y avait qu’une seule porte de sortie, je ne te dirais pas : « Choisis la sortie que tu préfères. » Je te crierais : « Par ici ! Il n’y a que cette porte ! » C’est ce que je fais avec ce livre.</w:t>
-      </w:r>
-    </w:p>
-    <w:p>
-      <w:pPr>
-        <w:pStyle w:val="BlockText"/>
-      </w:pPr>
-      <w:r>
-        <w:t xml:space="preserve">« Car Dieu a tant aimé le monde qu’il a donné son Fils unique,</w:t>
-      </w:r>
-      <w:r>
-        <w:t xml:space="preserve"> </w:t>
-      </w:r>
-      <w:r>
-        <w:t xml:space="preserve">afin que quiconque croit en lui ne périsse point,</w:t>
-      </w:r>
-      <w:r>
-        <w:t xml:space="preserve"> </w:t>
-      </w:r>
-      <w:r>
-        <w:t xml:space="preserve">mais qu’il ait la vie éternelle. »</w:t>
-      </w:r>
-    </w:p>
-    <w:p>
-      <w:pPr>
-        <w:pStyle w:val="BlockText"/>
-      </w:pPr>
-      <w:r>
-        <w:t xml:space="preserve">— Jean 3.16</w:t>
+        <w:t xml:space="preserve">par sa mort, Jésus a tué la mort.</w:t>
+      </w:r>
+      <w:r>
+        <w:t xml:space="preserve"> </w:t>
+      </w:r>
+      <w:r>
+        <w:t xml:space="preserve">Il est entré dans la solitude de la tombe pour qu’aucun de ceux qui croient en lui n’y reste seul. Il a été dépouillé de tout sur la croix, plus nu que Job, pour nous revêtir de sa justice. Il a été abandonné, pour que nous ne soyons jamais abandonnés.</w:t>
+      </w:r>
+    </w:p>
+    <w:p>
+      <w:pPr>
+        <w:pStyle w:val="BodyText"/>
+      </w:pPr>
+      <w:r>
+        <w:t xml:space="preserve">C’est pourquoi l’apôtre Paul, qui savait qu’il allait mourir, pouvait se moquer de la mort :</w:t>
+      </w:r>
+    </w:p>
+    <w:p>
+      <w:pPr>
+        <w:pStyle w:val="BlockText"/>
+      </w:pPr>
+      <w:r>
+        <w:t xml:space="preserve">« Ô mort, où est ta victoire ? Ô mort, où est ton aiguillon ? »</w:t>
+      </w:r>
+    </w:p>
+    <w:p>
+      <w:pPr>
+        <w:pStyle w:val="BlockText"/>
+      </w:pPr>
+      <w:r>
+        <w:t xml:space="preserve">— 1 Corinthiens 15.55</w:t>
+      </w:r>
+    </w:p>
+    <w:p>
+      <w:pPr>
+        <w:pStyle w:val="FirstParagraph"/>
+      </w:pPr>
+      <w:r>
+        <w:t xml:space="preserve">Le cercueil n’est pas le dernier mot. La tombe n’est pas le dernier mot. Pour celui qui appartient à Jésus, la mort n’est plus un mur : elle est une porte.</w:t>
+      </w:r>
+    </w:p>
+    <w:p>
+      <w:pPr>
+        <w:pStyle w:val="BlockText"/>
+      </w:pPr>
+      <w:r>
+        <w:t xml:space="preserve">« Il essuiera toute larme de leurs yeux, et la mort ne sera plus,</w:t>
+      </w:r>
+      <w:r>
+        <w:t xml:space="preserve"> </w:t>
+      </w:r>
+      <w:r>
+        <w:t xml:space="preserve">et il n’y aura plus ni deuil, ni cri, ni douleur,</w:t>
+      </w:r>
+      <w:r>
+        <w:t xml:space="preserve"> </w:t>
+      </w:r>
+      <w:r>
+        <w:t xml:space="preserve">car les premières choses ont disparu. »</w:t>
+      </w:r>
+    </w:p>
+    <w:p>
+      <w:pPr>
+        <w:pStyle w:val="BlockText"/>
+      </w:pPr>
+      <w:r>
+        <w:t xml:space="preserve">— Apocalypse 21.4</w:t>
       </w:r>
     </w:p>
     <w:p>
@@ -1889,14 +1903,286 @@
         </w:pict>
       </w:r>
     </w:p>
-    <w:bookmarkEnd w:id="30"/>
-    <w:bookmarkStart w:id="31" w:name="aujourdhui"/>
+    <w:bookmarkEnd w:id="34"/>
+    <w:bookmarkStart w:id="35" w:name="un-seul-chemin"/>
     <w:p>
       <w:pPr>
         <w:pStyle w:val="Heading2"/>
       </w:pPr>
       <w:r>
-        <w:t xml:space="preserve">10. Aujourd’hui</w:t>
+        <w:t xml:space="preserve">10. Un seul chemin</w:t>
+      </w:r>
+    </w:p>
+    <w:p>
+      <w:pPr>
+        <w:pStyle w:val="FirstParagraph"/>
+      </w:pPr>
+      <w:r>
+        <w:t xml:space="preserve">Mon enfant, je dois maintenant te parler avec franchise, comme un père qui aime trop son enfant pour lui mentir.</w:t>
+      </w:r>
+    </w:p>
+    <w:p>
+      <w:pPr>
+        <w:pStyle w:val="BodyText"/>
+      </w:pPr>
+      <w:r>
+        <w:t xml:space="preserve">Beaucoup de gens pensent que tous les chemins mènent à Dieu. Qu’il suffit d’être une bonne personne, d’aller de temps en temps à l’église, de donner aux pauvres, de ne pas faire trop de mal. Qu’à la fin, Dieu pèsera nos bonnes et nos mauvaises actions sur une balance.</w:t>
+      </w:r>
+    </w:p>
+    <w:p>
+      <w:pPr>
+        <w:pStyle w:val="BodyText"/>
+      </w:pPr>
+      <w:r>
+        <w:t xml:space="preserve">Mais la Bible dit autre chose. Elle dit que nous avons tous péché.</w:t>
+      </w:r>
+    </w:p>
+    <w:p>
+      <w:pPr>
+        <w:pStyle w:val="BlockText"/>
+      </w:pPr>
+      <w:r>
+        <w:t xml:space="preserve">« Car tous ont péché et sont privés de la gloire de Dieu. »</w:t>
+      </w:r>
+    </w:p>
+    <w:p>
+      <w:pPr>
+        <w:pStyle w:val="BlockText"/>
+      </w:pPr>
+      <w:r>
+        <w:t xml:space="preserve">— Romains 3.23</w:t>
+      </w:r>
+    </w:p>
+    <w:p>
+      <w:pPr>
+        <w:pStyle w:val="FirstParagraph"/>
+      </w:pPr>
+      <w:r>
+        <w:t xml:space="preserve">Et que le salaire de ce péché, c’est la mort, la séparation d’avec Dieu, pour toujours. Aucune bonne œuvre ne peut effacer cette dette, de même qu’un prisonnier ne peut effacer son crime en balayant sa cellule. Il fallait que quelqu’un paie à notre place. Quelqu’un de parfait. Et ce quelqu’un, c’est Jésus.</w:t>
+      </w:r>
+    </w:p>
+    <w:p>
+      <w:pPr>
+        <w:pStyle w:val="BlockText"/>
+      </w:pPr>
+      <w:r>
+        <w:t xml:space="preserve">« Car le salaire du péché, c’est la mort ;</w:t>
+      </w:r>
+      <w:r>
+        <w:t xml:space="preserve"> </w:t>
+      </w:r>
+      <w:r>
+        <w:t xml:space="preserve">mais le don gratuit de Dieu, c’est la vie éternelle en Jésus-Christ notre Seigneur. »</w:t>
+      </w:r>
+    </w:p>
+    <w:p>
+      <w:pPr>
+        <w:pStyle w:val="BlockText"/>
+      </w:pPr>
+      <w:r>
+        <w:t xml:space="preserve">— Romains 6.23</w:t>
+      </w:r>
+    </w:p>
+    <w:p>
+      <w:pPr>
+        <w:pStyle w:val="FirstParagraph"/>
+      </w:pPr>
+      <w:r>
+        <w:t xml:space="preserve">C’est un</w:t>
+      </w:r>
+      <w:r>
+        <w:t xml:space="preserve"> </w:t>
+      </w:r>
+      <w:r>
+        <w:rPr>
+          <w:iCs/>
+          <w:i/>
+        </w:rPr>
+        <w:t xml:space="preserve">don</w:t>
+      </w:r>
+      <w:r>
+        <w:t xml:space="preserve">, mon enfant. Gratuit. On ne l’achète pas, on ne le mérite pas, on ne le gagne pas. On le reçoit.</w:t>
+      </w:r>
+    </w:p>
+    <w:p>
+      <w:pPr>
+        <w:pStyle w:val="BlockText"/>
+      </w:pPr>
+      <w:r>
+        <w:t xml:space="preserve">« Car c’est par la grâce que vous êtes sauvés, par le moyen de la foi.</w:t>
+      </w:r>
+      <w:r>
+        <w:t xml:space="preserve"> </w:t>
+      </w:r>
+      <w:r>
+        <w:t xml:space="preserve">Et cela ne vient pas de vous, c’est le don de Dieu.</w:t>
+      </w:r>
+      <w:r>
+        <w:t xml:space="preserve"> </w:t>
+      </w:r>
+      <w:r>
+        <w:t xml:space="preserve">Ce n’est point par les œuvres, afin que personne ne se glorifie. »</w:t>
+      </w:r>
+    </w:p>
+    <w:p>
+      <w:pPr>
+        <w:pStyle w:val="BlockText"/>
+      </w:pPr>
+      <w:r>
+        <w:t xml:space="preserve">— Éphésiens 2.8-9</w:t>
+      </w:r>
+    </w:p>
+    <w:p>
+      <w:pPr>
+        <w:pStyle w:val="FirstParagraph"/>
+      </w:pPr>
+      <w:r>
+        <w:t xml:space="preserve">Et ce don n’a qu’une seule porte. Jésus ne s’est pas présenté comme</w:t>
+      </w:r>
+      <w:r>
+        <w:t xml:space="preserve"> </w:t>
+      </w:r>
+      <w:r>
+        <w:rPr>
+          <w:iCs/>
+          <w:i/>
+        </w:rPr>
+        <w:t xml:space="preserve">un</w:t>
+      </w:r>
+      <w:r>
+        <w:t xml:space="preserve"> </w:t>
+      </w:r>
+      <w:r>
+        <w:t xml:space="preserve">chemin parmi d’autres. Il a dit :</w:t>
+      </w:r>
+    </w:p>
+    <w:p>
+      <w:pPr>
+        <w:pStyle w:val="BlockText"/>
+      </w:pPr>
+      <w:r>
+        <w:t xml:space="preserve">« Je suis le chemin, la vérité, et la vie.</w:t>
+      </w:r>
+      <w:r>
+        <w:t xml:space="preserve"> </w:t>
+      </w:r>
+      <w:r>
+        <w:t xml:space="preserve">Nul ne vient au Père que par moi. »</w:t>
+      </w:r>
+    </w:p>
+    <w:p>
+      <w:pPr>
+        <w:pStyle w:val="BlockText"/>
+      </w:pPr>
+      <w:r>
+        <w:t xml:space="preserve">— Jean 14.6</w:t>
+      </w:r>
+    </w:p>
+    <w:p>
+      <w:pPr>
+        <w:pStyle w:val="FirstParagraph"/>
+      </w:pPr>
+      <w:r>
+        <w:t xml:space="preserve">Et ses apôtres ont proclamé :</w:t>
+      </w:r>
+    </w:p>
+    <w:p>
+      <w:pPr>
+        <w:pStyle w:val="BlockText"/>
+      </w:pPr>
+      <w:r>
+        <w:t xml:space="preserve">« Il n’y a de salut en aucun autre ;</w:t>
+      </w:r>
+      <w:r>
+        <w:t xml:space="preserve"> </w:t>
+      </w:r>
+      <w:r>
+        <w:t xml:space="preserve">car il n’y a sous le ciel aucun autre nom qui ait été donné parmi les hommes,</w:t>
+      </w:r>
+      <w:r>
+        <w:t xml:space="preserve"> </w:t>
+      </w:r>
+      <w:r>
+        <w:t xml:space="preserve">par lequel nous devions être sauvés. »</w:t>
+      </w:r>
+    </w:p>
+    <w:p>
+      <w:pPr>
+        <w:pStyle w:val="BlockText"/>
+      </w:pPr>
+      <w:r>
+        <w:t xml:space="preserve">— Actes 4.12</w:t>
+      </w:r>
+    </w:p>
+    <w:p>
+      <w:pPr>
+        <w:pStyle w:val="FirstParagraph"/>
+      </w:pPr>
+      <w:r>
+        <w:t xml:space="preserve">Ni la tradition, ni la religion de nos parents, ni les sacrifices, ni les bonnes œuvres, ni les protections que l’on achète ne peuvent sauver une âme.</w:t>
+      </w:r>
+      <w:r>
+        <w:t xml:space="preserve"> </w:t>
+      </w:r>
+      <w:r>
+        <w:rPr>
+          <w:bCs/>
+          <w:b/>
+        </w:rPr>
+        <w:t xml:space="preserve">Jésus-Christ seul.</w:t>
+      </w:r>
+    </w:p>
+    <w:p>
+      <w:pPr>
+        <w:pStyle w:val="BodyText"/>
+      </w:pPr>
+      <w:r>
+        <w:t xml:space="preserve">Ce n’est pas une parole dure, mon enfant. C’est une parole d’amour. Si ta maison brûlait et qu’il n’y avait qu’une seule porte de sortie, je ne te dirais pas : « Choisis la sortie que tu préfères. » Je te crierais : « Par ici ! Il n’y a que cette porte ! » C’est ce que je fais avec ce livre.</w:t>
+      </w:r>
+    </w:p>
+    <w:p>
+      <w:pPr>
+        <w:pStyle w:val="BlockText"/>
+      </w:pPr>
+      <w:r>
+        <w:t xml:space="preserve">« Car Dieu a tant aimé le monde qu’il a donné son Fils unique,</w:t>
+      </w:r>
+      <w:r>
+        <w:t xml:space="preserve"> </w:t>
+      </w:r>
+      <w:r>
+        <w:t xml:space="preserve">afin que quiconque croit en lui ne périsse point,</w:t>
+      </w:r>
+      <w:r>
+        <w:t xml:space="preserve"> </w:t>
+      </w:r>
+      <w:r>
+        <w:t xml:space="preserve">mais qu’il ait la vie éternelle. »</w:t>
+      </w:r>
+    </w:p>
+    <w:p>
+      <w:pPr>
+        <w:pStyle w:val="BlockText"/>
+      </w:pPr>
+      <w:r>
+        <w:t xml:space="preserve">— Jean 3.16</w:t>
+      </w:r>
+    </w:p>
+    <w:p>
+      <w:r>
+        <w:pict>
+          <v:rect style="width:0;height:1.5pt" o:hralign="center" o:hrstd="t" o:hr="t"/>
+        </w:pict>
+      </w:r>
+    </w:p>
+    <w:bookmarkEnd w:id="35"/>
+    <w:bookmarkStart w:id="36" w:name="aujourdhui"/>
+    <w:p>
+      <w:pPr>
+        <w:pStyle w:val="Heading2"/>
+      </w:pPr>
+      <w:r>
+        <w:t xml:space="preserve">11. Aujourd’hui</w:t>
       </w:r>
     </w:p>
     <w:p>
@@ -2287,14 +2573,14 @@
         </w:pict>
       </w:r>
     </w:p>
-    <w:bookmarkEnd w:id="31"/>
-    <w:bookmarkStart w:id="32" w:name="vivre-en-comptant-ses-jours"/>
+    <w:bookmarkEnd w:id="36"/>
+    <w:bookmarkStart w:id="37" w:name="vivre-en-comptant-ses-jours"/>
     <w:p>
       <w:pPr>
         <w:pStyle w:val="Heading2"/>
       </w:pPr>
       <w:r>
-        <w:t xml:space="preserve">11. Vivre en comptant ses jours</w:t>
+        <w:t xml:space="preserve">12. Vivre en comptant ses jours</w:t>
       </w:r>
     </w:p>
     <w:p>
@@ -2442,8 +2728,8 @@
         </w:pict>
       </w:r>
     </w:p>
-    <w:bookmarkEnd w:id="32"/>
-    <w:bookmarkStart w:id="33" w:name="dernière-lettre-au-revoir-et-non-adieu"/>
+    <w:bookmarkEnd w:id="37"/>
+    <w:bookmarkStart w:id="38" w:name="dernière-lettre-au-revoir-et-non-adieu"/>
     <w:p>
       <w:pPr>
         <w:pStyle w:val="Heading2"/>
@@ -2531,7 +2817,7 @@
         <w:pStyle w:val="BodyText"/>
       </w:pPr>
       <w:r>
-        <w:t xml:space="preserve">Là-bas, il n’y aura plus de cercueil, plus de veillée, plus de séparation. Plus de chaise vide sur un banc d’école. Plus de téléphone qui sonne pour annoncer une mauvaise nouvelle. Plus de terre jetée sur un être aimé. Seulement la vie. Pour toujours.</w:t>
+        <w:t xml:space="preserve">Là-bas, il n’y aura plus de cercueil, plus de veillée, plus de séparation. Plus d’enfant qui part au marché et ne revient pas. Plus de maternité d’où l’on rentre les mains vides. Plus de route qui ne mène pas à destination. Plus de téléphone qui sonne pour annoncer une mauvaise nouvelle. Plus de terre jetée sur un être aimé. Seulement la vie. Pour toujours.</w:t>
       </w:r>
     </w:p>
     <w:p>
@@ -2549,8 +2835,8 @@
         </w:pict>
       </w:r>
     </w:p>
-    <w:bookmarkEnd w:id="33"/>
-    <w:bookmarkStart w:id="34" w:name="pour-les-jours-de-larmes"/>
+    <w:bookmarkEnd w:id="38"/>
+    <w:bookmarkStart w:id="39" w:name="pour-les-jours-de-larmes"/>
     <w:p>
       <w:pPr>
         <w:pStyle w:val="Heading2"/>
@@ -2617,14 +2903,6 @@
       </w:pPr>
       <w:r>
         <w:t xml:space="preserve">« L’herbe sèche, la fleur tombe ; mais la parole de notre Dieu subsiste éternellement. » — Ésaïe 40.8</w:t>
-      </w:r>
-    </w:p>
-    <w:p>
-      <w:pPr>
-        <w:pStyle w:val="BlockText"/>
-      </w:pPr>
-      <w:r>
-        <w:t xml:space="preserve">« Car Christ est ma vie, et la mort m’est un gain. » — Philippiens 1.21</w:t>
       </w:r>
     </w:p>
     <w:p>
@@ -2650,8 +2928,8 @@
         </w:pict>
       </w:r>
     </w:p>
-    <w:bookmarkEnd w:id="34"/>
-    <w:bookmarkStart w:id="35" w:name="prière-pour-ceux-qui-pleurent"/>
+    <w:bookmarkEnd w:id="39"/>
+    <w:bookmarkStart w:id="40" w:name="prière-pour-ceux-qui-pleurent"/>
     <w:p>
       <w:pPr>
         <w:pStyle w:val="Heading2"/>
@@ -2795,7 +3073,7 @@
         <w:t xml:space="preserve">Les citations bibliques sont tirées de la traduction Louis Segond.</w:t>
       </w:r>
     </w:p>
-    <w:bookmarkEnd w:id="35"/>
+    <w:bookmarkEnd w:id="40"/>
     <w:sectPr/>
   </w:body>
 </w:document>

</xml_diff>

<commit_message>
Livre : ajoute les portraits de William, Rachelle et du pasteur Koffi François
Co-Authored-By: Claude Opus 5.5 <noreply@anthropic.com>
Claude-Session: https://claude.ai/code/session_019iFqSFQpVw8JECnBZv2Kux
</commit_message>
<xml_diff>
--- a/livre/avant-que-l-horloge-ne-s-arrete.docx
+++ b/livre/avant-que-l-horloge-ne-s-arrete.docx
@@ -152,6 +152,20 @@
           <w:iCs/>
           <w:i/>
         </w:rPr>
+        <w:t xml:space="preserve">dont le sourire et l’intelligence me manquent encore,</w:t>
+      </w:r>
+      <w:r>
+        <w:rPr>
+          <w:iCs/>
+          <w:i/>
+        </w:rPr>
+        <w:t xml:space="preserve"> </w:t>
+      </w:r>
+      <w:r>
+        <w:rPr>
+          <w:iCs/>
+          <w:i/>
+        </w:rPr>
         <w:t xml:space="preserve">parti un samedi soir pour une simple course au marché.</w:t>
       </w:r>
     </w:p>
@@ -164,7 +178,7 @@
           <w:iCs/>
           <w:i/>
         </w:rPr>
-        <w:t xml:space="preserve">De ma tante Rachelle,</w:t>
+        <w:t xml:space="preserve">De ma tante Rachelle, ma grande sœur, ma seconde maman,</w:t>
       </w:r>
       <w:r>
         <w:rPr>
@@ -191,6 +205,20 @@
           <w:i/>
         </w:rPr>
         <w:t xml:space="preserve">Du pasteur Koffi François, mon beau-père,</w:t>
+      </w:r>
+      <w:r>
+        <w:rPr>
+          <w:iCs/>
+          <w:i/>
+        </w:rPr>
+        <w:t xml:space="preserve"> </w:t>
+      </w:r>
+      <w:r>
+        <w:rPr>
+          <w:iCs/>
+          <w:i/>
+        </w:rPr>
+        <w:t xml:space="preserve">homme calme et responsable, toujours présent pour ses enfants,</w:t>
       </w:r>
       <w:r>
         <w:rPr>
@@ -538,6 +566,14 @@
         <w:pStyle w:val="FirstParagraph"/>
       </w:pPr>
       <w:r>
+        <w:t xml:space="preserve">William, c’était un sourire. Un sourire qui arrivait avant lui, et une intelligence vive qui faisait de lui l’un des meilleurs d’entre nous. Aujourd’hui encore, des années plus tard, ce sourire et cette intelligence me manquent. Je les pleure comme au premier jour.</w:t>
+      </w:r>
+    </w:p>
+    <w:p>
+      <w:pPr>
+        <w:pStyle w:val="BodyText"/>
+      </w:pPr>
+      <w:r>
         <w:t xml:space="preserve">C’était un samedi. William et moi rentrions ensemble des cours de renforcement, chez notre maître de maison. Deux enfants sur le chemin du retour, comme tant d’autres samedis. Arrivés chez lui, sa maman l’a envoyé aussitôt au marché acheter des cubes Maggi pour la cuisine du soir. Il était 17 heures. Le ciel était lourd, nuageux, la pluie menaçait. Alors je ne l’ai pas accompagné : j’ai continué mon chemin jusque chez moi.</w:t>
       </w:r>
     </w:p>
@@ -614,7 +650,15 @@
         <w:pStyle w:val="FirstParagraph"/>
       </w:pPr>
       <w:r>
-        <w:t xml:space="preserve">Quelques années plus tard, j’étais en 6e-5e. Ma tante Rachelle, l’épouse de mon oncle, était venue chez nous, à Gagnoa, pour accoucher. C’était une joie dans la maison : un enfant allait naître.</w:t>
+        <w:t xml:space="preserve">Quelques années plus tard, j’étais en 6e-5e. Ma tante Rachelle était l’épouse de mon oncle. Mais pour moi, elle était bien plus qu’une parente par alliance : elle était ma grande sœur, ma seconde maman. Celle qui veillait sur moi, à qui je pouvais tout dire.</w:t>
+      </w:r>
+    </w:p>
+    <w:p>
+      <w:pPr>
+        <w:pStyle w:val="BodyText"/>
+      </w:pPr>
+      <w:r>
+        <w:t xml:space="preserve">Elle était venue chez nous, à Gagnoa, pour accoucher. C’était une joie dans la maison : un enfant allait naître.</w:t>
       </w:r>
     </w:p>
     <w:p>
@@ -672,7 +716,15 @@
         <w:pStyle w:val="FirstParagraph"/>
       </w:pPr>
       <w:r>
-        <w:t xml:space="preserve">Et cette année, le 10 août 2026, mon beau-père, le pasteur Koffi François, a pris la route pour se rendre à la pastorale. Il allait retrouver ses frères dans le ministère, prier, servir, se préparer pour l’œuvre de Dieu. Un voyage comme il en avait fait tant d’autres.</w:t>
+        <w:t xml:space="preserve">Mon beau-père, le pasteur Koffi François, était un homme calme et responsable. Il ne faisait pas de bruit, mais on pouvait compter sur lui. Il était toujours présent pour ses enfants : présent quand il fallait conseiller, présent quand il fallait soutenir, présent quand il fallait prier.</w:t>
+      </w:r>
+    </w:p>
+    <w:p>
+      <w:pPr>
+        <w:pStyle w:val="BodyText"/>
+      </w:pPr>
+      <w:r>
+        <w:t xml:space="preserve">Le 10 août 2026, il a pris la route pour se rendre à la pastorale. Il allait retrouver ses frères dans le ministère, prier, servir, se préparer pour l’œuvre de Dieu. Un voyage comme il en avait fait tant d’autres.</w:t>
       </w:r>
     </w:p>
     <w:p>
@@ -886,7 +938,7 @@
         <w:pStyle w:val="BodyText"/>
       </w:pPr>
       <w:r>
-        <w:t xml:space="preserve">Mon beau-père, le pasteur, aimait sa famille. Il voulait la voir grandir, la protéger encore. Mais un jour, il a dû la laisser. Non parce qu’il l’aimait moins, mais parce que l’homme n’a aucun pouvoir sur le jour de son départ.</w:t>
+        <w:t xml:space="preserve">Mon beau-père, le pasteur, aimait sa famille. Lui qui avait toujours été présent pour ses enfants voulait les voir grandir encore, les protéger encore. Mais un jour, il a dû les laisser, et pour la première fois, il n’a pas pu être là. Non parce qu’il l’aimait moins, mais parce que l’homme n’a aucun pouvoir sur le jour de son départ.</w:t>
       </w:r>
     </w:p>
     <w:p>

</xml_diff>

<commit_message>
Livre : l'enfant de Rachelle est vivant ; William et Rachelle étaient chrétiens
Co-Authored-By: Claude Opus 5.5 <noreply@anthropic.com>
Claude-Session: https://claude.ai/code/session_019iFqSFQpVw8JECnBZv2Kux
</commit_message>
<xml_diff>
--- a/livre/avant-que-l-horloge-ne-s-arrete.docx
+++ b/livre/avant-que-l-horloge-ne-s-arrete.docx
@@ -733,7 +733,15 @@
         <w:t xml:space="preserve"> </w:t>
       </w:r>
       <w:r>
-        <w:t xml:space="preserve">Le jour qui devait être celui de la joie est devenu celui du deuil.</w:t>
+        <w:t xml:space="preserve">Le même jour, une maison a accueilli un berceau et pleuré un cercueil.</w:t>
+      </w:r>
+    </w:p>
+    <w:p>
+      <w:pPr>
+        <w:pStyle w:val="BodyText"/>
+      </w:pPr>
+      <w:r>
+        <w:t xml:space="preserve">Et pourtant, la vie qu’elle a donnée ce jour-là est toujours là. Son enfant a grandi ; il est vivant jusqu’à ce jour. Chaque fois que je pense à lui, je me souviens que l’amour de ma tante n’est pas mort avec elle. Il marche encore parmi nous.</w:t>
       </w:r>
     </w:p>
     <w:bookmarkEnd w:id="25"/>
@@ -2044,7 +2052,15 @@
         <w:pStyle w:val="FirstParagraph"/>
       </w:pPr>
       <w:r>
-        <w:t xml:space="preserve">Pensez à ceux qui ont servi Dieu toute leur vie, comme mon beau-père. Ce 10 août, il n’est pas arrivé à la convention. Mais il est arrivé ailleurs : dans une assemblée bien plus grande, devant le Maître qu’il avait servi. Son travail est achevé. Il se repose.</w:t>
+        <w:t xml:space="preserve">William aimait le Seigneur. Ma tante Rachelle aussi. Mon beau-père l’a servi toute sa vie. Tous trois étaient chrétiens. C’est pourquoi, quand je pense à eux, je ne pense pas à trois tombes : je pense à trois personnes qui sont auprès du Seigneur.</w:t>
+      </w:r>
+    </w:p>
+    <w:p>
+      <w:pPr>
+        <w:pStyle w:val="BodyText"/>
+      </w:pPr>
+      <w:r>
+        <w:t xml:space="preserve">Pensez à mon beau-père. Ce 10 août, il n’est pas arrivé à la convention. Mais il est arrivé ailleurs : dans une assemblée bien plus grande, devant le Maître qu’il avait servi. Son travail est achevé. Il se repose.</w:t>
       </w:r>
     </w:p>
     <w:p>
@@ -3372,15 +3388,15 @@
         <w:pStyle w:val="FirstParagraph"/>
       </w:pPr>
       <w:r>
-        <w:t xml:space="preserve">J’ai l’espérance de revoir mon beau-père, le pasteur Koffi François, qui a servi ce Seigneur jusqu’au dernier jour. J’espère de tout mon cœur revoir le sourire de William et le visage de ma tante Rachelle. Et je prie pour que vous aussi, vous puissiez revoir ceux que vous pleurez, dans ce matin où il n’y aura plus de nuit.</w:t>
-      </w:r>
-    </w:p>
-    <w:p>
-      <w:pPr>
-        <w:pStyle w:val="BodyText"/>
-      </w:pPr>
-      <w:r>
-        <w:t xml:space="preserve">Là-bas, il n’y aura plus de cercueil, plus de veillée, plus de séparation. Plus d’enfant qui part au marché et ne revient pas. Plus de maternité d’où l’on rentre les mains vides. Plus de route qui ne mène pas à destination. Plus de téléphone qui sonne pour annoncer une mauvaise nouvelle.</w:t>
+        <w:t xml:space="preserve">William, Rachelle, Koffi François : tous trois ont mis leur foi en Jésus-Christ. Alors je ne leur ai pas dit adieu. Je reverrai le sourire de William. Je reverrai le visage de ma tante Rachelle, ma seconde maman. Je reverrai mon beau-père, le pasteur Koffi François, qui a servi ce Seigneur jusqu’au dernier jour. Et je prie pour que vous aussi, vous puissiez revoir ceux que vous pleurez, dans ce matin où il n’y aura plus de nuit.</w:t>
+      </w:r>
+    </w:p>
+    <w:p>
+      <w:pPr>
+        <w:pStyle w:val="BodyText"/>
+      </w:pPr>
+      <w:r>
+        <w:t xml:space="preserve">Là-bas, il n’y aura plus de cercueil, plus de veillée, plus de séparation. Plus d’enfant qui part au marché et ne revient pas. Plus de maternité d’où une mère ne revient pas. Plus de route qui ne mène pas à destination. Plus de téléphone qui sonne pour annoncer une mauvaise nouvelle.</w:t>
       </w:r>
     </w:p>
     <w:p>

</xml_diff>

<commit_message>
Livre : tutoiement dans tout le livre et poème d'ouverture « Au lever du jour »
Co-Authored-By: Claude Opus 5.5 <noreply@anthropic.com>
Claude-Session: https://claude.ai/code/session_019iFqSFQpVw8JECnBZv2Kux
</commit_message>
<xml_diff>
--- a/livre/avant-que-l-horloge-ne-s-arrete.docx
+++ b/livre/avant-que-l-horloge-ne-s-arrete.docx
@@ -246,7 +246,7 @@
           <w:iCs/>
           <w:i/>
         </w:rPr>
-        <w:t xml:space="preserve">Et en mémoire de celui ou celle que vous pleurez :</w:t>
+        <w:t xml:space="preserve">Et en mémoire de celui ou celle que tu pleures :</w:t>
       </w:r>
     </w:p>
     <w:p>
@@ -261,12 +261,376 @@
         <w:t xml:space="preserve">…………………………………………………</w:t>
       </w:r>
     </w:p>
-    <w:p>
-      <w:r>
-        <w:pict>
-          <v:rect style="width:0;height:1.5pt" o:hralign="center" o:hrstd="t" o:hr="t"/>
-        </w:pict>
-      </w:r>
+    <w:bookmarkEnd w:id="20"/>
+    <w:bookmarkStart w:id="21" w:name="au-lever-du-jour"/>
+    <w:p>
+      <w:pPr>
+        <w:pStyle w:val="Heading2"/>
+      </w:pPr>
+      <w:r>
+        <w:t xml:space="preserve">Au lever du jour</w:t>
+      </w:r>
+    </w:p>
+    <w:p>
+      <w:pPr>
+        <w:pStyle w:val="FirstParagraph"/>
+      </w:pPr>
+      <w:r>
+        <w:t xml:space="preserve">Regarde.</w:t>
+      </w:r>
+      <w:r>
+        <w:br/>
+      </w:r>
+      <w:r>
+        <w:t xml:space="preserve">L’aube écarte doucement la nuit,</w:t>
+      </w:r>
+      <w:r>
+        <w:br/>
+      </w:r>
+      <w:r>
+        <w:t xml:space="preserve">comme une main qui ouvre un rideau.</w:t>
+      </w:r>
+      <w:r>
+        <w:br/>
+      </w:r>
+      <w:r>
+        <w:t xml:space="preserve">Sur les toits, sur les champs, sur les visages endormis,</w:t>
+      </w:r>
+      <w:r>
+        <w:br/>
+      </w:r>
+      <w:r>
+        <w:t xml:space="preserve">la lumière revient, fidèle,</w:t>
+      </w:r>
+      <w:r>
+        <w:br/>
+      </w:r>
+      <w:r>
+        <w:t xml:space="preserve">sans rien demander à personne.</w:t>
+      </w:r>
+    </w:p>
+    <w:p>
+      <w:pPr>
+        <w:pStyle w:val="BodyText"/>
+      </w:pPr>
+      <w:r>
+        <w:t xml:space="preserve">C’est encore un jour que le Seigneur a fait.</w:t>
+      </w:r>
+      <w:r>
+        <w:br/>
+      </w:r>
+      <w:r>
+        <w:t xml:space="preserve">Un matin neuf, que personne n’a encore vécu,</w:t>
+      </w:r>
+      <w:r>
+        <w:br/>
+      </w:r>
+      <w:r>
+        <w:t xml:space="preserve">où ses bontés ne sont pas épuisées,</w:t>
+      </w:r>
+      <w:r>
+        <w:br/>
+      </w:r>
+      <w:r>
+        <w:t xml:space="preserve">où ses compassions, comme la rosée,</w:t>
+      </w:r>
+      <w:r>
+        <w:br/>
+      </w:r>
+      <w:r>
+        <w:t xml:space="preserve">se sont renouvelées pendant que tu dormais.</w:t>
+      </w:r>
+    </w:p>
+    <w:p>
+      <w:pPr>
+        <w:pStyle w:val="BodyText"/>
+      </w:pPr>
+      <w:r>
+        <w:t xml:space="preserve">Écoute.</w:t>
+      </w:r>
+      <w:r>
+        <w:br/>
+      </w:r>
+      <w:r>
+        <w:t xml:space="preserve">Les oiseaux chantent avant de savoir</w:t>
+      </w:r>
+      <w:r>
+        <w:br/>
+      </w:r>
+      <w:r>
+        <w:t xml:space="preserve">ce que la journée leur réserve.</w:t>
+      </w:r>
+      <w:r>
+        <w:br/>
+      </w:r>
+      <w:r>
+        <w:t xml:space="preserve">Ils ne sèment ni ne moissonnent,</w:t>
+      </w:r>
+      <w:r>
+        <w:br/>
+      </w:r>
+      <w:r>
+        <w:t xml:space="preserve">et pourtant, quelqu’un les nourrit.</w:t>
+      </w:r>
+      <w:r>
+        <w:br/>
+      </w:r>
+      <w:r>
+        <w:t xml:space="preserve">Celui qui veille sur eux</w:t>
+      </w:r>
+      <w:r>
+        <w:br/>
+      </w:r>
+      <w:r>
+        <w:t xml:space="preserve">connaît aussi ton nom.</w:t>
+      </w:r>
+    </w:p>
+    <w:p>
+      <w:pPr>
+        <w:pStyle w:val="BodyText"/>
+      </w:pPr>
+      <w:r>
+        <w:t xml:space="preserve">La vie est belle, tu sais.</w:t>
+      </w:r>
+      <w:r>
+        <w:br/>
+      </w:r>
+      <w:r>
+        <w:t xml:space="preserve">Belle comme le premier cri d’un enfant,</w:t>
+      </w:r>
+      <w:r>
+        <w:br/>
+      </w:r>
+      <w:r>
+        <w:t xml:space="preserve">comme le rire d’un ami sur le chemin de l’école,</w:t>
+      </w:r>
+      <w:r>
+        <w:br/>
+      </w:r>
+      <w:r>
+        <w:t xml:space="preserve">comme le pain partagé, la main tenue,</w:t>
+      </w:r>
+      <w:r>
+        <w:br/>
+      </w:r>
+      <w:r>
+        <w:t xml:space="preserve">l’odeur de la terre après la pluie.</w:t>
+      </w:r>
+      <w:r>
+        <w:br/>
+      </w:r>
+      <w:r>
+        <w:t xml:space="preserve">Dieu fait toute chose belle en son temps,</w:t>
+      </w:r>
+      <w:r>
+        <w:br/>
+      </w:r>
+      <w:r>
+        <w:t xml:space="preserve">et il a mis l’éternité dans ton cœur.</w:t>
+      </w:r>
+    </w:p>
+    <w:p>
+      <w:pPr>
+        <w:pStyle w:val="BodyText"/>
+      </w:pPr>
+      <w:r>
+        <w:t xml:space="preserve">Tu as été tissé avec soin</w:t>
+      </w:r>
+      <w:r>
+        <w:br/>
+      </w:r>
+      <w:r>
+        <w:t xml:space="preserve">dans le secret du sein de ta mère ;</w:t>
+      </w:r>
+      <w:r>
+        <w:br/>
+      </w:r>
+      <w:r>
+        <w:t xml:space="preserve">tu es une merveille, et ton âme le sait.</w:t>
+      </w:r>
+      <w:r>
+        <w:br/>
+      </w:r>
+      <w:r>
+        <w:t xml:space="preserve">Avant même ton premier jour,</w:t>
+      </w:r>
+      <w:r>
+        <w:br/>
+      </w:r>
+      <w:r>
+        <w:t xml:space="preserve">tes jours étaient écrits dans son livre,</w:t>
+      </w:r>
+      <w:r>
+        <w:br/>
+      </w:r>
+      <w:r>
+        <w:t xml:space="preserve">et pas un seul n’y a été écrit sans amour.</w:t>
+      </w:r>
+    </w:p>
+    <w:p>
+      <w:pPr>
+        <w:pStyle w:val="BodyText"/>
+      </w:pPr>
+      <w:r>
+        <w:t xml:space="preserve">Peut-être que ce matin, tes yeux sont lourds.</w:t>
+      </w:r>
+      <w:r>
+        <w:br/>
+      </w:r>
+      <w:r>
+        <w:t xml:space="preserve">Peut-être que la nuit a été longue,</w:t>
+      </w:r>
+      <w:r>
+        <w:br/>
+      </w:r>
+      <w:r>
+        <w:t xml:space="preserve">et que les larmes ont mouillé l’oreiller.</w:t>
+      </w:r>
+      <w:r>
+        <w:br/>
+      </w:r>
+      <w:r>
+        <w:t xml:space="preserve">Alors souviens-toi :</w:t>
+      </w:r>
+      <w:r>
+        <w:br/>
+      </w:r>
+      <w:r>
+        <w:t xml:space="preserve">le soir viennent les pleurs,</w:t>
+      </w:r>
+      <w:r>
+        <w:br/>
+      </w:r>
+      <w:r>
+        <w:t xml:space="preserve">mais le matin, l’allégresse.</w:t>
+      </w:r>
+      <w:r>
+        <w:br/>
+      </w:r>
+      <w:r>
+        <w:t xml:space="preserve">Celui qui fait lever ce soleil</w:t>
+      </w:r>
+      <w:r>
+        <w:br/>
+      </w:r>
+      <w:r>
+        <w:t xml:space="preserve">sait aussi faire lever la joie.</w:t>
+      </w:r>
+    </w:p>
+    <w:p>
+      <w:pPr>
+        <w:pStyle w:val="BodyText"/>
+      </w:pPr>
+      <w:r>
+        <w:t xml:space="preserve">Car il est un autre Soleil,</w:t>
+      </w:r>
+      <w:r>
+        <w:br/>
+      </w:r>
+      <w:r>
+        <w:t xml:space="preserve">le Soleil de justice,</w:t>
+      </w:r>
+      <w:r>
+        <w:br/>
+      </w:r>
+      <w:r>
+        <w:t xml:space="preserve">qui se lève avec la guérison sous ses ailes.</w:t>
+      </w:r>
+      <w:r>
+        <w:br/>
+      </w:r>
+      <w:r>
+        <w:t xml:space="preserve">Sa lumière ne se couche pas.</w:t>
+      </w:r>
+      <w:r>
+        <w:br/>
+      </w:r>
+      <w:r>
+        <w:t xml:space="preserve">Elle traverse les vallées de l’ombre,</w:t>
+      </w:r>
+      <w:r>
+        <w:br/>
+      </w:r>
+      <w:r>
+        <w:t xml:space="preserve">elle entre dans les maisons en deuil,</w:t>
+      </w:r>
+      <w:r>
+        <w:br/>
+      </w:r>
+      <w:r>
+        <w:t xml:space="preserve">elle a même roulé la pierre d’un tombeau,</w:t>
+      </w:r>
+      <w:r>
+        <w:br/>
+      </w:r>
+      <w:r>
+        <w:t xml:space="preserve">un matin, au premier jour de la semaine.</w:t>
+      </w:r>
+    </w:p>
+    <w:p>
+      <w:pPr>
+        <w:pStyle w:val="BodyText"/>
+      </w:pPr>
+      <w:r>
+        <w:t xml:space="preserve">Alors respire.</w:t>
+      </w:r>
+      <w:r>
+        <w:br/>
+      </w:r>
+      <w:r>
+        <w:t xml:space="preserve">Inspire la lumière, expire la peur.</w:t>
+      </w:r>
+      <w:r>
+        <w:br/>
+      </w:r>
+      <w:r>
+        <w:t xml:space="preserve">Sa Parole est une lampe à tes pieds,</w:t>
+      </w:r>
+      <w:r>
+        <w:br/>
+      </w:r>
+      <w:r>
+        <w:t xml:space="preserve">une lumière sur ton sentier.</w:t>
+      </w:r>
+      <w:r>
+        <w:br/>
+      </w:r>
+      <w:r>
+        <w:t xml:space="preserve">Tu ne marches pas seul sur la route.</w:t>
+      </w:r>
+    </w:p>
+    <w:p>
+      <w:pPr>
+        <w:pStyle w:val="BodyText"/>
+      </w:pPr>
+      <w:r>
+        <w:t xml:space="preserve">Respire encore.</w:t>
+      </w:r>
+      <w:r>
+        <w:br/>
+      </w:r>
+      <w:r>
+        <w:t xml:space="preserve">Et tourne la page,</w:t>
+      </w:r>
+      <w:r>
+        <w:br/>
+      </w:r>
+      <w:r>
+        <w:t xml:space="preserve">non pas vers la nuit,</w:t>
+      </w:r>
+      <w:r>
+        <w:br/>
+      </w:r>
+      <w:r>
+        <w:t xml:space="preserve">mais vers Celui qui fait lever le jour.</w:t>
+      </w:r>
+    </w:p>
+    <w:bookmarkEnd w:id="21"/>
+    <w:bookmarkStart w:id="22" w:name="section"/>
+    <w:p>
+      <w:pPr>
+        <w:pStyle w:val="Heading2"/>
+      </w:pPr>
     </w:p>
     <w:p>
       <w:pPr>
@@ -290,15 +654,8 @@
         <w:t xml:space="preserve">— Psaume 90.12</w:t>
       </w:r>
     </w:p>
-    <w:p>
-      <w:r>
-        <w:pict>
-          <v:rect style="width:0;height:1.5pt" o:hralign="center" o:hrstd="t" o:hr="t"/>
-        </w:pict>
-      </w:r>
-    </w:p>
-    <w:bookmarkEnd w:id="20"/>
-    <w:bookmarkStart w:id="21" w:name="avant-de-commencer"/>
+    <w:bookmarkEnd w:id="22"/>
+    <w:bookmarkStart w:id="23" w:name="avant-de-commencer"/>
     <w:p>
       <w:pPr>
         <w:pStyle w:val="Heading2"/>
@@ -312,23 +669,23 @@
         <w:pStyle w:val="FirstParagraph"/>
       </w:pPr>
       <w:r>
-        <w:t xml:space="preserve">Si vous tenez ce petit livre entre vos mains, c’est peut-être que quelqu’un vous a quitté.</w:t>
-      </w:r>
-    </w:p>
-    <w:p>
-      <w:pPr>
-        <w:pStyle w:val="BodyText"/>
-      </w:pPr>
-      <w:r>
-        <w:t xml:space="preserve">Peut-être que le téléphone a sonné à une heure inhabituelle. Peut-être qu’une voix tremblante vous a dit : « Il faut que tu sois fort… » Peut-être que, depuis, la maison est trop silencieuse, la chaise trop vide, les nuits trop longues. Peut-être que vous vous réveillez encore le matin en oubliant, pendant une seconde, que c’est arrivé. Et puis la mémoire revient, et la douleur avec elle.</w:t>
-      </w:r>
-    </w:p>
-    <w:p>
-      <w:pPr>
-        <w:pStyle w:val="BodyText"/>
-      </w:pPr>
-      <w:r>
-        <w:t xml:space="preserve">Je ne vous connais pas. Mais je connais cette douleur.</w:t>
+        <w:t xml:space="preserve">Si tu tiens ce petit livre entre tes mains, c’est peut-être que quelqu’un t’a quitté.</w:t>
+      </w:r>
+    </w:p>
+    <w:p>
+      <w:pPr>
+        <w:pStyle w:val="BodyText"/>
+      </w:pPr>
+      <w:r>
+        <w:t xml:space="preserve">Peut-être que le téléphone a sonné à une heure inhabituelle. Peut-être qu’une voix tremblante t’a dit : « Il faut que tu sois fort… » Peut-être que, depuis, la maison est trop silencieuse, la chaise trop vide, les nuits trop longues. Peut-être que tu te réveilles encore le matin en oubliant, pendant une seconde, que c’est arrivé. Et puis la mémoire revient, et la douleur avec elle.</w:t>
+      </w:r>
+    </w:p>
+    <w:p>
+      <w:pPr>
+        <w:pStyle w:val="BodyText"/>
+      </w:pPr>
+      <w:r>
+        <w:t xml:space="preserve">Je ne te connais pas. Mais je connais cette douleur.</w:t>
       </w:r>
     </w:p>
     <w:p>
@@ -344,7 +701,7 @@
         <w:pStyle w:val="BodyText"/>
       </w:pPr>
       <w:r>
-        <w:t xml:space="preserve">Ce livre est né de ces larmes-là. Il n’a pas la prétention d’expliquer la mort. Il veut seulement faire trois choses avec vous :</w:t>
+        <w:t xml:space="preserve">Ce livre est né de ces larmes-là. Il n’a pas la prétention d’expliquer la mort. Il veut seulement faire trois choses avec toi :</w:t>
       </w:r>
     </w:p>
     <w:p>
@@ -379,7 +736,7 @@
           <w:bCs/>
           <w:b/>
         </w:rPr>
-        <w:t xml:space="preserve">vous consoler</w:t>
+        <w:t xml:space="preserve">te consoler</w:t>
       </w:r>
       <w:r>
         <w:t xml:space="preserve">, avec la seule consolation qui tienne debout devant une tombe ;</w:t>
@@ -398,7 +755,7 @@
           <w:bCs/>
           <w:b/>
         </w:rPr>
-        <w:t xml:space="preserve">vous montrer le chemin</w:t>
+        <w:t xml:space="preserve">te montrer le chemin</w:t>
       </w:r>
       <w:r>
         <w:t xml:space="preserve">, celui qui transforme un « adieu » en « au revoir ».</w:t>
@@ -409,18 +766,11 @@
         <w:pStyle w:val="FirstParagraph"/>
       </w:pPr>
       <w:r>
-        <w:t xml:space="preserve">Il est court, pour tenir dans une poche, un sac, sur une table de chevet. Lisez-le d’un trait ou une page par jour. Mais lisez-le avec le cœur. Il parle de ceux que nous avons perdus. Il parle aussi de vous.</w:t>
-      </w:r>
-    </w:p>
-    <w:p>
-      <w:r>
-        <w:pict>
-          <v:rect style="width:0;height:1.5pt" o:hralign="center" o:hrstd="t" o:hr="t"/>
-        </w:pict>
-      </w:r>
-    </w:p>
-    <w:bookmarkEnd w:id="21"/>
-    <w:bookmarkStart w:id="34" w:name="première-partie"/>
+        <w:t xml:space="preserve">Il est court, pour tenir dans une poche, un sac, sur une table de chevet. Lis-le d’un trait ou une page par jour. Mais lis-le avec le cœur. Il parle de ceux que nous avons perdus. Il parle aussi de toi.</w:t>
+      </w:r>
+    </w:p>
+    <w:bookmarkEnd w:id="23"/>
+    <w:bookmarkStart w:id="36" w:name="première-partie"/>
     <w:p>
       <w:pPr>
         <w:pStyle w:val="Heading1"/>
@@ -429,7 +779,7 @@
         <w:t xml:space="preserve">Première partie</w:t>
       </w:r>
     </w:p>
-    <w:bookmarkStart w:id="22" w:name="la-vie-nest-quun-souffle"/>
+    <w:bookmarkStart w:id="24" w:name="la-vie-nest-quun-souffle"/>
     <w:p>
       <w:pPr>
         <w:pStyle w:val="Heading2"/>
@@ -438,15 +788,8 @@
         <w:t xml:space="preserve">La vie n’est qu’un souffle</w:t>
       </w:r>
     </w:p>
-    <w:p>
-      <w:r>
-        <w:pict>
-          <v:rect style="width:0;height:1.5pt" o:hralign="center" o:hrstd="t" o:hr="t"/>
-        </w:pict>
-      </w:r>
-    </w:p>
-    <w:bookmarkEnd w:id="22"/>
-    <w:bookmarkStart w:id="23" w:name="lhorloge-à-rebours"/>
+    <w:bookmarkEnd w:id="24"/>
+    <w:bookmarkStart w:id="25" w:name="lhorloge-à-rebours"/>
     <w:p>
       <w:pPr>
         <w:pStyle w:val="Heading2"/>
@@ -460,7 +803,7 @@
         <w:pStyle w:val="FirstParagraph"/>
       </w:pPr>
       <w:r>
-        <w:t xml:space="preserve">Avez-vous remarqué comment nous comptons nos années ?</w:t>
+        <w:t xml:space="preserve">As-tu remarqué comment nous comptons nos années ?</w:t>
       </w:r>
     </w:p>
     <w:p>
@@ -476,7 +819,7 @@
         <w:pStyle w:val="BodyText"/>
       </w:pPr>
       <w:r>
-        <w:t xml:space="preserve">Mais Dieu n’a pas fait une horloge qui monte. Le jour où vous êtes né, une horloge s’est mise en marche, et elle</w:t>
+        <w:t xml:space="preserve">Mais Dieu n’a pas fait une horloge qui monte. Le jour où tu es né, une horloge s’est mise en marche, et elle</w:t>
       </w:r>
       <w:r>
         <w:t xml:space="preserve"> </w:t>
@@ -489,7 +832,7 @@
         <w:t xml:space="preserve">descend</w:t>
       </w:r>
       <w:r>
-        <w:t xml:space="preserve">. Dieu seul connaît le nombre exact de vos jours. Chaque matin où vous vous levez, il ne vous en reste pas un de plus : il vous en reste un de moins. Et quand le compteur arrive à zéro, l’horloge s’arrête, et le souffle s’arrête avec elle.</w:t>
+        <w:t xml:space="preserve">. Dieu seul connaît le nombre exact de tes jours. Chaque matin où tu te lèves, il ne t’en reste pas un de plus : il t’en reste un de moins. Et quand le compteur arrive à zéro, l’horloge s’arrête, et le souffle s’arrête avec elle.</w:t>
       </w:r>
     </w:p>
     <w:p>
@@ -543,7 +886,7 @@
         <w:pStyle w:val="BodyText"/>
       </w:pPr>
       <w:r>
-        <w:t xml:space="preserve">Ce n’est pas pour faire peur. C’est pour rendre sage. Celui qui sait que l’argent de sa poche va finir le dépense avec prudence. Pourquoi serions-nous plus prudents avec quelques pièces qu’avec les jours de notre vie ?</w:t>
+        <w:t xml:space="preserve">Ce n’est pas pour te faire peur. C’est pour te rendre sage. Celui qui sait que l’argent de sa poche va finir le dépense avec prudence. Pourquoi serions-nous plus prudents avec quelques pièces qu’avec les jours de notre vie ?</w:t>
       </w:r>
     </w:p>
     <w:p>
@@ -559,7 +902,7 @@
         <w:pStyle w:val="BodyText"/>
       </w:pPr>
       <w:r>
-        <w:t xml:space="preserve">Et la vôtre ? Combien de jours restent dessus ? Vous ne le savez pas. Moi non plus.</w:t>
+        <w:t xml:space="preserve">Et la tienne ? Combien de jours restent dessus ? Tu ne le sais pas. Moi non plus.</w:t>
       </w:r>
     </w:p>
     <w:p>
@@ -584,15 +927,8 @@
         <w:t xml:space="preserve">— Jacques 4.14</w:t>
       </w:r>
     </w:p>
-    <w:p>
-      <w:r>
-        <w:pict>
-          <v:rect style="width:0;height:1.5pt" o:hralign="center" o:hrstd="t" o:hr="t"/>
-        </w:pict>
-      </w:r>
-    </w:p>
-    <w:bookmarkEnd w:id="23"/>
-    <w:bookmarkStart w:id="28" w:name="des-circonstances-si-ordinaires"/>
+    <w:bookmarkEnd w:id="25"/>
+    <w:bookmarkStart w:id="30" w:name="des-circonstances-si-ordinaires"/>
     <w:p>
       <w:pPr>
         <w:pStyle w:val="Heading2"/>
@@ -606,10 +942,10 @@
         <w:pStyle w:val="FirstParagraph"/>
       </w:pPr>
       <w:r>
-        <w:t xml:space="preserve">Laissez-moi vous raconter ce qui s’est passé. Le plus troublant dans ces histoires, ce n’est pas qu’elles soient extraordinaires. C’est qu’elles sont terriblement ordinaires.</w:t>
-      </w:r>
-    </w:p>
-    <w:bookmarkStart w:id="24" w:name="un-samedi-17-heures"/>
+        <w:t xml:space="preserve">Laisse-moi te raconter ce qui s’est passé. Le plus troublant dans ces histoires, ce n’est pas qu’elles soient extraordinaires. C’est qu’elles sont terriblement ordinaires.</w:t>
+      </w:r>
+    </w:p>
+    <w:bookmarkStart w:id="26" w:name="un-samedi-17-heures"/>
     <w:p>
       <w:pPr>
         <w:pStyle w:val="Heading3"/>
@@ -684,8 +1020,8 @@
         <w:t xml:space="preserve">personne ne sait quelle sortie sera sa dernière sortie.</w:t>
       </w:r>
     </w:p>
-    <w:bookmarkEnd w:id="24"/>
-    <w:bookmarkStart w:id="25" w:name="un-dimanche-matin-à-gagnoa"/>
+    <w:bookmarkEnd w:id="26"/>
+    <w:bookmarkStart w:id="27" w:name="un-dimanche-matin-à-gagnoa"/>
     <w:p>
       <w:pPr>
         <w:pStyle w:val="Heading3"/>
@@ -744,8 +1080,8 @@
         <w:t xml:space="preserve">Et pourtant, la vie qu’elle a donnée ce jour-là est toujours là. Son enfant a grandi ; il est vivant jusqu’à ce jour. Chaque fois que je pense à lui, je me souviens que l’amour de ma tante n’est pas mort avec elle. Il marche encore parmi nous.</w:t>
       </w:r>
     </w:p>
-    <w:bookmarkEnd w:id="25"/>
-    <w:bookmarkStart w:id="26" w:name="Xb3860a1bc2d36dc7477dab47101d00e5767020e"/>
+    <w:bookmarkEnd w:id="27"/>
+    <w:bookmarkStart w:id="28" w:name="Xb3860a1bc2d36dc7477dab47101d00e5767020e"/>
     <w:p>
       <w:pPr>
         <w:pStyle w:val="Heading3"/>
@@ -802,8 +1138,8 @@
         <w:t xml:space="preserve">La différence n’est pas dans la manière de mourir. Elle est dans le lieu où l’on se réveille.</w:t>
       </w:r>
     </w:p>
-    <w:bookmarkEnd w:id="26"/>
-    <w:bookmarkStart w:id="27" w:name="ce-que-ces-trois-départs-mont-appris"/>
+    <w:bookmarkEnd w:id="28"/>
+    <w:bookmarkStart w:id="29" w:name="ce-que-ces-trois-départs-mont-appris"/>
     <w:p>
       <w:pPr>
         <w:pStyle w:val="Heading3"/>
@@ -871,19 +1207,12 @@
         <w:t xml:space="preserve"> </w:t>
       </w:r>
       <w:r>
-        <w:t xml:space="preserve">C’est elle que je voudrais déposer dans le vôtre.</w:t>
-      </w:r>
-    </w:p>
-    <w:p>
-      <w:r>
-        <w:pict>
-          <v:rect style="width:0;height:1.5pt" o:hralign="center" o:hrstd="t" o:hr="t"/>
-        </w:pict>
-      </w:r>
-    </w:p>
-    <w:bookmarkEnd w:id="27"/>
-    <w:bookmarkEnd w:id="28"/>
-    <w:bookmarkStart w:id="29" w:name="lamour-qui-ne-peut-pas-retenir"/>
+        <w:t xml:space="preserve">C’est elle que je voudrais déposer dans le tien.</w:t>
+      </w:r>
+    </w:p>
+    <w:bookmarkEnd w:id="29"/>
+    <w:bookmarkEnd w:id="30"/>
+    <w:bookmarkStart w:id="31" w:name="lamour-qui-ne-peut-pas-retenir"/>
     <w:p>
       <w:pPr>
         <w:pStyle w:val="Heading2"/>
@@ -897,7 +1226,7 @@
         <w:pStyle w:val="FirstParagraph"/>
       </w:pPr>
       <w:r>
-        <w:t xml:space="preserve">Pensez à ceux que vous aimez. Vos enfants, votre époux ou votre épouse, vos parents, vos amis.</w:t>
+        <w:t xml:space="preserve">Pense à ceux que tu aimes. Tes enfants, ton époux ou ton épouse, tes parents, tes amis.</w:t>
       </w:r>
     </w:p>
     <w:p>
@@ -965,7 +1294,7 @@
         <w:pStyle w:val="BodyText"/>
       </w:pPr>
       <w:r>
-        <w:t xml:space="preserve">Mais écoutez bien, car c’est ici que commence la consolation : si notre amour ne peut pas retenir, il existe un Amour qui, lui, ne lâche jamais. Un Amour que la mort elle-même ne peut pas briser.</w:t>
+        <w:t xml:space="preserve">Mais écoute bien, car c’est ici que commence la consolation : si notre amour ne peut pas retenir, il existe un Amour qui, lui, ne lâche jamais. Un Amour que la mort elle-même ne peut pas briser.</w:t>
       </w:r>
     </w:p>
     <w:p>
@@ -996,15 +1325,8 @@
         <w:t xml:space="preserve">— Romains 8.38-39</w:t>
       </w:r>
     </w:p>
-    <w:p>
-      <w:r>
-        <w:pict>
-          <v:rect style="width:0;height:1.5pt" o:hralign="center" o:hrstd="t" o:hr="t"/>
-        </w:pict>
-      </w:r>
-    </w:p>
-    <w:bookmarkEnd w:id="29"/>
-    <w:bookmarkStart w:id="30" w:name="la-nuit-de-la-veillée"/>
+    <w:bookmarkEnd w:id="31"/>
+    <w:bookmarkStart w:id="32" w:name="la-nuit-de-la-veillée"/>
     <w:p>
       <w:pPr>
         <w:pStyle w:val="Heading2"/>
@@ -1159,15 +1481,8 @@
         <w:t xml:space="preserve">— 2 Corinthiens 5.1</w:t>
       </w:r>
     </w:p>
-    <w:p>
-      <w:r>
-        <w:pict>
-          <v:rect style="width:0;height:1.5pt" o:hralign="center" o:hrstd="t" o:hr="t"/>
-        </w:pict>
-      </w:r>
-    </w:p>
-    <w:bookmarkEnd w:id="30"/>
-    <w:bookmarkStart w:id="31" w:name="la-dernière-séparation"/>
+    <w:bookmarkEnd w:id="32"/>
+    <w:bookmarkStart w:id="33" w:name="la-dernière-séparation"/>
     <w:p>
       <w:pPr>
         <w:pStyle w:val="Heading2"/>
@@ -1231,7 +1546,7 @@
         <w:pStyle w:val="BodyText"/>
       </w:pPr>
       <w:r>
-        <w:t xml:space="preserve">Si vous êtes de ceux qui sont rentrés chez eux ce jour-là, le cœur arraché, sachez ceci : vous n’êtes pas rentré seul. Celui qui a promis d’être avec nous « tous les jours » est rentré avec vous. Il était là au bord de la tombe. Il est là dans la maison vide.</w:t>
+        <w:t xml:space="preserve">Si tu es de ceux qui sont rentrés chez eux ce jour-là, le cœur arraché, sache ceci : tu n’es pas rentré seul. Celui qui a promis d’être avec nous « tous les jours » est rentré avec toi. Il était là au bord de la tombe. Il est là dans la maison vide.</w:t>
       </w:r>
     </w:p>
     <w:p>
@@ -1250,15 +1565,8 @@
         <w:t xml:space="preserve">— Hébreux 13.5</w:t>
       </w:r>
     </w:p>
-    <w:p>
-      <w:r>
-        <w:pict>
-          <v:rect style="width:0;height:1.5pt" o:hralign="center" o:hrstd="t" o:hr="t"/>
-        </w:pict>
-      </w:r>
-    </w:p>
-    <w:bookmarkEnd w:id="31"/>
-    <w:bookmarkStart w:id="32" w:name="absent-aux-obsèques"/>
+    <w:bookmarkEnd w:id="33"/>
+    <w:bookmarkStart w:id="34" w:name="absent-aux-obsèques"/>
     <w:p>
       <w:pPr>
         <w:pStyle w:val="Heading2"/>
@@ -1296,7 +1604,7 @@
         <w:pStyle w:val="BodyText"/>
       </w:pPr>
       <w:r>
-        <w:t xml:space="preserve">Si c’est votre histoire, recevez ceci :</w:t>
+        <w:t xml:space="preserve">Si c’est ton histoire, reçois ceci :</w:t>
       </w:r>
       <w:r>
         <w:t xml:space="preserve"> </w:t>
@@ -1312,7 +1620,7 @@
         <w:t xml:space="preserve"> </w:t>
       </w:r>
       <w:r>
-        <w:t xml:space="preserve">Celui qui est parti n’a plus besoin de votre présence au cimetière. Ce qui comptait, c’était l’amour que vous lui avez donné de son vivant, et cela, la distance ne l’efface pas.</w:t>
+        <w:t xml:space="preserve">Celui qui est parti n’a plus besoin de ta présence au cimetière. Ce qui comptait, c’était l’amour que tu lui as donné de son vivant, et cela, la distance ne l’efface pas.</w:t>
       </w:r>
     </w:p>
     <w:p>
@@ -1350,18 +1658,11 @@
         <w:pStyle w:val="FirstParagraph"/>
       </w:pPr>
       <w:r>
-        <w:t xml:space="preserve">Nous arrivons seuls, et nous repartons seuls. Même ceux qui se tiennent au bord de la fosse ne descendent pas avec nous. Alors déposez cette culpabilité aux pieds de Dieu. Il connaît votre cœur mieux que quiconque.</w:t>
-      </w:r>
-    </w:p>
-    <w:p>
-      <w:r>
-        <w:pict>
-          <v:rect style="width:0;height:1.5pt" o:hralign="center" o:hrstd="t" o:hr="t"/>
-        </w:pict>
-      </w:r>
-    </w:p>
-    <w:bookmarkEnd w:id="32"/>
-    <w:bookmarkStart w:id="33" w:name="les-paradoxes-de-notre-vie"/>
+        <w:t xml:space="preserve">Nous arrivons seuls, et nous repartons seuls. Même ceux qui se tiennent au bord de la fosse ne descendent pas avec nous. Alors dépose cette culpabilité aux pieds de Dieu. Il connaît ton cœur mieux que quiconque.</w:t>
+      </w:r>
+    </w:p>
+    <w:bookmarkEnd w:id="34"/>
+    <w:bookmarkStart w:id="35" w:name="les-paradoxes-de-notre-vie"/>
     <w:p>
       <w:pPr>
         <w:pStyle w:val="Heading2"/>
@@ -1375,7 +1676,7 @@
         <w:pStyle w:val="FirstParagraph"/>
       </w:pPr>
       <w:r>
-        <w:t xml:space="preserve">Regardée à la lumière de la mort, notre façon de vivre est bien étrange. Lisez lentement.</w:t>
+        <w:t xml:space="preserve">Regardée à la lumière de la mort, notre façon de vivre est bien étrange. Lis lentement.</w:t>
       </w:r>
     </w:p>
     <w:p>
@@ -1548,16 +1849,9 @@
         <w:t xml:space="preserve">— Marc 8.36</w:t>
       </w:r>
     </w:p>
-    <w:p>
-      <w:r>
-        <w:pict>
-          <v:rect style="width:0;height:1.5pt" o:hralign="center" o:hrstd="t" o:hr="t"/>
-        </w:pict>
-      </w:r>
-    </w:p>
-    <w:bookmarkEnd w:id="33"/>
-    <w:bookmarkEnd w:id="34"/>
-    <w:bookmarkStart w:id="41" w:name="deuxième-partie"/>
+    <w:bookmarkEnd w:id="35"/>
+    <w:bookmarkEnd w:id="36"/>
+    <w:bookmarkStart w:id="43" w:name="deuxième-partie"/>
     <w:p>
       <w:pPr>
         <w:pStyle w:val="Heading1"/>
@@ -1566,7 +1860,7 @@
         <w:t xml:space="preserve">Deuxième partie</w:t>
       </w:r>
     </w:p>
-    <w:bookmarkStart w:id="35" w:name="le-dieu-de-toute-consolation"/>
+    <w:bookmarkStart w:id="37" w:name="le-dieu-de-toute-consolation"/>
     <w:p>
       <w:pPr>
         <w:pStyle w:val="Heading2"/>
@@ -1575,21 +1869,14 @@
         <w:t xml:space="preserve">Le Dieu de toute consolation</w:t>
       </w:r>
     </w:p>
-    <w:p>
-      <w:r>
-        <w:pict>
-          <v:rect style="width:0;height:1.5pt" o:hralign="center" o:hrstd="t" o:hr="t"/>
-        </w:pict>
-      </w:r>
-    </w:p>
-    <w:bookmarkEnd w:id="35"/>
-    <w:bookmarkStart w:id="36" w:name="vous-avez-le-droit-de-pleurer"/>
+    <w:bookmarkEnd w:id="37"/>
+    <w:bookmarkStart w:id="38" w:name="tu-as-le-droit-de-pleurer"/>
     <w:p>
       <w:pPr>
         <w:pStyle w:val="Heading2"/>
       </w:pPr>
       <w:r>
-        <w:t xml:space="preserve">8. Vous avez le droit de pleurer</w:t>
+        <w:t xml:space="preserve">8. Tu as le droit de pleurer</w:t>
       </w:r>
     </w:p>
     <w:p>
@@ -1597,7 +1884,7 @@
         <w:pStyle w:val="FirstParagraph"/>
       </w:pPr>
       <w:r>
-        <w:t xml:space="preserve">On dit souvent aux endeuillés : « Ne pleure pas, il faut être fort. » Ce livre vous dit le contraire : pleurez. Pleurez autant que votre cœur en a besoin. Les larmes ne sont pas un manque de foi. Elles sont le prix de l’amour. On ne pleure si fort que ceux qu’on a beaucoup aimés.</w:t>
+        <w:t xml:space="preserve">On dit souvent aux endeuillés : « Ne pleure pas, il faut être fort. » Ce livre te dit le contraire : pleure. Pleure autant que ton cœur en a besoin. Les larmes ne sont pas un manque de foi. Elles sont le prix de l’amour. On ne pleure si fort que ceux qu’on a beaucoup aimés.</w:t>
       </w:r>
     </w:p>
     <w:p>
@@ -1629,7 +1916,7 @@
         <w:pStyle w:val="FirstParagraph"/>
       </w:pPr>
       <w:r>
-        <w:t xml:space="preserve">Le Fils de Dieu a pleuré devant la tombe d’un ami. Vous n’êtes donc pas seul à pleurer : Dieu pleure avec vous. Il ne regarde pas votre chagrin de loin. Il s’approche.</w:t>
+        <w:t xml:space="preserve">Le Fils de Dieu a pleuré devant la tombe d’un ami. Tu n’es donc pas seul à pleurer : Dieu pleure avec toi. Il ne regarde pas ton chagrin de loin. Il s’approche.</w:t>
       </w:r>
     </w:p>
     <w:p>
@@ -1659,7 +1946,7 @@
         <w:pStyle w:val="FirstParagraph"/>
       </w:pPr>
       <w:r>
-        <w:t xml:space="preserve">Et aucune de vos larmes n’est perdue. Pas une seule. Celles que vous versez la nuit, en cachette, celles que personne ne voit, Dieu les recueille.</w:t>
+        <w:t xml:space="preserve">Et aucune de tes larmes n’est perdue. Pas une seule. Celles que tu verses la nuit, en cachette, celles que personne ne voit, Dieu les recueille.</w:t>
       </w:r>
     </w:p>
     <w:p>
@@ -1689,7 +1976,7 @@
         <w:pStyle w:val="FirstParagraph"/>
       </w:pPr>
       <w:r>
-        <w:t xml:space="preserve">Le deuil n’est pas une ligne droite. Il y aura des jours meilleurs et des jours où tout reviendra d’un coup : un anniversaire, une chanson, une odeur, une place vide à table. Ce n’est pas un recul. C’est l’amour qui se souvient. Soyez patient avec vous-même. Dieu l’est.</w:t>
+        <w:t xml:space="preserve">Le deuil n’est pas une ligne droite. Il y aura des jours meilleurs et des jours où tout reviendra d’un coup : un anniversaire, une chanson, une odeur, une place vide à table. Ce n’est pas un recul. C’est l’amour qui se souvient. Sois patient avec toi-même. Dieu l’est.</w:t>
       </w:r>
     </w:p>
     <w:p>
@@ -1708,15 +1995,8 @@
         <w:t xml:space="preserve">— Psaume 30.6</w:t>
       </w:r>
     </w:p>
-    <w:p>
-      <w:r>
-        <w:pict>
-          <v:rect style="width:0;height:1.5pt" o:hralign="center" o:hrstd="t" o:hr="t"/>
-        </w:pict>
-      </w:r>
-    </w:p>
-    <w:bookmarkEnd w:id="36"/>
-    <w:bookmarkStart w:id="37" w:name="quand-le-pourquoi-reste-sans-réponse"/>
+    <w:bookmarkEnd w:id="38"/>
+    <w:bookmarkStart w:id="39" w:name="quand-le-pourquoi-reste-sans-réponse"/>
     <w:p>
       <w:pPr>
         <w:pStyle w:val="Heading2"/>
@@ -1738,7 +2018,7 @@
         <w:pStyle w:val="BodyText"/>
       </w:pPr>
       <w:r>
-        <w:t xml:space="preserve">Je ne vais pas vous donner de réponses faciles. Je n’en ai pas. Et méfiez-vous de ceux qui en ont trop vite.</w:t>
+        <w:t xml:space="preserve">Je ne vais pas te donner de réponses faciles. Je n’en ai pas. Et méfie-toi de ceux qui en ont trop vite.</w:t>
       </w:r>
     </w:p>
     <w:p>
@@ -1784,7 +2064,7 @@
         <w:pStyle w:val="BodyText"/>
       </w:pPr>
       <w:r>
-        <w:t xml:space="preserve">Et s’il y a un « pourquoi » qui vous ronge, un « si seulement » (</w:t>
+        <w:t xml:space="preserve">Et s’il y a un « pourquoi » qui te ronge, un « si seulement » (</w:t>
       </w:r>
       <w:r>
         <w:rPr>
@@ -1794,7 +2074,7 @@
         <w:t xml:space="preserve">si seulement je l’avais accompagné, si seulement j’avais appelé, si seulement on était allé à un autre hôpital</w:t>
       </w:r>
       <w:r>
-        <w:t xml:space="preserve">), déposez-le devant Dieu. Moi aussi, j’ai longtemps porté ce samedi à 17 heures où j’ai continué mon chemin. Vous n’êtes pas le maître des horloges. Dieu seul l’est. Et ce que vous ne pouviez pas savoir, il ne vous le reproche pas.</w:t>
+        <w:t xml:space="preserve">), dépose-le devant Dieu. Moi aussi, j’ai longtemps porté ce samedi à 17 heures où j’ai continué mon chemin. Tu n’es pas le maître des horloges. Dieu seul l’est. Et ce que tu ne pouvais pas savoir, il ne te le reproche pas.</w:t>
       </w:r>
     </w:p>
     <w:p>
@@ -1835,15 +2115,8 @@
         <w:t xml:space="preserve">— Lamentations 3.22-23</w:t>
       </w:r>
     </w:p>
-    <w:p>
-      <w:r>
-        <w:pict>
-          <v:rect style="width:0;height:1.5pt" o:hralign="center" o:hrstd="t" o:hr="t"/>
-        </w:pict>
-      </w:r>
-    </w:p>
-    <w:bookmarkEnd w:id="37"/>
-    <w:bookmarkStart w:id="38" w:name="celui-qui-a-vaincu-la-mort"/>
+    <w:bookmarkEnd w:id="39"/>
+    <w:bookmarkStart w:id="40" w:name="celui-qui-a-vaincu-la-mort"/>
     <w:p>
       <w:pPr>
         <w:pStyle w:val="Heading2"/>
@@ -1966,15 +2239,8 @@
         <w:t xml:space="preserve">— 1 Corinthiens 15.55</w:t>
       </w:r>
     </w:p>
-    <w:p>
-      <w:r>
-        <w:pict>
-          <v:rect style="width:0;height:1.5pt" o:hralign="center" o:hrstd="t" o:hr="t"/>
-        </w:pict>
-      </w:r>
-    </w:p>
-    <w:bookmarkEnd w:id="38"/>
-    <w:bookmarkStart w:id="39" w:name="ils-ne-sont-pas-perdus"/>
+    <w:bookmarkEnd w:id="40"/>
+    <w:bookmarkStart w:id="41" w:name="ils-ne-sont-pas-perdus"/>
     <w:p>
       <w:pPr>
         <w:pStyle w:val="Heading2"/>
@@ -2060,7 +2326,7 @@
         <w:pStyle w:val="BodyText"/>
       </w:pPr>
       <w:r>
-        <w:t xml:space="preserve">Pensez à mon beau-père. Ce 10 août, il n’est pas arrivé à la convention. Mais il est arrivé ailleurs : dans une assemblée bien plus grande, devant le Maître qu’il avait servi. Son travail est achevé. Il se repose.</w:t>
+        <w:t xml:space="preserve">Pense à mon beau-père. Ce 10 août, il n’est pas arrivé à la convention. Mais il est arrivé ailleurs : dans une assemblée bien plus grande, devant le Maître qu’il avait servi. Son travail est achevé. Il se repose.</w:t>
       </w:r>
     </w:p>
     <w:p>
@@ -2126,7 +2392,7 @@
         <w:pStyle w:val="BodyText"/>
       </w:pPr>
       <w:r>
-        <w:t xml:space="preserve">Écoutez la promesse que l’apôtre Paul a écrite précisément pour des chrétiens en deuil :</w:t>
+        <w:t xml:space="preserve">Écoute la promesse que l’apôtre Paul a écrite précisément pour des chrétiens en deuil :</w:t>
       </w:r>
     </w:p>
     <w:p>
@@ -2192,7 +2458,7 @@
         <w:pStyle w:val="FirstParagraph"/>
       </w:pPr>
       <w:r>
-        <w:t xml:space="preserve">Remarquez : Paul ne dit pas « ne vous affligez pas ». Il dit « ne vous affligez pas</w:t>
+        <w:t xml:space="preserve">Remarque : Paul ne dit pas « ne vous affligez pas ». Il dit « ne vous affligez pas</w:t>
       </w:r>
       <w:r>
         <w:t xml:space="preserve"> </w:t>
@@ -2226,15 +2492,8 @@
         <w:t xml:space="preserve">Jésus-Christ.</w:t>
       </w:r>
     </w:p>
-    <w:p>
-      <w:r>
-        <w:pict>
-          <v:rect style="width:0;height:1.5pt" o:hralign="center" o:hrstd="t" o:hr="t"/>
-        </w:pict>
-      </w:r>
-    </w:p>
-    <w:bookmarkEnd w:id="39"/>
-    <w:bookmarkStart w:id="40" w:name="vivre-avec-labsence"/>
+    <w:bookmarkEnd w:id="41"/>
+    <w:bookmarkStart w:id="42" w:name="vivre-avec-labsence"/>
     <w:p>
       <w:pPr>
         <w:pStyle w:val="Heading2"/>
@@ -2268,13 +2527,13 @@
           <w:bCs/>
           <w:b/>
         </w:rPr>
-        <w:t xml:space="preserve">Vous n’êtes pas orphelin devant Dieu.</w:t>
-      </w:r>
-      <w:r>
-        <w:t xml:space="preserve"> </w:t>
-      </w:r>
-      <w:r>
-        <w:t xml:space="preserve">Si vous avez perdu un père, une mère, une seconde maman, Dieu se présente lui-même comme le Père de ceux qui n’en ont plus.</w:t>
+        <w:t xml:space="preserve">Tu n’es pas orphelin devant Dieu.</w:t>
+      </w:r>
+      <w:r>
+        <w:t xml:space="preserve"> </w:t>
+      </w:r>
+      <w:r>
+        <w:t xml:space="preserve">Si tu as perdu un père, une mère, une seconde maman, Dieu se présente lui-même comme le Père de ceux qui n’en ont plus.</w:t>
       </w:r>
     </w:p>
     <w:p>
@@ -2330,13 +2589,13 @@
           <w:bCs/>
           <w:b/>
         </w:rPr>
-        <w:t xml:space="preserve">Gardez le souvenir, mais ne vivez pas dans la tombe.</w:t>
-      </w:r>
-      <w:r>
-        <w:t xml:space="preserve"> </w:t>
-      </w:r>
-      <w:r>
-        <w:t xml:space="preserve">Parlez d’eux. Racontez leurs histoires à vos enfants. Le sourire de William, je le porte encore. Le souvenir n’est pas une blessure qu’il faut fermer ; c’est un trésor qu’il faut garder. Mais levez aussi les yeux : votre vie n’est pas finie, et Dieu a encore des projets pour vous.</w:t>
+        <w:t xml:space="preserve">Garde le souvenir, mais ne vis pas dans la tombe.</w:t>
+      </w:r>
+      <w:r>
+        <w:t xml:space="preserve"> </w:t>
+      </w:r>
+      <w:r>
+        <w:t xml:space="preserve">Parle d’eux. Raconte leurs histoires à tes enfants. Le sourire de William, je le porte encore. Le souvenir n’est pas une blessure qu’il faut fermer ; c’est un trésor qu’il faut garder. Mais lève aussi les yeux : ta vie n’est pas finie, et Dieu a encore des projets pour toi.</w:t>
       </w:r>
     </w:p>
     <w:p>
@@ -2348,13 +2607,13 @@
           <w:bCs/>
           <w:b/>
         </w:rPr>
-        <w:t xml:space="preserve">Honorez-les en vivant bien.</w:t>
-      </w:r>
-      <w:r>
-        <w:t xml:space="preserve"> </w:t>
-      </w:r>
-      <w:r>
-        <w:t xml:space="preserve">La plus belle façon d’honorer un homme calme et responsable, c’est de devenir à votre tour calme et responsable. La plus belle façon d’honorer une seconde maman, c’est d’aimer à votre tour comme elle a aimé.</w:t>
+        <w:t xml:space="preserve">Honore-les en vivant bien.</w:t>
+      </w:r>
+      <w:r>
+        <w:t xml:space="preserve"> </w:t>
+      </w:r>
+      <w:r>
+        <w:t xml:space="preserve">La plus belle façon d’honorer un homme calme et responsable, c’est de devenir à ton tour calme et responsable. La plus belle façon d’honorer une seconde maman, c’est d’aimer à ton tour comme elle a aimé.</w:t>
       </w:r>
     </w:p>
     <w:p>
@@ -2366,13 +2625,13 @@
           <w:bCs/>
           <w:b/>
         </w:rPr>
-        <w:t xml:space="preserve">Laissez-vous entourer.</w:t>
-      </w:r>
-      <w:r>
-        <w:t xml:space="preserve"> </w:t>
-      </w:r>
-      <w:r>
-        <w:t xml:space="preserve">Ne restez pas seul avec votre chagrin. Acceptez la visite, le repas apporté, la prière d’un frère ou d’une sœur. L’Église est une famille ; laissez-la vous porter.</w:t>
+        <w:t xml:space="preserve">Laisse-toi entourer.</w:t>
+      </w:r>
+      <w:r>
+        <w:t xml:space="preserve"> </w:t>
+      </w:r>
+      <w:r>
+        <w:t xml:space="preserve">Ne reste pas seul avec ton chagrin. Accepte la visite, le repas apporté, la prière d’un frère ou d’une sœur. L’Église est une famille ; laisse-la te porter.</w:t>
       </w:r>
     </w:p>
     <w:p>
@@ -2384,13 +2643,13 @@
           <w:bCs/>
           <w:b/>
         </w:rPr>
-        <w:t xml:space="preserve">Votre douleur deviendra un jour une consolation pour d’autres.</w:t>
-      </w:r>
-      <w:r>
-        <w:t xml:space="preserve"> </w:t>
-      </w:r>
-      <w:r>
-        <w:t xml:space="preserve">C’est peut-être le plus mystérieux : les larmes que vous versez aujourd’hui vous permettront demain de comprendre quelqu’un d’autre, mieux que personne.</w:t>
+        <w:t xml:space="preserve">Ta douleur deviendra un jour une consolation pour d’autres.</w:t>
+      </w:r>
+      <w:r>
+        <w:t xml:space="preserve"> </w:t>
+      </w:r>
+      <w:r>
+        <w:t xml:space="preserve">C’est peut-être le plus mystérieux : les larmes que tu verses aujourd’hui te permettront demain de comprendre quelqu’un d’autre, mieux que personne.</w:t>
       </w:r>
     </w:p>
     <w:p>
@@ -2443,16 +2702,9 @@
         <w:t xml:space="preserve">— Matthieu 5.4</w:t>
       </w:r>
     </w:p>
-    <w:p>
-      <w:r>
-        <w:pict>
-          <v:rect style="width:0;height:1.5pt" o:hralign="center" o:hrstd="t" o:hr="t"/>
-        </w:pict>
-      </w:r>
-    </w:p>
-    <w:bookmarkEnd w:id="40"/>
-    <w:bookmarkEnd w:id="41"/>
-    <w:bookmarkStart w:id="49" w:name="troisième-partie"/>
+    <w:bookmarkEnd w:id="42"/>
+    <w:bookmarkEnd w:id="43"/>
+    <w:bookmarkStart w:id="51" w:name="troisième-partie"/>
     <w:p>
       <w:pPr>
         <w:pStyle w:val="Heading1"/>
@@ -2461,7 +2713,7 @@
         <w:t xml:space="preserve">Troisième partie</w:t>
       </w:r>
     </w:p>
-    <w:bookmarkStart w:id="42" w:name="le-bon-choix"/>
+    <w:bookmarkStart w:id="44" w:name="le-bon-choix"/>
     <w:p>
       <w:pPr>
         <w:pStyle w:val="Heading2"/>
@@ -2470,15 +2722,8 @@
         <w:t xml:space="preserve">Le bon choix</w:t>
       </w:r>
     </w:p>
-    <w:p>
-      <w:r>
-        <w:pict>
-          <v:rect style="width:0;height:1.5pt" o:hralign="center" o:hrstd="t" o:hr="t"/>
-        </w:pict>
-      </w:r>
-    </w:p>
-    <w:bookmarkEnd w:id="42"/>
-    <w:bookmarkStart w:id="43" w:name="un-seul-chemin"/>
+    <w:bookmarkEnd w:id="44"/>
+    <w:bookmarkStart w:id="45" w:name="un-seul-chemin"/>
     <w:p>
       <w:pPr>
         <w:pStyle w:val="Heading2"/>
@@ -2697,7 +2942,7 @@
         <w:pStyle w:val="BodyText"/>
       </w:pPr>
       <w:r>
-        <w:t xml:space="preserve">Ce n’est pas une parole dure. C’est une parole d’amour. Si une maison brûlait et qu’il n’y avait qu’une seule porte de sortie, l’amour ne dirait pas : « Choisissez la sortie que vous préférez. » L’amour crierait : « Par ici ! Il n’y a que cette porte ! »</w:t>
+        <w:t xml:space="preserve">Ce n’est pas une parole dure. C’est une parole d’amour. Si ta maison brûlait et qu’il n’y avait qu’une seule porte de sortie, l’amour ne te dirait pas : « Choisis la sortie que tu préfères. » L’amour te crierait : « Par ici ! Il n’y a que cette porte ! »</w:t>
       </w:r>
     </w:p>
     <w:p>
@@ -2728,15 +2973,8 @@
         <w:t xml:space="preserve">— Jean 3.16</w:t>
       </w:r>
     </w:p>
-    <w:p>
-      <w:r>
-        <w:pict>
-          <v:rect style="width:0;height:1.5pt" o:hralign="center" o:hrstd="t" o:hr="t"/>
-        </w:pict>
-      </w:r>
-    </w:p>
-    <w:bookmarkEnd w:id="43"/>
-    <w:bookmarkStart w:id="44" w:name="aujourdhui"/>
+    <w:bookmarkEnd w:id="45"/>
+    <w:bookmarkStart w:id="46" w:name="aujourdhui"/>
     <w:p>
       <w:pPr>
         <w:pStyle w:val="Heading2"/>
@@ -2750,15 +2988,15 @@
         <w:pStyle w:val="FirstParagraph"/>
       </w:pPr>
       <w:r>
-        <w:t xml:space="preserve">Tout ce que vous avez lu jusqu’ici conduit à ce carrefour.</w:t>
-      </w:r>
-    </w:p>
-    <w:p>
-      <w:pPr>
-        <w:pStyle w:val="BodyText"/>
-      </w:pPr>
-      <w:r>
-        <w:t xml:space="preserve">Vous ne choisissez pas le jour de votre mort. William ne l’a pas choisi, ni tante Rachelle, ni mon beau-père. Mais vous pouvez choisir, aujourd’hui, où vous passerez l’éternité.</w:t>
+        <w:t xml:space="preserve">Tout ce que tu as lu jusqu’ici conduit à ce carrefour.</w:t>
+      </w:r>
+    </w:p>
+    <w:p>
+      <w:pPr>
+        <w:pStyle w:val="BodyText"/>
+      </w:pPr>
+      <w:r>
+        <w:t xml:space="preserve">Tu ne choisis pas le jour de ta mort. William ne l’a pas choisi, ni tante Rachelle, ni mon beau-père. Mais tu peux choisir, aujourd’hui, où tu passeras l’éternité.</w:t>
       </w:r>
     </w:p>
     <w:p>
@@ -2778,7 +3016,7 @@
         <w:pStyle w:val="BodyText"/>
       </w:pPr>
       <w:r>
-        <w:t xml:space="preserve">Ne remettez pas ce choix à demain. Le plus grand piège n’est pas de dire « non » à Dieu. C’est de lui dire « plus tard ».</w:t>
+        <w:t xml:space="preserve">Ne remets pas ce choix à demain. Le plus grand piège n’est pas de dire « non » à Dieu. C’est de lui dire « plus tard ».</w:t>
       </w:r>
     </w:p>
     <w:p>
@@ -2846,13 +3084,13 @@
           <w:bCs/>
           <w:b/>
         </w:rPr>
-        <w:t xml:space="preserve">Reconnaissez</w:t>
-      </w:r>
-      <w:r>
-        <w:t xml:space="preserve"> </w:t>
-      </w:r>
-      <w:r>
-        <w:t xml:space="preserve">que vous êtes pécheur et que vous ne pouvez pas vous sauver vous-même.</w:t>
+        <w:t xml:space="preserve">Reconnais</w:t>
+      </w:r>
+      <w:r>
+        <w:t xml:space="preserve"> </w:t>
+      </w:r>
+      <w:r>
+        <w:t xml:space="preserve">que tu es pécheur et que tu ne peux pas te sauver toi-même.</w:t>
       </w:r>
     </w:p>
     <w:p>
@@ -2868,13 +3106,13 @@
           <w:bCs/>
           <w:b/>
         </w:rPr>
-        <w:t xml:space="preserve">Croyez</w:t>
-      </w:r>
-      <w:r>
-        <w:t xml:space="preserve"> </w:t>
-      </w:r>
-      <w:r>
-        <w:t xml:space="preserve">que Jésus est mort à votre place sur la croix et qu’il est ressuscité.</w:t>
+        <w:t xml:space="preserve">Crois</w:t>
+      </w:r>
+      <w:r>
+        <w:t xml:space="preserve"> </w:t>
+      </w:r>
+      <w:r>
+        <w:t xml:space="preserve">que Jésus est mort à ta place sur la croix et qu’il est ressuscité.</w:t>
       </w:r>
     </w:p>
     <w:p>
@@ -2890,13 +3128,13 @@
           <w:bCs/>
           <w:b/>
         </w:rPr>
-        <w:t xml:space="preserve">Recevez-le</w:t>
-      </w:r>
-      <w:r>
-        <w:t xml:space="preserve"> </w:t>
-      </w:r>
-      <w:r>
-        <w:t xml:space="preserve">dans votre vie comme votre Sauveur et votre Seigneur.</w:t>
+        <w:t xml:space="preserve">Reçois-le</w:t>
+      </w:r>
+      <w:r>
+        <w:t xml:space="preserve"> </w:t>
+      </w:r>
+      <w:r>
+        <w:t xml:space="preserve">dans ta vie comme ton Sauveur et ton Seigneur.</w:t>
       </w:r>
     </w:p>
     <w:p>
@@ -2912,7 +3150,7 @@
           <w:bCs/>
           <w:b/>
         </w:rPr>
-        <w:t xml:space="preserve">Suivez-le</w:t>
+        <w:t xml:space="preserve">Suis-le</w:t>
       </w:r>
       <w:r>
         <w:t xml:space="preserve"> </w:t>
@@ -2948,7 +3186,703 @@
         <w:pStyle w:val="FirstParagraph"/>
       </w:pPr>
       <w:r>
-        <w:t xml:space="preserve">Si votre cœur est touché, ne laissez pas passer ce moment. Vous pouvez prier là où vous êtes, avec vos propres mots ou avec ceux-ci :</w:t>
+        <w:t xml:space="preserve">Si ton cœur est touché, ne laisse pas passer ce moment. Tu peux prier là où tu es, avec tes propres mots ou avec ceux-ci :</w:t>
+      </w:r>
+    </w:p>
+    <w:p>
+      <w:pPr>
+        <w:pStyle w:val="BlockText"/>
+      </w:pPr>
+      <w:r>
+        <w:rPr>
+          <w:iCs/>
+          <w:i/>
+        </w:rPr>
+        <w:t xml:space="preserve">Seigneur Jésus,</w:t>
+      </w:r>
+    </w:p>
+    <w:p>
+      <w:pPr>
+        <w:pStyle w:val="BlockText"/>
+      </w:pPr>
+      <w:r>
+        <w:rPr>
+          <w:iCs/>
+          <w:i/>
+        </w:rPr>
+        <w:t xml:space="preserve">Aujourd’hui, je comprends que ma vie est courte et que mon horloge peut s’arrêter à tout moment.</w:t>
+      </w:r>
+      <w:r>
+        <w:t xml:space="preserve"> </w:t>
+      </w:r>
+      <w:r>
+        <w:rPr>
+          <w:iCs/>
+          <w:i/>
+        </w:rPr>
+        <w:t xml:space="preserve">Je reconnais que je suis pécheur et que je ne peux pas me sauver moi-même.</w:t>
+      </w:r>
+      <w:r>
+        <w:t xml:space="preserve"> </w:t>
+      </w:r>
+      <w:r>
+        <w:rPr>
+          <w:iCs/>
+          <w:i/>
+        </w:rPr>
+        <w:t xml:space="preserve">Je crois que tu es mort sur la croix pour mes péchés et que tu es ressuscité le troisième jour.</w:t>
+      </w:r>
+      <w:r>
+        <w:t xml:space="preserve"> </w:t>
+      </w:r>
+      <w:r>
+        <w:rPr>
+          <w:iCs/>
+          <w:i/>
+        </w:rPr>
+        <w:t xml:space="preserve">Je t’ouvre la porte de mon cœur.</w:t>
+      </w:r>
+      <w:r>
+        <w:t xml:space="preserve"> </w:t>
+      </w:r>
+      <w:r>
+        <w:rPr>
+          <w:iCs/>
+          <w:i/>
+        </w:rPr>
+        <w:t xml:space="preserve">Pardonne-moi, lave-moi, et deviens mon Sauveur et mon Seigneur.</w:t>
+      </w:r>
+      <w:r>
+        <w:t xml:space="preserve"> </w:t>
+      </w:r>
+      <w:r>
+        <w:rPr>
+          <w:iCs/>
+          <w:i/>
+        </w:rPr>
+        <w:t xml:space="preserve">Console-moi dans mon deuil, porte ce que je ne peux plus porter,</w:t>
+      </w:r>
+      <w:r>
+        <w:t xml:space="preserve"> </w:t>
+      </w:r>
+      <w:r>
+        <w:rPr>
+          <w:iCs/>
+          <w:i/>
+        </w:rPr>
+        <w:t xml:space="preserve">et conduis-moi chaque jour jusqu’à la maison du Père.</w:t>
+      </w:r>
+    </w:p>
+    <w:p>
+      <w:pPr>
+        <w:pStyle w:val="BlockText"/>
+      </w:pPr>
+      <w:r>
+        <w:rPr>
+          <w:iCs/>
+          <w:i/>
+        </w:rPr>
+        <w:t xml:space="preserve">Au nom de Jésus. Amen.</w:t>
+      </w:r>
+    </w:p>
+    <w:p>
+      <w:pPr>
+        <w:pStyle w:val="FirstParagraph"/>
+      </w:pPr>
+      <w:r>
+        <w:t xml:space="preserve">Si tu as fait cette prière sincèrement, voici ce que Dieu dit de toi désormais :</w:t>
+      </w:r>
+    </w:p>
+    <w:p>
+      <w:pPr>
+        <w:pStyle w:val="BlockText"/>
+      </w:pPr>
+      <w:r>
+        <w:t xml:space="preserve">« Mais à tous ceux qui l’ont reçue, à ceux qui croient en son nom,</w:t>
+      </w:r>
+      <w:r>
+        <w:t xml:space="preserve"> </w:t>
+      </w:r>
+      <w:r>
+        <w:t xml:space="preserve">elle a donné le pouvoir de devenir enfants de Dieu. »</w:t>
+      </w:r>
+    </w:p>
+    <w:p>
+      <w:pPr>
+        <w:pStyle w:val="BlockText"/>
+      </w:pPr>
+      <w:r>
+        <w:t xml:space="preserve">— Jean 1.12</w:t>
+      </w:r>
+    </w:p>
+    <w:p>
+      <w:pPr>
+        <w:pStyle w:val="FirstParagraph"/>
+      </w:pPr>
+      <w:r>
+        <w:t xml:space="preserve">Tu n’es plus seul. Tu ne le seras plus jamais, ni dans la vie, ni dans la mort, ni au-delà. Rejoins une église qui annonce fidèlement l’Évangile, procure-toi une Bible, commence par l’Évangile de Jean, et parle à Dieu chaque jour comme on parle à un Père.</w:t>
+      </w:r>
+    </w:p>
+    <w:bookmarkEnd w:id="46"/>
+    <w:bookmarkStart w:id="47" w:name="voyageurs-sur-la-terre"/>
+    <w:p>
+      <w:pPr>
+        <w:pStyle w:val="Heading2"/>
+      </w:pPr>
+      <w:r>
+        <w:t xml:space="preserve">15. Voyageurs sur la terre</w:t>
+      </w:r>
+    </w:p>
+    <w:p>
+      <w:pPr>
+        <w:pStyle w:val="FirstParagraph"/>
+      </w:pPr>
+      <w:r>
+        <w:t xml:space="preserve">Il y a une dernière chose que la mort de ceux que nous aimons vient nous rappeler :</w:t>
+      </w:r>
+      <w:r>
+        <w:t xml:space="preserve"> </w:t>
+      </w:r>
+      <w:r>
+        <w:rPr>
+          <w:bCs/>
+          <w:b/>
+        </w:rPr>
+        <w:t xml:space="preserve">nous ne sommes pas d’ici.</w:t>
+      </w:r>
+    </w:p>
+    <w:p>
+      <w:pPr>
+        <w:pStyle w:val="BodyText"/>
+      </w:pPr>
+      <w:r>
+        <w:t xml:space="preserve">Nous sommes des voyageurs. La terre n’est pas notre maison ; elle est notre route. Les hommes et les femmes de foi de la Bible l’avaient compris :</w:t>
+      </w:r>
+    </w:p>
+    <w:p>
+      <w:pPr>
+        <w:pStyle w:val="BlockText"/>
+      </w:pPr>
+      <w:r>
+        <w:t xml:space="preserve">« Ils ont reconnu qu’ils étaient étrangers et voyageurs sur la terre. »</w:t>
+      </w:r>
+    </w:p>
+    <w:p>
+      <w:pPr>
+        <w:pStyle w:val="BlockText"/>
+      </w:pPr>
+      <w:r>
+        <w:t xml:space="preserve">— Hébreux 11.13</w:t>
+      </w:r>
+    </w:p>
+    <w:p>
+      <w:pPr>
+        <w:pStyle w:val="BlockText"/>
+      </w:pPr>
+      <w:r>
+        <w:t xml:space="preserve">« Car nous n’avons point ici-bas de cité permanente,</w:t>
+      </w:r>
+      <w:r>
+        <w:t xml:space="preserve"> </w:t>
+      </w:r>
+      <w:r>
+        <w:t xml:space="preserve">mais nous cherchons celle qui est à venir. »</w:t>
+      </w:r>
+    </w:p>
+    <w:p>
+      <w:pPr>
+        <w:pStyle w:val="BlockText"/>
+      </w:pPr>
+      <w:r>
+        <w:t xml:space="preserve">— Hébreux 13.14</w:t>
+      </w:r>
+    </w:p>
+    <w:p>
+      <w:pPr>
+        <w:pStyle w:val="FirstParagraph"/>
+      </w:pPr>
+      <w:r>
+        <w:t xml:space="preserve">Un voyageur ne s’attache pas trop à la chambre où il passe la nuit. Il en prend soin, il y vit, il en est reconnaissant, mais il sait qu’il repartira. Il voyage léger. Il garde les yeux sur sa destination.</w:t>
+      </w:r>
+    </w:p>
+    <w:p>
+      <w:pPr>
+        <w:pStyle w:val="BodyText"/>
+      </w:pPr>
+      <w:r>
+        <w:t xml:space="preserve">Voici ce que cela change, concrètement, pour les jours qui te restent :</w:t>
+      </w:r>
+    </w:p>
+    <w:p>
+      <w:pPr>
+        <w:pStyle w:val="BodyText"/>
+      </w:pPr>
+      <w:r>
+        <w:rPr>
+          <w:bCs/>
+          <w:b/>
+        </w:rPr>
+        <w:t xml:space="preserve">Dis « je t’aime » aux vivants.</w:t>
+      </w:r>
+      <w:r>
+        <w:t xml:space="preserve"> </w:t>
+      </w:r>
+      <w:r>
+        <w:t xml:space="preserve">N’attends pas de le dire devant un cercueil. Les fleurs les plus précieuses sont celles qu’on offre à ceux qui peuvent encore les sentir.</w:t>
+      </w:r>
+    </w:p>
+    <w:p>
+      <w:pPr>
+        <w:pStyle w:val="BodyText"/>
+      </w:pPr>
+      <w:r>
+        <w:rPr>
+          <w:bCs/>
+          <w:b/>
+        </w:rPr>
+        <w:t xml:space="preserve">Pardonne vite.</w:t>
+      </w:r>
+      <w:r>
+        <w:t xml:space="preserve"> </w:t>
+      </w:r>
+      <w:r>
+        <w:t xml:space="preserve">La rancune est un bagage trop lourd pour un voyage si court.</w:t>
+      </w:r>
+    </w:p>
+    <w:p>
+      <w:pPr>
+        <w:pStyle w:val="BodyText"/>
+      </w:pPr>
+      <w:r>
+        <w:rPr>
+          <w:bCs/>
+          <w:b/>
+        </w:rPr>
+        <w:t xml:space="preserve">Investis dans ce qui dure.</w:t>
+      </w:r>
+      <w:r>
+        <w:t xml:space="preserve"> </w:t>
+      </w:r>
+      <w:r>
+        <w:t xml:space="preserve">Les maisons et les comptes en banque resteront ici. Une âme conduite à Christ, un enfant élevé dans la foi, un pauvre secouru au nom de Jésus : cela, tu le retrouveras dans l’éternité.</w:t>
+      </w:r>
+    </w:p>
+    <w:p>
+      <w:pPr>
+        <w:pStyle w:val="BodyText"/>
+      </w:pPr>
+      <w:r>
+        <w:rPr>
+          <w:bCs/>
+          <w:b/>
+        </w:rPr>
+        <w:t xml:space="preserve">Parle de Jésus à ceux que tu aimes.</w:t>
+      </w:r>
+      <w:r>
+        <w:t xml:space="preserve"> </w:t>
+      </w:r>
+      <w:r>
+        <w:t xml:space="preserve">Le plus grand héritage que tu puisses laisser n’est ni une terre ni un compte en banque, c’est la foi.</w:t>
+      </w:r>
+    </w:p>
+    <w:p>
+      <w:pPr>
+        <w:pStyle w:val="BodyText"/>
+      </w:pPr>
+      <w:r>
+        <w:rPr>
+          <w:bCs/>
+          <w:b/>
+        </w:rPr>
+        <w:t xml:space="preserve">Tiens-toi prêt, mais sans angoisse.</w:t>
+      </w:r>
+      <w:r>
+        <w:t xml:space="preserve"> </w:t>
+      </w:r>
+      <w:r>
+        <w:t xml:space="preserve">Que tes relations soient en paix, et ton âme en règle avec Dieu. Alors, que l’horloge s’arrête un samedi à 17 heures ou dans cinquante ans, tu seras prêt.</w:t>
+      </w:r>
+    </w:p>
+    <w:p>
+      <w:pPr>
+        <w:pStyle w:val="BlockText"/>
+      </w:pPr>
+      <w:r>
+        <w:t xml:space="preserve">« Mais notre cité à nous est dans les cieux,</w:t>
+      </w:r>
+      <w:r>
+        <w:t xml:space="preserve"> </w:t>
+      </w:r>
+      <w:r>
+        <w:t xml:space="preserve">d’où nous attendons aussi comme Sauveur le Seigneur Jésus-Christ. »</w:t>
+      </w:r>
+    </w:p>
+    <w:p>
+      <w:pPr>
+        <w:pStyle w:val="BlockText"/>
+      </w:pPr>
+      <w:r>
+        <w:t xml:space="preserve">— Philippiens 3.20</w:t>
+      </w:r>
+    </w:p>
+    <w:bookmarkEnd w:id="47"/>
+    <w:bookmarkStart w:id="48" w:name="au-revoir-et-non-adieu"/>
+    <w:p>
+      <w:pPr>
+        <w:pStyle w:val="Heading2"/>
+      </w:pPr>
+      <w:r>
+        <w:t xml:space="preserve">Au revoir, et non adieu</w:t>
+      </w:r>
+    </w:p>
+    <w:p>
+      <w:pPr>
+        <w:pStyle w:val="FirstParagraph"/>
+      </w:pPr>
+      <w:r>
+        <w:t xml:space="preserve">Un jour, ce sera mon tour. Un jour, ce sera le tien.</w:t>
+      </w:r>
+    </w:p>
+    <w:p>
+      <w:pPr>
+        <w:pStyle w:val="BodyText"/>
+      </w:pPr>
+      <w:r>
+        <w:t xml:space="preserve">On nous couchera dans un cercueil, avec un habit que nous n’aurons pas choisi. On veillera sous un chapiteau. Les vivants auront faim, et ils mangeront ; ils auront sommeil, et ils dormiront. Puis on nous mettra en terre, et chacun rentrera chez soi. C’est ainsi. Il n’y a rien de honteux à cela.</w:t>
+      </w:r>
+    </w:p>
+    <w:p>
+      <w:pPr>
+        <w:pStyle w:val="BodyText"/>
+      </w:pPr>
+      <w:r>
+        <w:t xml:space="preserve">Mais pour celui qui appartient à Jésus, ce jour-là ne sera pas une fin. Il ne sera pas dans ce cercueil. Il sera dans la maison du Père, à la place que Jésus est allé préparer pour lui.</w:t>
+      </w:r>
+    </w:p>
+    <w:p>
+      <w:pPr>
+        <w:pStyle w:val="BlockText"/>
+      </w:pPr>
+      <w:r>
+        <w:t xml:space="preserve">« Que votre cœur ne se trouble point. Croyez en Dieu, et croyez en moi.</w:t>
+      </w:r>
+      <w:r>
+        <w:t xml:space="preserve"> </w:t>
+      </w:r>
+      <w:r>
+        <w:t xml:space="preserve">Il y a plusieurs demeures dans la maison de mon Père.</w:t>
+      </w:r>
+      <w:r>
+        <w:t xml:space="preserve"> </w:t>
+      </w:r>
+      <w:r>
+        <w:t xml:space="preserve">Si cela n’était pas, je vous l’aurais dit.</w:t>
+      </w:r>
+      <w:r>
+        <w:t xml:space="preserve"> </w:t>
+      </w:r>
+      <w:r>
+        <w:t xml:space="preserve">Je vais vous préparer une place. »</w:t>
+      </w:r>
+    </w:p>
+    <w:p>
+      <w:pPr>
+        <w:pStyle w:val="BlockText"/>
+      </w:pPr>
+      <w:r>
+        <w:t xml:space="preserve">— Jean 14.1-2</w:t>
+      </w:r>
+    </w:p>
+    <w:p>
+      <w:pPr>
+        <w:pStyle w:val="FirstParagraph"/>
+      </w:pPr>
+      <w:r>
+        <w:t xml:space="preserve">William, Rachelle, Koffi François : tous trois ont mis leur foi en Jésus-Christ. Alors je ne leur ai pas dit adieu. Je reverrai le sourire de William. Je reverrai le visage de ma tante Rachelle, ma seconde maman. Je reverrai mon beau-père, le pasteur Koffi François, qui a servi ce Seigneur jusqu’au dernier jour. Et je prie pour que toi aussi, tu puisses revoir ceux que tu pleures, dans ce matin où il n’y aura plus de nuit.</w:t>
+      </w:r>
+    </w:p>
+    <w:p>
+      <w:pPr>
+        <w:pStyle w:val="BodyText"/>
+      </w:pPr>
+      <w:r>
+        <w:t xml:space="preserve">Là-bas, il n’y aura plus de cercueil, plus de veillée, plus de séparation. Plus d’enfant qui part au marché et ne revient pas. Plus de maternité d’où une mère ne revient pas. Plus de route qui ne mène pas à destination. Plus de téléphone qui sonne pour annoncer une mauvaise nouvelle.</w:t>
+      </w:r>
+    </w:p>
+    <w:p>
+      <w:pPr>
+        <w:pStyle w:val="BlockText"/>
+      </w:pPr>
+      <w:r>
+        <w:t xml:space="preserve">« Il essuiera toute larme de leurs yeux, et la mort ne sera plus,</w:t>
+      </w:r>
+      <w:r>
+        <w:t xml:space="preserve"> </w:t>
+      </w:r>
+      <w:r>
+        <w:t xml:space="preserve">et il n’y aura plus ni deuil, ni cri, ni douleur,</w:t>
+      </w:r>
+      <w:r>
+        <w:t xml:space="preserve"> </w:t>
+      </w:r>
+      <w:r>
+        <w:t xml:space="preserve">car les premières choses ont disparu. »</w:t>
+      </w:r>
+    </w:p>
+    <w:p>
+      <w:pPr>
+        <w:pStyle w:val="BlockText"/>
+      </w:pPr>
+      <w:r>
+        <w:t xml:space="preserve">— Apocalypse 21.4</w:t>
+      </w:r>
+    </w:p>
+    <w:p>
+      <w:pPr>
+        <w:pStyle w:val="FirstParagraph"/>
+      </w:pPr>
+      <w:r>
+        <w:t xml:space="preserve">Alors, pleure si tu en as besoin. Mais pleure avec espérance. Et vis de telle sorte que, lorsque ton horloge s’arrêtera, ce ne soit pas un adieu.</w:t>
+      </w:r>
+    </w:p>
+    <w:p>
+      <w:pPr>
+        <w:pStyle w:val="BodyText"/>
+      </w:pPr>
+      <w:r>
+        <w:t xml:space="preserve">Seulement un au revoir.</w:t>
+      </w:r>
+    </w:p>
+    <w:bookmarkEnd w:id="48"/>
+    <w:bookmarkStart w:id="49" w:name="pour-les-jours-de-larmes"/>
+    <w:p>
+      <w:pPr>
+        <w:pStyle w:val="Heading2"/>
+      </w:pPr>
+      <w:r>
+        <w:t xml:space="preserve">Pour les jours de larmes</w:t>
+      </w:r>
+    </w:p>
+    <w:p>
+      <w:pPr>
+        <w:pStyle w:val="FirstParagraph"/>
+      </w:pPr>
+      <w:r>
+        <w:rPr>
+          <w:iCs/>
+          <w:i/>
+        </w:rPr>
+        <w:t xml:space="preserve">Quelques paroles de Dieu à relire quand le deuil pèse trop lourd.</w:t>
+      </w:r>
+    </w:p>
+    <w:p>
+      <w:pPr>
+        <w:pStyle w:val="BlockText"/>
+      </w:pPr>
+      <w:r>
+        <w:t xml:space="preserve">« Venez à moi, vous tous qui êtes fatigués et chargés, et je vous donnerai du repos. » — Matthieu 11.28</w:t>
+      </w:r>
+    </w:p>
+    <w:p>
+      <w:pPr>
+        <w:pStyle w:val="BlockText"/>
+      </w:pPr>
+      <w:r>
+        <w:t xml:space="preserve">« Quand je marche dans la vallée de l’ombre de la mort, je ne crains aucun mal, car tu es avec moi. » — Psaume 23.4</w:t>
+      </w:r>
+    </w:p>
+    <w:p>
+      <w:pPr>
+        <w:pStyle w:val="BlockText"/>
+      </w:pPr>
+      <w:r>
+        <w:t xml:space="preserve">« Si tu traverses les eaux, je serai avec toi ; et les fleuves, ils ne te submergeront point. » — Ésaïe 43.2</w:t>
+      </w:r>
+    </w:p>
+    <w:p>
+      <w:pPr>
+        <w:pStyle w:val="BlockText"/>
+      </w:pPr>
+      <w:r>
+        <w:t xml:space="preserve">« Il y a un temps pour tout… un temps pour naître, et un temps pour mourir. » — Ecclésiaste 3.1-2</w:t>
+      </w:r>
+    </w:p>
+    <w:p>
+      <w:pPr>
+        <w:pStyle w:val="BlockText"/>
+      </w:pPr>
+      <w:r>
+        <w:t xml:space="preserve">« L’herbe sèche, la fleur tombe ; mais la parole de notre Dieu subsiste éternellement. » — Ésaïe 40.8</w:t>
+      </w:r>
+    </w:p>
+    <w:p>
+      <w:pPr>
+        <w:pStyle w:val="BlockText"/>
+      </w:pPr>
+      <w:r>
+        <w:t xml:space="preserve">« Car Christ est ma vie, et la mort m’est un gain. » — Philippiens 1.21</w:t>
+      </w:r>
+    </w:p>
+    <w:p>
+      <w:pPr>
+        <w:pStyle w:val="BlockText"/>
+      </w:pPr>
+      <w:r>
+        <w:t xml:space="preserve">« Celui qui a le Fils a la vie ; celui qui n’a pas le Fils de Dieu n’a pas la vie. » — 1 Jean 5.12</w:t>
+      </w:r>
+    </w:p>
+    <w:p>
+      <w:pPr>
+        <w:pStyle w:val="BlockText"/>
+      </w:pPr>
+      <w:r>
+        <w:t xml:space="preserve">« Je te le dis en vérité, aujourd’hui tu seras avec moi dans le paradis. » — Luc 23.43</w:t>
+      </w:r>
+    </w:p>
+    <w:bookmarkEnd w:id="49"/>
+    <w:bookmarkStart w:id="50" w:name="prière-pour-ceux-qui-pleurent"/>
+    <w:p>
+      <w:pPr>
+        <w:pStyle w:val="Heading2"/>
+      </w:pPr>
+      <w:r>
+        <w:t xml:space="preserve">Prière pour ceux qui pleurent</w:t>
+      </w:r>
+    </w:p>
+    <w:p>
+      <w:pPr>
+        <w:pStyle w:val="BlockText"/>
+      </w:pPr>
+      <w:r>
+        <w:rPr>
+          <w:iCs/>
+          <w:i/>
+        </w:rPr>
+        <w:t xml:space="preserve">Père céleste,</w:t>
+      </w:r>
+    </w:p>
+    <w:p>
+      <w:pPr>
+        <w:pStyle w:val="BlockText"/>
+      </w:pPr>
+      <w:r>
+        <w:rPr>
+          <w:iCs/>
+          <w:i/>
+        </w:rPr>
+        <w:t xml:space="preserve">Tu vois mon cœur brisé. Tu connais le nom de celui ou celle que j’ai perdu.</w:t>
+      </w:r>
+      <w:r>
+        <w:t xml:space="preserve"> </w:t>
+      </w:r>
+      <w:r>
+        <w:rPr>
+          <w:iCs/>
+          <w:i/>
+        </w:rPr>
+        <w:t xml:space="preserve">Tu sais combien la maison est vide et combien les nuits sont longues.</w:t>
+      </w:r>
+      <w:r>
+        <w:t xml:space="preserve"> </w:t>
+      </w:r>
+      <w:r>
+        <w:rPr>
+          <w:iCs/>
+          <w:i/>
+        </w:rPr>
+        <w:t xml:space="preserve">Je ne comprends pas tout, mais je choisis de te faire confiance.</w:t>
+      </w:r>
+      <w:r>
+        <w:t xml:space="preserve"> </w:t>
+      </w:r>
+      <w:r>
+        <w:rPr>
+          <w:iCs/>
+          <w:i/>
+        </w:rPr>
+        <w:t xml:space="preserve">Toi qui as pleuré devant le tombeau de Lazare, pleure avec moi.</w:t>
+      </w:r>
+      <w:r>
+        <w:t xml:space="preserve"> </w:t>
+      </w:r>
+      <w:r>
+        <w:rPr>
+          <w:iCs/>
+          <w:i/>
+        </w:rPr>
+        <w:t xml:space="preserve">Toi qui as vaincu la mort, donne-moi ton espérance.</w:t>
+      </w:r>
+      <w:r>
+        <w:t xml:space="preserve"> </w:t>
+      </w:r>
+      <w:r>
+        <w:rPr>
+          <w:iCs/>
+          <w:i/>
+        </w:rPr>
+        <w:t xml:space="preserve">Recueille mes larmes, guéris mes souvenirs,</w:t>
+      </w:r>
+      <w:r>
+        <w:t xml:space="preserve"> </w:t>
+      </w:r>
+      <w:r>
+        <w:rPr>
+          <w:iCs/>
+          <w:i/>
+        </w:rPr>
+        <w:t xml:space="preserve">garde-moi de l’amertume, de la culpabilité et du désespoir.</w:t>
+      </w:r>
+      <w:r>
+        <w:t xml:space="preserve"> </w:t>
+      </w:r>
+      <w:r>
+        <w:rPr>
+          <w:iCs/>
+          <w:i/>
+        </w:rPr>
+        <w:t xml:space="preserve">Apprends-moi à compter mes jours,</w:t>
+      </w:r>
+      <w:r>
+        <w:t xml:space="preserve"> </w:t>
+      </w:r>
+      <w:r>
+        <w:rPr>
+          <w:iCs/>
+          <w:i/>
+        </w:rPr>
+        <w:t xml:space="preserve">et à marcher sur cette terre comme un voyageur qui rentre à la maison.</w:t>
+      </w:r>
+      <w:r>
+        <w:t xml:space="preserve"> </w:t>
+      </w:r>
+      <w:r>
+        <w:rPr>
+          <w:iCs/>
+          <w:i/>
+        </w:rPr>
+        <w:t xml:space="preserve">Et le jour où mon horloge s’arrêtera, reçois-moi auprès de toi,</w:t>
+      </w:r>
+      <w:r>
+        <w:t xml:space="preserve"> </w:t>
+      </w:r>
+      <w:r>
+        <w:rPr>
+          <w:iCs/>
+          <w:i/>
+        </w:rPr>
+        <w:t xml:space="preserve">par Jésus-Christ, mon Sauveur.</w:t>
+      </w:r>
+    </w:p>
+    <w:p>
+      <w:pPr>
+        <w:pStyle w:val="BlockText"/>
+      </w:pPr>
+      <w:r>
+        <w:rPr>
+          <w:iCs/>
+          <w:i/>
+        </w:rPr>
+        <w:t xml:space="preserve">Amen.</w:t>
       </w:r>
     </w:p>
     <w:p>
@@ -2960,756 +3894,18 @@
     </w:p>
     <w:p>
       <w:pPr>
-        <w:pStyle w:val="BlockText"/>
+        <w:pStyle w:val="FirstParagraph"/>
       </w:pPr>
       <w:r>
         <w:rPr>
           <w:iCs/>
           <w:i/>
         </w:rPr>
-        <w:t xml:space="preserve">Seigneur Jésus,</w:t>
-      </w:r>
-    </w:p>
-    <w:p>
-      <w:pPr>
-        <w:pStyle w:val="BlockText"/>
-      </w:pPr>
-      <w:r>
-        <w:rPr>
-          <w:iCs/>
-          <w:i/>
-        </w:rPr>
-        <w:t xml:space="preserve">Aujourd’hui, je comprends que ma vie est courte et que mon horloge peut s’arrêter à tout moment.</w:t>
-      </w:r>
-      <w:r>
-        <w:t xml:space="preserve"> </w:t>
-      </w:r>
-      <w:r>
-        <w:rPr>
-          <w:iCs/>
-          <w:i/>
-        </w:rPr>
-        <w:t xml:space="preserve">Je reconnais que je suis pécheur et que je ne peux pas me sauver moi-même.</w:t>
-      </w:r>
-      <w:r>
-        <w:t xml:space="preserve"> </w:t>
-      </w:r>
-      <w:r>
-        <w:rPr>
-          <w:iCs/>
-          <w:i/>
-        </w:rPr>
-        <w:t xml:space="preserve">Je crois que tu es mort sur la croix pour mes péchés et que tu es ressuscité le troisième jour.</w:t>
-      </w:r>
-      <w:r>
-        <w:t xml:space="preserve"> </w:t>
-      </w:r>
-      <w:r>
-        <w:rPr>
-          <w:iCs/>
-          <w:i/>
-        </w:rPr>
-        <w:t xml:space="preserve">Je t’ouvre la porte de mon cœur.</w:t>
-      </w:r>
-      <w:r>
-        <w:t xml:space="preserve"> </w:t>
-      </w:r>
-      <w:r>
-        <w:rPr>
-          <w:iCs/>
-          <w:i/>
-        </w:rPr>
-        <w:t xml:space="preserve">Pardonne-moi, lave-moi, et deviens mon Sauveur et mon Seigneur.</w:t>
-      </w:r>
-      <w:r>
-        <w:t xml:space="preserve"> </w:t>
-      </w:r>
-      <w:r>
-        <w:rPr>
-          <w:iCs/>
-          <w:i/>
-        </w:rPr>
-        <w:t xml:space="preserve">Console-moi dans mon deuil, porte ce que je ne peux plus porter,</w:t>
-      </w:r>
-      <w:r>
-        <w:t xml:space="preserve"> </w:t>
-      </w:r>
-      <w:r>
-        <w:rPr>
-          <w:iCs/>
-          <w:i/>
-        </w:rPr>
-        <w:t xml:space="preserve">et conduis-moi chaque jour jusqu’à la maison du Père.</w:t>
-      </w:r>
-    </w:p>
-    <w:p>
-      <w:pPr>
-        <w:pStyle w:val="BlockText"/>
-      </w:pPr>
-      <w:r>
-        <w:rPr>
-          <w:iCs/>
-          <w:i/>
-        </w:rPr>
-        <w:t xml:space="preserve">Au nom de Jésus. Amen.</w:t>
-      </w:r>
-    </w:p>
-    <w:p>
-      <w:r>
-        <w:pict>
-          <v:rect style="width:0;height:1.5pt" o:hralign="center" o:hrstd="t" o:hr="t"/>
-        </w:pict>
-      </w:r>
-    </w:p>
-    <w:p>
-      <w:pPr>
-        <w:pStyle w:val="FirstParagraph"/>
-      </w:pPr>
-      <w:r>
-        <w:t xml:space="preserve">Si vous avez fait cette prière sincèrement, voici ce que Dieu dit de vous désormais :</w:t>
-      </w:r>
-    </w:p>
-    <w:p>
-      <w:pPr>
-        <w:pStyle w:val="BlockText"/>
-      </w:pPr>
-      <w:r>
-        <w:t xml:space="preserve">« Mais à tous ceux qui l’ont reçue, à ceux qui croient en son nom,</w:t>
-      </w:r>
-      <w:r>
-        <w:t xml:space="preserve"> </w:t>
-      </w:r>
-      <w:r>
-        <w:t xml:space="preserve">elle a donné le pouvoir de devenir enfants de Dieu. »</w:t>
-      </w:r>
-    </w:p>
-    <w:p>
-      <w:pPr>
-        <w:pStyle w:val="BlockText"/>
-      </w:pPr>
-      <w:r>
-        <w:t xml:space="preserve">— Jean 1.12</w:t>
-      </w:r>
-    </w:p>
-    <w:p>
-      <w:pPr>
-        <w:pStyle w:val="FirstParagraph"/>
-      </w:pPr>
-      <w:r>
-        <w:t xml:space="preserve">Vous n’êtes plus seul. Vous ne le serez plus jamais, ni dans la vie, ni dans la mort, ni au-delà. Rejoignez une église qui annonce fidèlement l’Évangile, procurez-vous une Bible, commencez par l’Évangile de Jean, et parlez à Dieu chaque jour comme on parle à un Père.</w:t>
-      </w:r>
-    </w:p>
-    <w:p>
-      <w:r>
-        <w:pict>
-          <v:rect style="width:0;height:1.5pt" o:hralign="center" o:hrstd="t" o:hr="t"/>
-        </w:pict>
-      </w:r>
-    </w:p>
-    <w:bookmarkEnd w:id="44"/>
-    <w:bookmarkStart w:id="45" w:name="voyageurs-sur-la-terre"/>
-    <w:p>
-      <w:pPr>
-        <w:pStyle w:val="Heading2"/>
-      </w:pPr>
-      <w:r>
-        <w:t xml:space="preserve">15. Voyageurs sur la terre</w:t>
-      </w:r>
-    </w:p>
-    <w:p>
-      <w:pPr>
-        <w:pStyle w:val="FirstParagraph"/>
-      </w:pPr>
-      <w:r>
-        <w:t xml:space="preserve">Il y a une dernière chose que la mort de ceux que nous aimons vient nous rappeler :</w:t>
-      </w:r>
-      <w:r>
-        <w:t xml:space="preserve"> </w:t>
-      </w:r>
-      <w:r>
-        <w:rPr>
-          <w:bCs/>
-          <w:b/>
-        </w:rPr>
-        <w:t xml:space="preserve">nous ne sommes pas d’ici.</w:t>
-      </w:r>
-    </w:p>
-    <w:p>
-      <w:pPr>
-        <w:pStyle w:val="BodyText"/>
-      </w:pPr>
-      <w:r>
-        <w:t xml:space="preserve">Nous sommes des voyageurs. La terre n’est pas notre maison ; elle est notre route. Les hommes et les femmes de foi de la Bible l’avaient compris :</w:t>
-      </w:r>
-    </w:p>
-    <w:p>
-      <w:pPr>
-        <w:pStyle w:val="BlockText"/>
-      </w:pPr>
-      <w:r>
-        <w:t xml:space="preserve">« Ils ont reconnu qu’ils étaient étrangers et voyageurs sur la terre. »</w:t>
-      </w:r>
-    </w:p>
-    <w:p>
-      <w:pPr>
-        <w:pStyle w:val="BlockText"/>
-      </w:pPr>
-      <w:r>
-        <w:t xml:space="preserve">— Hébreux 11.13</w:t>
-      </w:r>
-    </w:p>
-    <w:p>
-      <w:pPr>
-        <w:pStyle w:val="BlockText"/>
-      </w:pPr>
-      <w:r>
-        <w:t xml:space="preserve">« Car nous n’avons point ici-bas de cité permanente,</w:t>
-      </w:r>
-      <w:r>
-        <w:t xml:space="preserve"> </w:t>
-      </w:r>
-      <w:r>
-        <w:t xml:space="preserve">mais nous cherchons celle qui est à venir. »</w:t>
-      </w:r>
-    </w:p>
-    <w:p>
-      <w:pPr>
-        <w:pStyle w:val="BlockText"/>
-      </w:pPr>
-      <w:r>
-        <w:t xml:space="preserve">— Hébreux 13.14</w:t>
-      </w:r>
-    </w:p>
-    <w:p>
-      <w:pPr>
-        <w:pStyle w:val="FirstParagraph"/>
-      </w:pPr>
-      <w:r>
-        <w:t xml:space="preserve">Un voyageur ne s’attache pas trop à la chambre où il passe la nuit. Il en prend soin, il y vit, il en est reconnaissant, mais il sait qu’il repartira. Il voyage léger. Il garde les yeux sur sa destination.</w:t>
-      </w:r>
-    </w:p>
-    <w:p>
-      <w:pPr>
-        <w:pStyle w:val="BodyText"/>
-      </w:pPr>
-      <w:r>
-        <w:t xml:space="preserve">Voici ce que cela change, concrètement, pour les jours qui vous restent :</w:t>
-      </w:r>
-    </w:p>
-    <w:p>
-      <w:pPr>
-        <w:pStyle w:val="BodyText"/>
-      </w:pPr>
-      <w:r>
-        <w:rPr>
-          <w:bCs/>
-          <w:b/>
-        </w:rPr>
-        <w:t xml:space="preserve">Dites « je t’aime » aux vivants.</w:t>
-      </w:r>
-      <w:r>
-        <w:t xml:space="preserve"> </w:t>
-      </w:r>
-      <w:r>
-        <w:t xml:space="preserve">N’attendez pas de le dire devant un cercueil. Les fleurs les plus précieuses sont celles qu’on offre à ceux qui peuvent encore les sentir.</w:t>
-      </w:r>
-    </w:p>
-    <w:p>
-      <w:pPr>
-        <w:pStyle w:val="BodyText"/>
-      </w:pPr>
-      <w:r>
-        <w:rPr>
-          <w:bCs/>
-          <w:b/>
-        </w:rPr>
-        <w:t xml:space="preserve">Pardonnez vite.</w:t>
-      </w:r>
-      <w:r>
-        <w:t xml:space="preserve"> </w:t>
-      </w:r>
-      <w:r>
-        <w:t xml:space="preserve">La rancune est un bagage trop lourd pour un voyage si court.</w:t>
-      </w:r>
-    </w:p>
-    <w:p>
-      <w:pPr>
-        <w:pStyle w:val="BodyText"/>
-      </w:pPr>
-      <w:r>
-        <w:rPr>
-          <w:bCs/>
-          <w:b/>
-        </w:rPr>
-        <w:t xml:space="preserve">Investissez dans ce qui dure.</w:t>
-      </w:r>
-      <w:r>
-        <w:t xml:space="preserve"> </w:t>
-      </w:r>
-      <w:r>
-        <w:t xml:space="preserve">Les maisons et les comptes en banque resteront ici. Une âme conduite à Christ, un enfant élevé dans la foi, un pauvre secouru au nom de Jésus : cela, vous le retrouverez dans l’éternité.</w:t>
-      </w:r>
-    </w:p>
-    <w:p>
-      <w:pPr>
-        <w:pStyle w:val="BodyText"/>
-      </w:pPr>
-      <w:r>
-        <w:rPr>
-          <w:bCs/>
-          <w:b/>
-        </w:rPr>
-        <w:t xml:space="preserve">Parlez de Jésus à ceux que vous aimez.</w:t>
-      </w:r>
-      <w:r>
-        <w:t xml:space="preserve"> </w:t>
-      </w:r>
-      <w:r>
-        <w:t xml:space="preserve">Le plus grand héritage que vous puissiez laisser n’est ni une terre ni un compte en banque, c’est la foi.</w:t>
-      </w:r>
-    </w:p>
-    <w:p>
-      <w:pPr>
-        <w:pStyle w:val="BodyText"/>
-      </w:pPr>
-      <w:r>
-        <w:rPr>
-          <w:bCs/>
-          <w:b/>
-        </w:rPr>
-        <w:t xml:space="preserve">Tenez-vous prêt, mais sans angoisse.</w:t>
-      </w:r>
-      <w:r>
-        <w:t xml:space="preserve"> </w:t>
-      </w:r>
-      <w:r>
-        <w:t xml:space="preserve">Que vos relations soient en paix, et votre âme en règle avec Dieu. Alors, que l’horloge s’arrête un samedi à 17 heures ou dans cinquante ans, vous serez prêt.</w:t>
-      </w:r>
-    </w:p>
-    <w:p>
-      <w:pPr>
-        <w:pStyle w:val="BlockText"/>
-      </w:pPr>
-      <w:r>
-        <w:t xml:space="preserve">« Mais notre cité à nous est dans les cieux,</w:t>
-      </w:r>
-      <w:r>
-        <w:t xml:space="preserve"> </w:t>
-      </w:r>
-      <w:r>
-        <w:t xml:space="preserve">d’où nous attendons aussi comme Sauveur le Seigneur Jésus-Christ. »</w:t>
-      </w:r>
-    </w:p>
-    <w:p>
-      <w:pPr>
-        <w:pStyle w:val="BlockText"/>
-      </w:pPr>
-      <w:r>
-        <w:t xml:space="preserve">— Philippiens 3.20</w:t>
-      </w:r>
-    </w:p>
-    <w:p>
-      <w:r>
-        <w:pict>
-          <v:rect style="width:0;height:1.5pt" o:hralign="center" o:hrstd="t" o:hr="t"/>
-        </w:pict>
-      </w:r>
-    </w:p>
-    <w:bookmarkEnd w:id="45"/>
-    <w:bookmarkStart w:id="46" w:name="au-revoir-et-non-adieu"/>
-    <w:p>
-      <w:pPr>
-        <w:pStyle w:val="Heading2"/>
-      </w:pPr>
-      <w:r>
-        <w:t xml:space="preserve">Au revoir, et non adieu</w:t>
-      </w:r>
-    </w:p>
-    <w:p>
-      <w:pPr>
-        <w:pStyle w:val="FirstParagraph"/>
-      </w:pPr>
-      <w:r>
-        <w:t xml:space="preserve">Un jour, ce sera mon tour. Un jour, ce sera le vôtre.</w:t>
-      </w:r>
-    </w:p>
-    <w:p>
-      <w:pPr>
-        <w:pStyle w:val="BodyText"/>
-      </w:pPr>
-      <w:r>
-        <w:t xml:space="preserve">On nous couchera dans un cercueil, avec un habit que nous n’aurons pas choisi. On veillera sous un chapiteau. Les vivants auront faim, et ils mangeront ; ils auront sommeil, et ils dormiront. Puis on nous mettra en terre, et chacun rentrera chez soi. C’est ainsi. Il n’y a rien de honteux à cela.</w:t>
-      </w:r>
-    </w:p>
-    <w:p>
-      <w:pPr>
-        <w:pStyle w:val="BodyText"/>
-      </w:pPr>
-      <w:r>
-        <w:t xml:space="preserve">Mais pour celui qui appartient à Jésus, ce jour-là ne sera pas une fin. Il ne sera pas dans ce cercueil. Il sera dans la maison du Père, à la place que Jésus est allé préparer pour lui.</w:t>
-      </w:r>
-    </w:p>
-    <w:p>
-      <w:pPr>
-        <w:pStyle w:val="BlockText"/>
-      </w:pPr>
-      <w:r>
-        <w:t xml:space="preserve">« Que votre cœur ne se trouble point. Croyez en Dieu, et croyez en moi.</w:t>
-      </w:r>
-      <w:r>
-        <w:t xml:space="preserve"> </w:t>
-      </w:r>
-      <w:r>
-        <w:t xml:space="preserve">Il y a plusieurs demeures dans la maison de mon Père.</w:t>
-      </w:r>
-      <w:r>
-        <w:t xml:space="preserve"> </w:t>
-      </w:r>
-      <w:r>
-        <w:t xml:space="preserve">Si cela n’était pas, je vous l’aurais dit.</w:t>
-      </w:r>
-      <w:r>
-        <w:t xml:space="preserve"> </w:t>
-      </w:r>
-      <w:r>
-        <w:t xml:space="preserve">Je vais vous préparer une place. »</w:t>
-      </w:r>
-    </w:p>
-    <w:p>
-      <w:pPr>
-        <w:pStyle w:val="BlockText"/>
-      </w:pPr>
-      <w:r>
-        <w:t xml:space="preserve">— Jean 14.1-2</w:t>
-      </w:r>
-    </w:p>
-    <w:p>
-      <w:pPr>
-        <w:pStyle w:val="FirstParagraph"/>
-      </w:pPr>
-      <w:r>
-        <w:t xml:space="preserve">William, Rachelle, Koffi François : tous trois ont mis leur foi en Jésus-Christ. Alors je ne leur ai pas dit adieu. Je reverrai le sourire de William. Je reverrai le visage de ma tante Rachelle, ma seconde maman. Je reverrai mon beau-père, le pasteur Koffi François, qui a servi ce Seigneur jusqu’au dernier jour. Et je prie pour que vous aussi, vous puissiez revoir ceux que vous pleurez, dans ce matin où il n’y aura plus de nuit.</w:t>
-      </w:r>
-    </w:p>
-    <w:p>
-      <w:pPr>
-        <w:pStyle w:val="BodyText"/>
-      </w:pPr>
-      <w:r>
-        <w:t xml:space="preserve">Là-bas, il n’y aura plus de cercueil, plus de veillée, plus de séparation. Plus d’enfant qui part au marché et ne revient pas. Plus de maternité d’où une mère ne revient pas. Plus de route qui ne mène pas à destination. Plus de téléphone qui sonne pour annoncer une mauvaise nouvelle.</w:t>
-      </w:r>
-    </w:p>
-    <w:p>
-      <w:pPr>
-        <w:pStyle w:val="BlockText"/>
-      </w:pPr>
-      <w:r>
-        <w:t xml:space="preserve">« Il essuiera toute larme de leurs yeux, et la mort ne sera plus,</w:t>
-      </w:r>
-      <w:r>
-        <w:t xml:space="preserve"> </w:t>
-      </w:r>
-      <w:r>
-        <w:t xml:space="preserve">et il n’y aura plus ni deuil, ni cri, ni douleur,</w:t>
-      </w:r>
-      <w:r>
-        <w:t xml:space="preserve"> </w:t>
-      </w:r>
-      <w:r>
-        <w:t xml:space="preserve">car les premières choses ont disparu. »</w:t>
-      </w:r>
-    </w:p>
-    <w:p>
-      <w:pPr>
-        <w:pStyle w:val="BlockText"/>
-      </w:pPr>
-      <w:r>
-        <w:t xml:space="preserve">— Apocalypse 21.4</w:t>
-      </w:r>
-    </w:p>
-    <w:p>
-      <w:pPr>
-        <w:pStyle w:val="FirstParagraph"/>
-      </w:pPr>
-      <w:r>
-        <w:t xml:space="preserve">Alors, pleurez si vous en avez besoin. Mais pleurez avec espérance. Et vivez de telle sorte que, lorsque votre horloge s’arrêtera, ce ne soit pas un adieu.</w:t>
-      </w:r>
-    </w:p>
-    <w:p>
-      <w:pPr>
-        <w:pStyle w:val="BodyText"/>
-      </w:pPr>
-      <w:r>
-        <w:t xml:space="preserve">Seulement un au revoir.</w:t>
-      </w:r>
-    </w:p>
-    <w:p>
-      <w:r>
-        <w:pict>
-          <v:rect style="width:0;height:1.5pt" o:hralign="center" o:hrstd="t" o:hr="t"/>
-        </w:pict>
-      </w:r>
-    </w:p>
-    <w:bookmarkEnd w:id="46"/>
-    <w:bookmarkStart w:id="47" w:name="pour-les-jours-de-larmes"/>
-    <w:p>
-      <w:pPr>
-        <w:pStyle w:val="Heading2"/>
-      </w:pPr>
-      <w:r>
-        <w:t xml:space="preserve">Pour les jours de larmes</w:t>
-      </w:r>
-    </w:p>
-    <w:p>
-      <w:pPr>
-        <w:pStyle w:val="FirstParagraph"/>
-      </w:pPr>
-      <w:r>
-        <w:rPr>
-          <w:iCs/>
-          <w:i/>
-        </w:rPr>
-        <w:t xml:space="preserve">Quelques paroles de Dieu à relire quand le deuil pèse trop lourd.</w:t>
-      </w:r>
-    </w:p>
-    <w:p>
-      <w:pPr>
-        <w:pStyle w:val="BlockText"/>
-      </w:pPr>
-      <w:r>
-        <w:t xml:space="preserve">« Venez à moi, vous tous qui êtes fatigués et chargés, et je vous donnerai du repos. » — Matthieu 11.28</w:t>
-      </w:r>
-    </w:p>
-    <w:p>
-      <w:pPr>
-        <w:pStyle w:val="BlockText"/>
-      </w:pPr>
-      <w:r>
-        <w:t xml:space="preserve">« Quand je marche dans la vallée de l’ombre de la mort, je ne crains aucun mal, car tu es avec moi. » — Psaume 23.4</w:t>
-      </w:r>
-    </w:p>
-    <w:p>
-      <w:pPr>
-        <w:pStyle w:val="BlockText"/>
-      </w:pPr>
-      <w:r>
-        <w:t xml:space="preserve">« Si tu traverses les eaux, je serai avec toi ; et les fleuves, ils ne te submergeront point. » — Ésaïe 43.2</w:t>
-      </w:r>
-    </w:p>
-    <w:p>
-      <w:pPr>
-        <w:pStyle w:val="BlockText"/>
-      </w:pPr>
-      <w:r>
-        <w:t xml:space="preserve">« Il y a un temps pour tout… un temps pour naître, et un temps pour mourir. » — Ecclésiaste 3.1-2</w:t>
-      </w:r>
-    </w:p>
-    <w:p>
-      <w:pPr>
-        <w:pStyle w:val="BlockText"/>
-      </w:pPr>
-      <w:r>
-        <w:t xml:space="preserve">« L’herbe sèche, la fleur tombe ; mais la parole de notre Dieu subsiste éternellement. » — Ésaïe 40.8</w:t>
-      </w:r>
-    </w:p>
-    <w:p>
-      <w:pPr>
-        <w:pStyle w:val="BlockText"/>
-      </w:pPr>
-      <w:r>
-        <w:t xml:space="preserve">« Car Christ est ma vie, et la mort m’est un gain. » — Philippiens 1.21</w:t>
-      </w:r>
-    </w:p>
-    <w:p>
-      <w:pPr>
-        <w:pStyle w:val="BlockText"/>
-      </w:pPr>
-      <w:r>
-        <w:t xml:space="preserve">« Celui qui a le Fils a la vie ; celui qui n’a pas le Fils de Dieu n’a pas la vie. » — 1 Jean 5.12</w:t>
-      </w:r>
-    </w:p>
-    <w:p>
-      <w:pPr>
-        <w:pStyle w:val="BlockText"/>
-      </w:pPr>
-      <w:r>
-        <w:t xml:space="preserve">« Je te le dis en vérité, aujourd’hui tu seras avec moi dans le paradis. » — Luc 23.43</w:t>
-      </w:r>
-    </w:p>
-    <w:p>
-      <w:r>
-        <w:pict>
-          <v:rect style="width:0;height:1.5pt" o:hralign="center" o:hrstd="t" o:hr="t"/>
-        </w:pict>
-      </w:r>
-    </w:p>
-    <w:bookmarkEnd w:id="47"/>
-    <w:bookmarkStart w:id="48" w:name="prière-pour-ceux-qui-pleurent"/>
-    <w:p>
-      <w:pPr>
-        <w:pStyle w:val="Heading2"/>
-      </w:pPr>
-      <w:r>
-        <w:t xml:space="preserve">Prière pour ceux qui pleurent</w:t>
-      </w:r>
-    </w:p>
-    <w:p>
-      <w:pPr>
-        <w:pStyle w:val="BlockText"/>
-      </w:pPr>
-      <w:r>
-        <w:rPr>
-          <w:iCs/>
-          <w:i/>
-        </w:rPr>
-        <w:t xml:space="preserve">Père céleste,</w:t>
-      </w:r>
-    </w:p>
-    <w:p>
-      <w:pPr>
-        <w:pStyle w:val="BlockText"/>
-      </w:pPr>
-      <w:r>
-        <w:rPr>
-          <w:iCs/>
-          <w:i/>
-        </w:rPr>
-        <w:t xml:space="preserve">Tu vois mon cœur brisé. Tu connais le nom de celui ou celle que j’ai perdu.</w:t>
-      </w:r>
-      <w:r>
-        <w:t xml:space="preserve"> </w:t>
-      </w:r>
-      <w:r>
-        <w:rPr>
-          <w:iCs/>
-          <w:i/>
-        </w:rPr>
-        <w:t xml:space="preserve">Tu sais combien la maison est vide et combien les nuits sont longues.</w:t>
-      </w:r>
-      <w:r>
-        <w:t xml:space="preserve"> </w:t>
-      </w:r>
-      <w:r>
-        <w:rPr>
-          <w:iCs/>
-          <w:i/>
-        </w:rPr>
-        <w:t xml:space="preserve">Je ne comprends pas tout, mais je choisis de te faire confiance.</w:t>
-      </w:r>
-      <w:r>
-        <w:t xml:space="preserve"> </w:t>
-      </w:r>
-      <w:r>
-        <w:rPr>
-          <w:iCs/>
-          <w:i/>
-        </w:rPr>
-        <w:t xml:space="preserve">Toi qui as pleuré devant le tombeau de Lazare, pleure avec moi.</w:t>
-      </w:r>
-      <w:r>
-        <w:t xml:space="preserve"> </w:t>
-      </w:r>
-      <w:r>
-        <w:rPr>
-          <w:iCs/>
-          <w:i/>
-        </w:rPr>
-        <w:t xml:space="preserve">Toi qui as vaincu la mort, donne-moi ton espérance.</w:t>
-      </w:r>
-      <w:r>
-        <w:t xml:space="preserve"> </w:t>
-      </w:r>
-      <w:r>
-        <w:rPr>
-          <w:iCs/>
-          <w:i/>
-        </w:rPr>
-        <w:t xml:space="preserve">Recueille mes larmes, guéris mes souvenirs,</w:t>
-      </w:r>
-      <w:r>
-        <w:t xml:space="preserve"> </w:t>
-      </w:r>
-      <w:r>
-        <w:rPr>
-          <w:iCs/>
-          <w:i/>
-        </w:rPr>
-        <w:t xml:space="preserve">garde-moi de l’amertume, de la culpabilité et du désespoir.</w:t>
-      </w:r>
-      <w:r>
-        <w:t xml:space="preserve"> </w:t>
-      </w:r>
-      <w:r>
-        <w:rPr>
-          <w:iCs/>
-          <w:i/>
-        </w:rPr>
-        <w:t xml:space="preserve">Apprends-moi à compter mes jours,</w:t>
-      </w:r>
-      <w:r>
-        <w:t xml:space="preserve"> </w:t>
-      </w:r>
-      <w:r>
-        <w:rPr>
-          <w:iCs/>
-          <w:i/>
-        </w:rPr>
-        <w:t xml:space="preserve">et à marcher sur cette terre comme un voyageur qui rentre à la maison.</w:t>
-      </w:r>
-      <w:r>
-        <w:t xml:space="preserve"> </w:t>
-      </w:r>
-      <w:r>
-        <w:rPr>
-          <w:iCs/>
-          <w:i/>
-        </w:rPr>
-        <w:t xml:space="preserve">Et le jour où mon horloge s’arrêtera, reçois-moi auprès de toi,</w:t>
-      </w:r>
-      <w:r>
-        <w:t xml:space="preserve"> </w:t>
-      </w:r>
-      <w:r>
-        <w:rPr>
-          <w:iCs/>
-          <w:i/>
-        </w:rPr>
-        <w:t xml:space="preserve">par Jésus-Christ, mon Sauveur.</w:t>
-      </w:r>
-    </w:p>
-    <w:p>
-      <w:pPr>
-        <w:pStyle w:val="BlockText"/>
-      </w:pPr>
-      <w:r>
-        <w:rPr>
-          <w:iCs/>
-          <w:i/>
-        </w:rPr>
-        <w:t xml:space="preserve">Amen.</w:t>
-      </w:r>
-    </w:p>
-    <w:p>
-      <w:r>
-        <w:pict>
-          <v:rect style="width:0;height:1.5pt" o:hralign="center" o:hrstd="t" o:hr="t"/>
-        </w:pict>
-      </w:r>
-    </w:p>
-    <w:p>
-      <w:pPr>
-        <w:pStyle w:val="FirstParagraph"/>
-      </w:pPr>
-      <w:r>
-        <w:rPr>
-          <w:iCs/>
-          <w:i/>
-        </w:rPr>
         <w:t xml:space="preserve">Les citations bibliques sont tirées de la traduction Louis Segond.</w:t>
       </w:r>
     </w:p>
-    <w:bookmarkEnd w:id="48"/>
-    <w:bookmarkEnd w:id="49"/>
+    <w:bookmarkEnd w:id="50"/>
+    <w:bookmarkEnd w:id="51"/>
     <w:sectPr/>
   </w:body>
 </w:document>

</xml_diff>

<commit_message>
Livre : nouvelle couverture « Aube mesurée », page auteur et livre complet assemblé
Couverture générée en vectoriel (cadran de 365 graduations formant le
lever du soleil), nom de l'auteur, biographie en 4e et en fin de livre,
PDF complet de la 1re à la 4e de couverture.

Co-Authored-By: Claude Opus 5.5 <noreply@anthropic.com>
Claude-Session: https://claude.ai/code/session_019iFqSFQpVw8JECnBZv2Kux
</commit_message>
<xml_diff>
--- a/livre/avant-que-l-horloge-ne-s-arrete.docx
+++ b/livre/avant-que-l-horloge-ne-s-arrete.docx
@@ -106,6 +106,26 @@
       </w:r>
       <w:r>
         <w:t xml:space="preserve">cher</w:t>
+      </w:r>
+    </w:p>
+    <w:p>
+      <w:pPr>
+        <w:pStyle w:val="Author"/>
+      </w:pPr>
+      <w:r>
+        <w:t xml:space="preserve">Kouadio</w:t>
+      </w:r>
+      <w:r>
+        <w:t xml:space="preserve"> </w:t>
+      </w:r>
+      <w:r>
+        <w:t xml:space="preserve">Koffi</w:t>
+      </w:r>
+      <w:r>
+        <w:t xml:space="preserve"> </w:t>
+      </w:r>
+      <w:r>
+        <w:t xml:space="preserve">Élisée</w:t>
       </w:r>
     </w:p>
     <w:bookmarkStart w:id="20" w:name="en-mémoire"/>
@@ -2704,7 +2724,7 @@
     </w:p>
     <w:bookmarkEnd w:id="42"/>
     <w:bookmarkEnd w:id="43"/>
-    <w:bookmarkStart w:id="51" w:name="troisième-partie"/>
+    <w:bookmarkStart w:id="52" w:name="troisième-partie"/>
     <w:p>
       <w:pPr>
         <w:pStyle w:val="Heading1"/>
@@ -3885,6 +3905,71 @@
         <w:t xml:space="preserve">Amen.</w:t>
       </w:r>
     </w:p>
+    <w:bookmarkEnd w:id="50"/>
+    <w:bookmarkStart w:id="51" w:name="à-propos-de-lauteur"/>
+    <w:p>
+      <w:pPr>
+        <w:pStyle w:val="Heading2"/>
+      </w:pPr>
+      <w:r>
+        <w:t xml:space="preserve">À propos de l’auteur</w:t>
+      </w:r>
+    </w:p>
+    <w:p>
+      <w:pPr>
+        <w:pStyle w:val="FirstParagraph"/>
+      </w:pPr>
+      <w:r>
+        <w:rPr>
+          <w:bCs/>
+          <w:b/>
+        </w:rPr>
+        <w:t xml:space="preserve">Kouadio Koffi Élisée</w:t>
+      </w:r>
+      <w:r>
+        <w:t xml:space="preserve"> </w:t>
+      </w:r>
+      <w:r>
+        <w:t xml:space="preserve">est moniteur d’école du dimanche à l’Église CMA, où il est également responsable de la prière de l’école du dimanche.</w:t>
+      </w:r>
+    </w:p>
+    <w:p>
+      <w:pPr>
+        <w:pStyle w:val="BodyText"/>
+      </w:pPr>
+      <w:r>
+        <w:t xml:space="preserve">Entrepreneur, il est cofondateur de</w:t>
+      </w:r>
+      <w:r>
+        <w:t xml:space="preserve"> </w:t>
+      </w:r>
+      <w:r>
+        <w:rPr>
+          <w:bCs/>
+          <w:b/>
+        </w:rPr>
+        <w:t xml:space="preserve">Forlife Com</w:t>
+      </w:r>
+      <w:r>
+        <w:t xml:space="preserve">, entreprise de communication intégrée basée à Bingerville.</w:t>
+      </w:r>
+    </w:p>
+    <w:p>
+      <w:pPr>
+        <w:pStyle w:val="BodyText"/>
+      </w:pPr>
+      <w:r>
+        <w:t xml:space="preserve">Il est marié à Koffi Assena Grâce Emmanuelle, épouse Kouadio.</w:t>
+      </w:r>
+    </w:p>
+    <w:p>
+      <w:pPr>
+        <w:pStyle w:val="BodyText"/>
+      </w:pPr>
+      <w:r>
+        <w:t xml:space="preserve">Marqué par trois deuils qui ont traversé sa vie, de l’enfance à l’âge adulte, il a écrit ce livre pour tendre la main à ceux qui pleurent et leur montrer le chemin de l’espérance en Jésus-Christ.</w:t>
+      </w:r>
+    </w:p>
     <w:p>
       <w:r>
         <w:pict>
@@ -3904,8 +3989,8 @@
         <w:t xml:space="preserve">Les citations bibliques sont tirées de la traduction Louis Segond.</w:t>
       </w:r>
     </w:p>
-    <w:bookmarkEnd w:id="50"/>
     <w:bookmarkEnd w:id="51"/>
+    <w:bookmarkEnd w:id="52"/>
     <w:sectPr/>
   </w:body>
 </w:document>

</xml_diff>

<commit_message>
Livre : biographie de l'auteur reprise telle que fournie
Co-Authored-By: Claude Opus 5.5 <noreply@anthropic.com>
Claude-Session: https://claude.ai/code/session_019iFqSFQpVw8JECnBZv2Kux
</commit_message>
<xml_diff>
--- a/livre/avant-que-l-horloge-ne-s-arrete.docx
+++ b/livre/avant-que-l-horloge-ne-s-arrete.docx
@@ -3930,7 +3930,7 @@
         <w:t xml:space="preserve"> </w:t>
       </w:r>
       <w:r>
-        <w:t xml:space="preserve">est moniteur d’école du dimanche à l’Église CMA, où il est également responsable de la prière de l’école du dimanche.</w:t>
+        <w:t xml:space="preserve">est moniteur d’école du dimanche à l’Église CMA et responsable de prière de l’école du dimanche.</w:t>
       </w:r>
     </w:p>
     <w:p>
@@ -3960,14 +3960,6 @@
       </w:pPr>
       <w:r>
         <w:t xml:space="preserve">Il est marié à Koffi Assena Grâce Emmanuelle, épouse Kouadio.</w:t>
-      </w:r>
-    </w:p>
-    <w:p>
-      <w:pPr>
-        <w:pStyle w:val="BodyText"/>
-      </w:pPr>
-      <w:r>
-        <w:t xml:space="preserve">Marqué par trois deuils qui ont traversé sa vie, de l’enfance à l’âge adulte, il a écrit ce livre pour tendre la main à ceux qui pleurent et leur montrer le chemin de l’espérance en Jésus-Christ.</w:t>
       </w:r>
     </w:p>
     <w:p>

</xml_diff>